<commit_message>
Record locked design choices in the roguelite plan.
Career-length runs, all-rounder mixed shot/ball cards, one ad-revive, gully-first three minutes.
</commit_message>
<xml_diff>
--- a/SwitchedHit_Roguelite_Plan.docx
+++ b/SwitchedHit_Roguelite_Plan.docx
@@ -2,7 +2,7 @@
 <file path=word/document.xml><?xml version="1.0" encoding="utf-8"?>
 <w:document xmlns:w="http://schemas.openxmlformats.org/wordprocessingml/2006/main" xmlns:m="http://schemas.openxmlformats.org/officeDocument/2006/math" xmlns:r="http://schemas.openxmlformats.org/officeDocument/2006/relationships" xmlns:o="urn:schemas-microsoft-com:office:office" xmlns:v="urn:schemas-microsoft-com:vml" xmlns:w10="urn:schemas-microsoft-com:office:word" xmlns:a="http://schemas.openxmlformats.org/drawingml/2006/main" xmlns:pic="http://schemas.openxmlformats.org/drawingml/2006/picture" xmlns:wp="http://schemas.openxmlformats.org/drawingml/2006/wordprocessingDrawing">
   <w:body>
-    <w:bookmarkStart w:id="62" w:name="switchedhit"/>
+    <w:bookmarkStart w:id="63" w:name="switchedhit"/>
     <w:p>
       <w:pPr>
         <w:pStyle w:val="Heading1"/>
@@ -1795,7 +1795,36 @@
         <w:pStyle w:val="FirstParagraph"/>
       </w:pPr>
       <w:r>
-        <w:t xml:space="preserve">At the start of a run you pick an</w:t>
+        <w:t xml:space="preserve">You are an</w:t>
+      </w:r>
+      <w:r>
+        <w:t xml:space="preserve"> </w:t>
+      </w:r>
+      <w:r>
+        <w:rPr>
+          <w:b/>
+          <w:bCs/>
+        </w:rPr>
+        <w:t xml:space="preserve">all-rounder</w:t>
+      </w:r>
+      <w:r>
+        <w:t xml:space="preserve">. Cards mix shots</w:t>
+      </w:r>
+      <w:r>
+        <w:t xml:space="preserve"> </w:t>
+      </w:r>
+      <w:r>
+        <w:rPr>
+          <w:i/>
+          <w:iCs/>
+        </w:rPr>
+        <w:t xml:space="preserve">and</w:t>
+      </w:r>
+      <w:r>
+        <w:t xml:space="preserve"> </w:t>
+      </w:r>
+      <w:r>
+        <w:t xml:space="preserve">balls (locked 2026-09-02). At the start of a run you still pick an</w:t>
       </w:r>
       <w:r>
         <w:t xml:space="preserve"> </w:t>
@@ -1811,7 +1840,7 @@
         <w:t xml:space="preserve"> </w:t>
       </w:r>
       <w:r>
-        <w:t xml:space="preserve">(not a licensed star):</w:t>
+        <w:t xml:space="preserve">(not a licensed star) that biases the mix:</w:t>
       </w:r>
     </w:p>
     <w:tbl>
@@ -2446,13 +2475,35 @@
           <w:b/>
           <w:bCs/>
         </w:rPr>
+        <w:t xml:space="preserve">Balls</w:t>
+      </w:r>
+      <w:r>
+        <w:t xml:space="preserve"> </w:t>
+      </w:r>
+      <w:r>
+        <w:t xml:space="preserve">— inswinger, off-cutter, slow bouncer, yorker, doosra, tape-ball dip. Same deck as shots (all-rounder). How they share a hand is still open (§16).</w:t>
+      </w:r>
+    </w:p>
+    <w:p>
+      <w:pPr>
+        <w:pStyle w:val="Compact"/>
+        <w:numPr>
+          <w:ilvl w:val="0"/>
+          <w:numId w:val="1008"/>
+        </w:numPr>
+      </w:pPr>
+      <w:r>
+        <w:rPr>
+          <w:b/>
+          <w:bCs/>
+        </w:rPr>
         <w:t xml:space="preserve">Temper</w:t>
       </w:r>
       <w:r>
         <w:t xml:space="preserve"> </w:t>
       </w:r>
       <w:r>
-        <w:t xml:space="preserve">— ice, red-mist, farm, sledging (debuff the bowler), “see ball hit ball.”</w:t>
+        <w:t xml:space="preserve">— ice, red-mist, farm, sledging, “see ball hit ball.”</w:t>
       </w:r>
     </w:p>
     <w:p>
@@ -2468,35 +2519,13 @@
           <w:b/>
           <w:bCs/>
         </w:rPr>
-        <w:t xml:space="preserve">Body</w:t>
-      </w:r>
-      <w:r>
-        <w:t xml:space="preserve"> </w:t>
-      </w:r>
-      <w:r>
-        <w:t xml:space="preserve">— hamstring tape, hydration, night-vision, tape-ball callus (relics can pin these).</w:t>
-      </w:r>
-    </w:p>
-    <w:p>
-      <w:pPr>
-        <w:pStyle w:val="Compact"/>
-        <w:numPr>
-          <w:ilvl w:val="0"/>
-          <w:numId w:val="1008"/>
-        </w:numPr>
-      </w:pPr>
-      <w:r>
-        <w:rPr>
-          <w:b/>
-          <w:bCs/>
-        </w:rPr>
         <w:t xml:space="preserve">Street</w:t>
       </w:r>
       <w:r>
         <w:t xml:space="preserve"> </w:t>
       </w:r>
       <w:r>
-        <w:t xml:space="preserve">— underarm, one-bounce six, “last-man runner,” reverse grip. High reward, high risk. These are the identity of SwitchedHit.</w:t>
+        <w:t xml:space="preserve">— underarm, one-bounce six, “last-man runner,” reverse grip. High reward, high risk. Identity of SwitchedHit.</w:t>
       </w:r>
     </w:p>
     <w:p>
@@ -3019,7 +3048,7 @@
         <w:t xml:space="preserve"> </w:t>
       </w:r>
       <w:r>
-        <w:t xml:space="preserve">debut century or series-defining knock at Act 4. Unlock a scar, a card, a kit colour.</w:t>
+        <w:t xml:space="preserve">survive Act 4 as the same career — not a meta of many tournaments (locked 2026-09-02). Unlock a scar, a card, a kit colour.</w:t>
       </w:r>
     </w:p>
     <w:p>
@@ -5872,7 +5901,17 @@
               <w:pStyle w:val="Compact"/>
             </w:pPr>
             <w:r>
-              <w:t xml:space="preserve">1 per run, optional</w:t>
+              <w:rPr>
+                <w:b/>
+                <w:bCs/>
+              </w:rPr>
+              <w:t xml:space="preserve">1 per run, then you are dead</w:t>
+            </w:r>
+            <w:r>
+              <w:t xml:space="preserve"> </w:t>
+            </w:r>
+            <w:r>
+              <w:t xml:space="preserve">(locked 2026-09-02)</w:t>
             </w:r>
           </w:p>
         </w:tc>
@@ -8272,6 +8311,16 @@
       <w:r>
         <w:t xml:space="preserve">, not a franchise manager and not an arcade sim.</w:t>
       </w:r>
+      <w:r>
+        <w:t xml:space="preserve"> </w:t>
+      </w:r>
+      <w:r>
+        <w:rPr>
+          <w:b/>
+          <w:bCs/>
+        </w:rPr>
+        <w:t xml:space="preserve">One run = whole career. You are an all-rounder; cards mix shots and balls. First three minutes are gully culture. One ad-revive per run, then dead.</w:t>
+      </w:r>
     </w:p>
     <w:p>
       <w:pPr>
@@ -8376,13 +8425,13 @@
       </w:r>
     </w:p>
     <w:bookmarkEnd w:id="59"/>
-    <w:bookmarkStart w:id="60" w:name="open-questions-need-you"/>
+    <w:bookmarkStart w:id="60" w:name="decisions-already-made-2026-09-02"/>
     <w:p>
       <w:pPr>
         <w:pStyle w:val="Heading2"/>
       </w:pPr>
       <w:r>
-        <w:t xml:space="preserve">15. Open questions (need you)</w:t>
+        <w:t xml:space="preserve">15. Decisions already made (2026-09-02)</w:t>
       </w:r>
     </w:p>
     <w:p>
@@ -8398,13 +8447,29 @@
           <w:b/>
           <w:bCs/>
         </w:rPr>
-        <w:t xml:space="preserve">Archetype you personally want to play first?</w:t>
-      </w:r>
-      <w:r>
-        <w:t xml:space="preserve"> </w:t>
-      </w:r>
-      <w:r>
-        <w:t xml:space="preserve">Dasher / Wall / Wristy / Opener.</w:t>
+        <w:t xml:space="preserve">Ladder:</w:t>
+      </w:r>
+      <w:r>
+        <w:t xml:space="preserve"> </w:t>
+      </w:r>
+      <w:r>
+        <w:t xml:space="preserve">one run</w:t>
+      </w:r>
+      <w:r>
+        <w:t xml:space="preserve"> </w:t>
+      </w:r>
+      <w:r>
+        <w:rPr>
+          <w:b/>
+          <w:bCs/>
+        </w:rPr>
+        <w:t xml:space="preserve">is</w:t>
+      </w:r>
+      <w:r>
+        <w:t xml:space="preserve"> </w:t>
+      </w:r>
+      <w:r>
+        <w:t xml:space="preserve">the whole career (gully → international). Death ends that life. International is the Act 4 boss. Not a meta of many tournaments.</w:t>
       </w:r>
     </w:p>
     <w:p>
@@ -8420,65 +8485,266 @@
           <w:b/>
           <w:bCs/>
         </w:rPr>
+        <w:t xml:space="preserve">Combat identity:</w:t>
+      </w:r>
+      <w:r>
+        <w:t xml:space="preserve"> </w:t>
+      </w:r>
+      <w:r>
+        <w:t xml:space="preserve">you are an</w:t>
+      </w:r>
+      <w:r>
+        <w:t xml:space="preserve"> </w:t>
+      </w:r>
+      <w:r>
+        <w:rPr>
+          <w:b/>
+          <w:bCs/>
+        </w:rPr>
+        <w:t xml:space="preserve">all-rounder</w:t>
+      </w:r>
+      <w:r>
+        <w:t xml:space="preserve">. Cards mix</w:t>
+      </w:r>
+      <w:r>
+        <w:t xml:space="preserve"> </w:t>
+      </w:r>
+      <w:r>
+        <w:rPr>
+          <w:b/>
+          <w:bCs/>
+        </w:rPr>
+        <w:t xml:space="preserve">shots and balls</w:t>
+      </w:r>
+      <w:r>
+        <w:t xml:space="preserve">. v1 is not batting-only.</w:t>
+      </w:r>
+    </w:p>
+    <w:p>
+      <w:pPr>
+        <w:pStyle w:val="Compact"/>
+        <w:numPr>
+          <w:ilvl w:val="0"/>
+          <w:numId w:val="1027"/>
+        </w:numPr>
+      </w:pPr>
+      <w:r>
+        <w:rPr>
+          <w:b/>
+          <w:bCs/>
+        </w:rPr>
+        <w:t xml:space="preserve">Ads:</w:t>
+      </w:r>
+      <w:r>
+        <w:t xml:space="preserve"> </w:t>
+      </w:r>
+      <w:r>
+        <w:rPr>
+          <w:b/>
+          <w:bCs/>
+        </w:rPr>
+        <w:t xml:space="preserve">one optional rewarded revive per run</w:t>
+      </w:r>
+      <w:r>
+        <w:t xml:space="preserve">, then you are dead. Not premium-currency revives. Not ads-off-only.</w:t>
+      </w:r>
+    </w:p>
+    <w:p>
+      <w:pPr>
+        <w:pStyle w:val="Compact"/>
+        <w:numPr>
+          <w:ilvl w:val="0"/>
+          <w:numId w:val="1027"/>
+        </w:numPr>
+      </w:pPr>
+      <w:r>
+        <w:rPr>
+          <w:b/>
+          <w:bCs/>
+        </w:rPr>
+        <w:t xml:space="preserve">First three minutes:</w:t>
+      </w:r>
+      <w:r>
+        <w:t xml:space="preserve"> </w:t>
+      </w:r>
+      <w:r>
+        <w:rPr>
+          <w:b/>
+          <w:bCs/>
+        </w:rPr>
+        <w:t xml:space="preserve">gully night, tennis ball, sledging, reverse-sweep as a joke that works.</w:t>
+      </w:r>
+      <w:r>
+        <w:t xml:space="preserve"> </w:t>
+      </w:r>
+      <w:r>
+        <w:t xml:space="preserve">Culture first. Cards second. India-native.</w:t>
+      </w:r>
+    </w:p>
+    <w:bookmarkEnd w:id="60"/>
+    <w:bookmarkStart w:id="61" w:name="open-questions-need-you"/>
+    <w:p>
+      <w:pPr>
+        <w:pStyle w:val="Heading2"/>
+      </w:pPr>
+      <w:r>
+        <w:t xml:space="preserve">16. Open questions (need you)</w:t>
+      </w:r>
+    </w:p>
+    <w:p>
+      <w:pPr>
+        <w:pStyle w:val="Compact"/>
+        <w:numPr>
+          <w:ilvl w:val="0"/>
+          <w:numId w:val="1028"/>
+        </w:numPr>
+      </w:pPr>
+      <w:r>
+        <w:rPr>
+          <w:b/>
+          <w:bCs/>
+        </w:rPr>
+        <w:t xml:space="preserve">All-rounder, in a single node:</w:t>
+      </w:r>
+      <w:r>
+        <w:t xml:space="preserve"> </w:t>
+      </w:r>
+      <w:r>
+        <w:t xml:space="preserve">is a map fight one innings (bat</w:t>
+      </w:r>
+      <w:r>
+        <w:t xml:space="preserve"> </w:t>
+      </w:r>
+      <w:r>
+        <w:rPr>
+          <w:i/>
+          <w:iCs/>
+        </w:rPr>
+        <w:t xml:space="preserve">or</w:t>
+      </w:r>
+      <w:r>
+        <w:t xml:space="preserve"> </w:t>
+      </w:r>
+      <w:r>
+        <w:t xml:space="preserve">bowl) or a whole match (both)?</w:t>
+      </w:r>
+    </w:p>
+    <w:p>
+      <w:pPr>
+        <w:pStyle w:val="Compact"/>
+        <w:numPr>
+          <w:ilvl w:val="0"/>
+          <w:numId w:val="1028"/>
+        </w:numPr>
+      </w:pPr>
+      <w:r>
+        <w:rPr>
+          <w:b/>
+          <w:bCs/>
+        </w:rPr>
+        <w:t xml:space="preserve">Long run vs bus:</w:t>
+      </w:r>
+      <w:r>
+        <w:t xml:space="preserve"> </w:t>
+      </w:r>
+      <w:r>
+        <w:t xml:space="preserve">45–90 min career with no mid-run save will lose Android users to process death. Ironman, or checkpoints between acts?</w:t>
+      </w:r>
+    </w:p>
+    <w:p>
+      <w:pPr>
+        <w:pStyle w:val="Compact"/>
+        <w:numPr>
+          <w:ilvl w:val="0"/>
+          <w:numId w:val="1028"/>
+        </w:numPr>
+      </w:pPr>
+      <w:r>
+        <w:rPr>
+          <w:b/>
+          <w:bCs/>
+        </w:rPr>
+        <w:t xml:space="preserve">Mixed cards physically:</w:t>
+      </w:r>
+      <w:r>
+        <w:t xml:space="preserve"> </w:t>
+      </w:r>
+      <w:r>
+        <w:t xml:space="preserve">dual-faced (bat/bowl on one card), two draw piles, or “skill” cards that work in both innings?</w:t>
+      </w:r>
+    </w:p>
+    <w:p>
+      <w:pPr>
+        <w:pStyle w:val="Compact"/>
+        <w:numPr>
+          <w:ilvl w:val="0"/>
+          <w:numId w:val="1028"/>
+        </w:numPr>
+      </w:pPr>
+      <w:r>
+        <w:rPr>
+          <w:b/>
+          <w:bCs/>
+        </w:rPr>
         <w:t xml:space="preserve">Combat length:</w:t>
       </w:r>
       <w:r>
         <w:t xml:space="preserve"> </w:t>
       </w:r>
       <w:r>
-        <w:t xml:space="preserve">6-minute street fights vs 12-minute “proper T20 overs.” I recommend 6–8 for mobile.</w:t>
-      </w:r>
-    </w:p>
-    <w:p>
-      <w:pPr>
-        <w:pStyle w:val="Compact"/>
-        <w:numPr>
-          <w:ilvl w:val="0"/>
-          <w:numId w:val="1027"/>
-        </w:numPr>
-      </w:pPr>
-      <w:r>
-        <w:rPr>
-          <w:b/>
-          <w:bCs/>
-        </w:rPr>
-        <w:t xml:space="preserve">How autobiographical is the gully?</w:t>
-      </w:r>
-      <w:r>
-        <w:t xml:space="preserve"> </w:t>
-      </w:r>
-      <w:r>
-        <w:t xml:space="preserve">Pune-specific flavour vs generic Indian street.</w:t>
-      </w:r>
-    </w:p>
-    <w:p>
-      <w:pPr>
-        <w:pStyle w:val="Compact"/>
-        <w:numPr>
-          <w:ilvl w:val="0"/>
-          <w:numId w:val="1027"/>
-        </w:numPr>
-      </w:pPr>
-      <w:r>
-        <w:rPr>
-          <w:b/>
-          <w:bCs/>
-        </w:rPr>
-        <w:t xml:space="preserve">Premium $3 experiment</w:t>
-      </w:r>
-      <w:r>
-        <w:t xml:space="preserve"> </w:t>
-      </w:r>
-      <w:r>
-        <w:t xml:space="preserve">as a second APK later, or F2P-only forever?</w:t>
-      </w:r>
-    </w:p>
-    <w:p>
-      <w:pPr>
-        <w:pStyle w:val="Compact"/>
-        <w:numPr>
-          <w:ilvl w:val="0"/>
-          <w:numId w:val="1027"/>
+        <w:t xml:space="preserve">6-minute street fights vs 12-minute “proper T20 overs.”</w:t>
+      </w:r>
+    </w:p>
+    <w:p>
+      <w:pPr>
+        <w:pStyle w:val="Compact"/>
+        <w:numPr>
+          <w:ilvl w:val="0"/>
+          <w:numId w:val="1028"/>
+        </w:numPr>
+      </w:pPr>
+      <w:r>
+        <w:rPr>
+          <w:b/>
+          <w:bCs/>
+        </w:rPr>
+        <w:t xml:space="preserve">How Pune-specific is the gully?</w:t>
+      </w:r>
+      <w:r>
+        <w:t xml:space="preserve"> </w:t>
+      </w:r>
+      <w:r>
+        <w:t xml:space="preserve">Named chowks vs generic Indian street.</w:t>
+      </w:r>
+    </w:p>
+    <w:p>
+      <w:pPr>
+        <w:pStyle w:val="Compact"/>
+        <w:numPr>
+          <w:ilvl w:val="0"/>
+          <w:numId w:val="1028"/>
+        </w:numPr>
+      </w:pPr>
+      <w:r>
+        <w:rPr>
+          <w:b/>
+          <w:bCs/>
+        </w:rPr>
+        <w:t xml:space="preserve">Player body:</w:t>
+      </w:r>
+      <w:r>
+        <w:t xml:space="preserve"> </w:t>
+      </w:r>
+      <w:r>
+        <w:t xml:space="preserve">boy / girl / pick-at-start / unstated.</w:t>
+      </w:r>
+    </w:p>
+    <w:p>
+      <w:pPr>
+        <w:pStyle w:val="Compact"/>
+        <w:numPr>
+          <w:ilvl w:val="0"/>
+          <w:numId w:val="1028"/>
         </w:numPr>
       </w:pPr>
       <w:r>
@@ -8492,7 +8758,7 @@
         <w:t xml:space="preserve"> </w:t>
       </w:r>
       <w:r>
-        <w:t xml:space="preserve">keep personal Play account (12 testers/app) vs Pvt Ltd org account.</w:t>
+        <w:t xml:space="preserve">personal Play account (12 testers per app) vs Pvt Ltd org account.</w:t>
       </w:r>
     </w:p>
     <w:p>
@@ -8502,22 +8768,22 @@
         </w:pict>
       </w:r>
     </w:p>
-    <w:bookmarkEnd w:id="60"/>
-    <w:bookmarkStart w:id="61" w:name="sources-planning-not-audited-financials"/>
+    <w:bookmarkEnd w:id="61"/>
+    <w:bookmarkStart w:id="62" w:name="sources-planning-not-audited-financials"/>
     <w:p>
       <w:pPr>
         <w:pStyle w:val="Heading2"/>
       </w:pPr>
       <w:r>
-        <w:t xml:space="preserve">16. Sources (planning, not audited financials)</w:t>
-      </w:r>
-    </w:p>
-    <w:p>
-      <w:pPr>
-        <w:pStyle w:val="Compact"/>
-        <w:numPr>
-          <w:ilvl w:val="0"/>
-          <w:numId w:val="1028"/>
+        <w:t xml:space="preserve">17. Sources (planning, not audited financials)</w:t>
+      </w:r>
+    </w:p>
+    <w:p>
+      <w:pPr>
+        <w:pStyle w:val="Compact"/>
+        <w:numPr>
+          <w:ilvl w:val="0"/>
+          <w:numId w:val="1029"/>
         </w:numPr>
       </w:pPr>
       <w:r>
@@ -8529,7 +8795,7 @@
         <w:pStyle w:val="Compact"/>
         <w:numPr>
           <w:ilvl w:val="0"/>
-          <w:numId w:val="1028"/>
+          <w:numId w:val="1029"/>
         </w:numPr>
       </w:pPr>
       <w:r>
@@ -8541,7 +8807,7 @@
         <w:pStyle w:val="Compact"/>
         <w:numPr>
           <w:ilvl w:val="0"/>
-          <w:numId w:val="1028"/>
+          <w:numId w:val="1029"/>
         </w:numPr>
       </w:pPr>
       <w:r>
@@ -8553,7 +8819,7 @@
         <w:pStyle w:val="Compact"/>
         <w:numPr>
           <w:ilvl w:val="0"/>
-          <w:numId w:val="1028"/>
+          <w:numId w:val="1029"/>
         </w:numPr>
       </w:pPr>
       <w:r>
@@ -8565,7 +8831,7 @@
         <w:pStyle w:val="Compact"/>
         <w:numPr>
           <w:ilvl w:val="0"/>
-          <w:numId w:val="1028"/>
+          <w:numId w:val="1029"/>
         </w:numPr>
       </w:pPr>
       <w:r>
@@ -8577,7 +8843,7 @@
         <w:pStyle w:val="Compact"/>
         <w:numPr>
           <w:ilvl w:val="0"/>
-          <w:numId w:val="1028"/>
+          <w:numId w:val="1029"/>
         </w:numPr>
       </w:pPr>
       <w:r>
@@ -8589,7 +8855,7 @@
         <w:pStyle w:val="Compact"/>
         <w:numPr>
           <w:ilvl w:val="0"/>
-          <w:numId w:val="1028"/>
+          <w:numId w:val="1029"/>
         </w:numPr>
       </w:pPr>
       <w:r>
@@ -8601,7 +8867,7 @@
         <w:pStyle w:val="Compact"/>
         <w:numPr>
           <w:ilvl w:val="0"/>
-          <w:numId w:val="1028"/>
+          <w:numId w:val="1029"/>
         </w:numPr>
       </w:pPr>
       <w:r>
@@ -8613,7 +8879,7 @@
         <w:pStyle w:val="Compact"/>
         <w:numPr>
           <w:ilvl w:val="0"/>
-          <w:numId w:val="1028"/>
+          <w:numId w:val="1029"/>
         </w:numPr>
       </w:pPr>
       <w:r>
@@ -8625,7 +8891,7 @@
         <w:pStyle w:val="Compact"/>
         <w:numPr>
           <w:ilvl w:val="0"/>
-          <w:numId w:val="1028"/>
+          <w:numId w:val="1029"/>
         </w:numPr>
       </w:pPr>
       <w:r>
@@ -8637,7 +8903,7 @@
         <w:pStyle w:val="Compact"/>
         <w:numPr>
           <w:ilvl w:val="0"/>
-          <w:numId w:val="1028"/>
+          <w:numId w:val="1029"/>
         </w:numPr>
       </w:pPr>
       <w:r>
@@ -8649,7 +8915,7 @@
         <w:pStyle w:val="Compact"/>
         <w:numPr>
           <w:ilvl w:val="0"/>
-          <w:numId w:val="1028"/>
+          <w:numId w:val="1029"/>
         </w:numPr>
       </w:pPr>
       <w:r>
@@ -8661,7 +8927,7 @@
         <w:pStyle w:val="Compact"/>
         <w:numPr>
           <w:ilvl w:val="0"/>
-          <w:numId w:val="1028"/>
+          <w:numId w:val="1029"/>
         </w:numPr>
       </w:pPr>
       <w:r>
@@ -8673,7 +8939,7 @@
         <w:pStyle w:val="Compact"/>
         <w:numPr>
           <w:ilvl w:val="0"/>
-          <w:numId w:val="1028"/>
+          <w:numId w:val="1029"/>
         </w:numPr>
       </w:pPr>
       <w:r>
@@ -8685,7 +8951,7 @@
         <w:pStyle w:val="Compact"/>
         <w:numPr>
           <w:ilvl w:val="0"/>
-          <w:numId w:val="1028"/>
+          <w:numId w:val="1029"/>
         </w:numPr>
       </w:pPr>
       <w:r>
@@ -8697,7 +8963,7 @@
         <w:pStyle w:val="Compact"/>
         <w:numPr>
           <w:ilvl w:val="0"/>
-          <w:numId w:val="1028"/>
+          <w:numId w:val="1029"/>
         </w:numPr>
       </w:pPr>
       <w:r>
@@ -8744,8 +9010,8 @@
         <w:t xml:space="preserve">Prepared for internal use. The replay plan is retired. This is the game.</w:t>
       </w:r>
     </w:p>
-    <w:bookmarkEnd w:id="61"/>
     <w:bookmarkEnd w:id="62"/>
+    <w:bookmarkEnd w:id="63"/>
     <w:sectPr>
       <w:footnotePr>
         <w:numRestart w:val="eachSect"/>
@@ -9210,6 +9476,36 @@
     </w:lvlOverride>
   </w:num>
   <w:num w:numId="1028">
+    <w:abstractNumId w:val="99411"/>
+    <w:lvlOverride w:ilvl="0">
+      <w:startOverride w:val="1"/>
+    </w:lvlOverride>
+    <w:lvlOverride w:ilvl="1">
+      <w:startOverride w:val="1"/>
+    </w:lvlOverride>
+    <w:lvlOverride w:ilvl="2">
+      <w:startOverride w:val="1"/>
+    </w:lvlOverride>
+    <w:lvlOverride w:ilvl="3">
+      <w:startOverride w:val="1"/>
+    </w:lvlOverride>
+    <w:lvlOverride w:ilvl="4">
+      <w:startOverride w:val="1"/>
+    </w:lvlOverride>
+    <w:lvlOverride w:ilvl="5">
+      <w:startOverride w:val="1"/>
+    </w:lvlOverride>
+    <w:lvlOverride w:ilvl="6">
+      <w:startOverride w:val="1"/>
+    </w:lvlOverride>
+    <w:lvlOverride w:ilvl="7">
+      <w:startOverride w:val="1"/>
+    </w:lvlOverride>
+    <w:lvlOverride w:ilvl="8">
+      <w:startOverride w:val="1"/>
+    </w:lvlOverride>
+  </w:num>
+  <w:num w:numId="1029">
     <w:abstractNumId w:val="991"/>
   </w:num>
 </w:numbering>

</xml_diff>

<commit_message>
Pivot campaign to Shadow Fight-style acts, not permadeath runs.
Stage-based progression, persistent decks, 5-7 minute fights, two piles, named bat/bowl opponents. Roguelite daily tour is later.
</commit_message>
<xml_diff>
--- a/SwitchedHit_Roguelite_Plan.docx
+++ b/SwitchedHit_Roguelite_Plan.docx
@@ -32,7 +32,7 @@
           <w:b/>
           <w:bCs/>
         </w:rPr>
-        <w:t xml:space="preserve">A Flutter Android roguelite deckbuilder about becoming a cricketer</w:t>
+        <w:t xml:space="preserve">A Flutter Android cricket deckbuilder about becoming a cricketer</w:t>
       </w:r>
     </w:p>
     <w:p>
@@ -48,7 +48,23 @@
         <w:pStyle w:val="BodyText"/>
       </w:pPr>
       <w:r>
-        <w:t xml:space="preserve">You are the player. Not a franchise owner. Not a live-score clone. A career that dies, and a deck that is your technique.</w:t>
+        <w:t xml:space="preserve">You are the player. Not a franchise owner.</w:t>
+      </w:r>
+      <w:r>
+        <w:t xml:space="preserve"> </w:t>
+      </w:r>
+      <w:r>
+        <w:rPr>
+          <w:b/>
+          <w:bCs/>
+        </w:rPr>
+        <w:t xml:space="preserve">Progression is act-based (Shadow Fight–style), not a permadeath career run.</w:t>
+      </w:r>
+      <w:r>
+        <w:t xml:space="preserve"> </w:t>
+      </w:r>
+      <w:r>
+        <w:t xml:space="preserve">Cards are your technique. Fights are 5–7 minutes. Lose a stage, retry it. Keep your kit.</w:t>
       </w:r>
     </w:p>
     <w:p>
@@ -226,55 +242,13 @@
           <w:b/>
           <w:bCs/>
         </w:rPr>
-        <w:t xml:space="preserve">roguelite deck builder around cricket</w:t>
-      </w:r>
-      <w:r>
-        <w:t xml:space="preserve">. The player starts at</w:t>
-      </w:r>
-      <w:r>
-        <w:t xml:space="preserve"> </w:t>
-      </w:r>
-      <w:r>
-        <w:rPr>
-          <w:b/>
-          <w:bCs/>
-        </w:rPr>
-        <w:t xml:space="preserve">street level</w:t>
-      </w:r>
-      <w:r>
-        <w:t xml:space="preserve"> </w:t>
-      </w:r>
-      <w:r>
-        <w:t xml:space="preserve">and climbs toward</w:t>
-      </w:r>
-      <w:r>
-        <w:t xml:space="preserve"> </w:t>
-      </w:r>
-      <w:r>
-        <w:rPr>
-          <w:b/>
-          <w:bCs/>
-        </w:rPr>
-        <w:t xml:space="preserve">international</w:t>
-      </w:r>
-      <w:r>
-        <w:t xml:space="preserve">. It is</w:t>
-      </w:r>
-      <w:r>
-        <w:t xml:space="preserve"> </w:t>
-      </w:r>
-      <w:r>
-        <w:rPr>
-          <w:b/>
-          <w:bCs/>
-        </w:rPr>
-        <w:t xml:space="preserve">player-based</w:t>
-      </w:r>
-      <w:r>
-        <w:t xml:space="preserve"> </w:t>
-      </w:r>
-      <w:r>
-        <w:t xml:space="preserve">(you</w:t>
+        <w:t xml:space="preserve">cricket deck builder</w:t>
+      </w:r>
+      <w:r>
+        <w:t xml:space="preserve"> </w:t>
+      </w:r>
+      <w:r>
+        <w:t xml:space="preserve">that</w:t>
       </w:r>
       <w:r>
         <w:t xml:space="preserve"> </w:t>
@@ -284,39 +258,71 @@
           <w:i/>
           <w:iCs/>
         </w:rPr>
-        <w:t xml:space="preserve">are</w:t>
-      </w:r>
-      <w:r>
-        <w:t xml:space="preserve"> </w:t>
-      </w:r>
-      <w:r>
-        <w:t xml:space="preserve">the batter / all-rounder), released on the</w:t>
-      </w:r>
-      <w:r>
-        <w:t xml:space="preserve"> </w:t>
-      </w:r>
-      <w:r>
-        <w:rPr>
-          <w:b/>
-          <w:bCs/>
-        </w:rPr>
-        <w:t xml:space="preserve">Play Store</w:t>
-      </w:r>
-      <w:r>
-        <w:t xml:space="preserve">, with</w:t>
-      </w:r>
-      <w:r>
-        <w:t xml:space="preserve"> </w:t>
-      </w:r>
-      <w:r>
-        <w:rPr>
-          <w:b/>
-          <w:bCs/>
-        </w:rPr>
-        <w:t xml:space="preserve">ads and IAPs</w:t>
-      </w:r>
-      <w:r>
-        <w:t xml:space="preserve">, and the job of this document is to say whether that can make money and how to build it.</w:t>
+        <w:t xml:space="preserve">started</w:t>
+      </w:r>
+      <w:r>
+        <w:t xml:space="preserve"> </w:t>
+      </w:r>
+      <w:r>
+        <w:t xml:space="preserve">as a roguelite and is now</w:t>
+      </w:r>
+      <w:r>
+        <w:t xml:space="preserve"> </w:t>
+      </w:r>
+      <w:r>
+        <w:rPr>
+          <w:b/>
+          <w:bCs/>
+        </w:rPr>
+        <w:t xml:space="preserve">explicitly not a pure roguelike</w:t>
+      </w:r>
+      <w:r>
+        <w:t xml:space="preserve">. You asked to</w:t>
+      </w:r>
+      <w:r>
+        <w:t xml:space="preserve"> </w:t>
+      </w:r>
+      <w:r>
+        <w:rPr>
+          <w:b/>
+          <w:bCs/>
+        </w:rPr>
+        <w:t xml:space="preserve">time-gate and stage it</w:t>
+      </w:r>
+      <w:r>
+        <w:t xml:space="preserve"> </w:t>
+      </w:r>
+      <w:r>
+        <w:t xml:space="preserve">like</w:t>
+      </w:r>
+      <w:r>
+        <w:t xml:space="preserve"> </w:t>
+      </w:r>
+      <w:r>
+        <w:rPr>
+          <w:b/>
+          <w:bCs/>
+        </w:rPr>
+        <w:t xml:space="preserve">Shadow Fight / ninja act games</w:t>
+      </w:r>
+      <w:r>
+        <w:t xml:space="preserve"> </w:t>
+      </w:r>
+      <w:r>
+        <w:t xml:space="preserve">— one stage at a time, digestible for an Indian mobile audience. Street → international is the</w:t>
+      </w:r>
+      <w:r>
+        <w:t xml:space="preserve"> </w:t>
+      </w:r>
+      <w:r>
+        <w:rPr>
+          <w:b/>
+          <w:bCs/>
+        </w:rPr>
+        <w:t xml:space="preserve">campaign</w:t>
+      </w:r>
+      <w:r>
+        <w:t xml:space="preserve">, not one permadeath run.</w:t>
       </w:r>
     </w:p>
     <w:p>
@@ -324,7 +330,7 @@
         <w:pStyle w:val="BodyText"/>
       </w:pPr>
       <w:r>
-        <w:t xml:space="preserve">That combination is rare and commercially interesting:</w:t>
+        <w:t xml:space="preserve">That combination is still rare:</w:t>
       </w:r>
     </w:p>
     <w:p>
@@ -336,7 +342,7 @@
         </w:numPr>
       </w:pPr>
       <w:r>
-        <w:t xml:space="preserve">Cricket mobile is huge in India and almost entirely</w:t>
+        <w:t xml:space="preserve">Cricket mobile is</w:t>
       </w:r>
       <w:r>
         <w:t xml:space="preserve"> </w:t>
@@ -352,23 +358,20 @@
         <w:t xml:space="preserve"> </w:t>
       </w:r>
       <w:r>
-        <w:t xml:space="preserve">(Real Cricket, WCC) or</w:t>
-      </w:r>
-      <w:r>
-        <w:t xml:space="preserve"> </w:t>
-      </w:r>
-      <w:r>
-        <w:rPr>
-          <w:b/>
-          <w:bCs/>
-        </w:rPr>
-        <w:t xml:space="preserve">management</w:t>
-      </w:r>
-      <w:r>
-        <w:t xml:space="preserve"> </w:t>
-      </w:r>
-      <w:r>
-        <w:t xml:space="preserve">(Hitwicket).</w:t>
+        <w:t xml:space="preserve">or</w:t>
+      </w:r>
+      <w:r>
+        <w:t xml:space="preserve"> </w:t>
+      </w:r>
+      <w:r>
+        <w:rPr>
+          <w:b/>
+          <w:bCs/>
+        </w:rPr>
+        <w:t xml:space="preserve">managers</w:t>
+      </w:r>
+      <w:r>
+        <w:t xml:space="preserve">.</w:t>
       </w:r>
     </w:p>
     <w:p>
@@ -380,30 +383,7 @@
         </w:numPr>
       </w:pPr>
       <w:r>
-        <w:t xml:space="preserve">Roguelite deckbuilders are proven on mobile (</w:t>
-      </w:r>
-      <w:r>
-        <w:rPr>
-          <w:b/>
-          <w:bCs/>
-        </w:rPr>
-        <w:t xml:space="preserve">Slay the Spire</w:t>
-      </w:r>
-      <w:r>
-        <w:t xml:space="preserve">,</w:t>
-      </w:r>
-      <w:r>
-        <w:t xml:space="preserve"> </w:t>
-      </w:r>
-      <w:r>
-        <w:rPr>
-          <w:b/>
-          <w:bCs/>
-        </w:rPr>
-        <w:t xml:space="preserve">Balatro</w:t>
-      </w:r>
-      <w:r>
-        <w:t xml:space="preserve">, a wave of Balatro-likes).</w:t>
+        <w:t xml:space="preserve">Card games that print money on phones are either PvP (Clash Royale) or premium roguelites (Balatro).</w:t>
       </w:r>
     </w:p>
     <w:p>
@@ -415,23 +395,42 @@
         </w:numPr>
       </w:pPr>
       <w:r>
-        <w:t xml:space="preserve">Nobody has a serious</w:t>
-      </w:r>
-      <w:r>
-        <w:t xml:space="preserve"> </w:t>
-      </w:r>
-      <w:r>
-        <w:rPr>
-          <w:b/>
-          <w:bCs/>
-        </w:rPr>
-        <w:t xml:space="preserve">“you are the street batter, your shots are cards, death is being dropped”</w:t>
-      </w:r>
-      <w:r>
-        <w:t xml:space="preserve"> </w:t>
-      </w:r>
-      <w:r>
-        <w:t xml:space="preserve">game.</w:t>
+        <w:t xml:space="preserve">Act-based F2P (Shadow Fight 2) is what India already</w:t>
+      </w:r>
+      <w:r>
+        <w:t xml:space="preserve"> </w:t>
+      </w:r>
+      <w:r>
+        <w:rPr>
+          <w:i/>
+          <w:iCs/>
+        </w:rPr>
+        <w:t xml:space="preserve">finished</w:t>
+      </w:r>
+      <w:r>
+        <w:t xml:space="preserve">.</w:t>
+      </w:r>
+    </w:p>
+    <w:p>
+      <w:pPr>
+        <w:pStyle w:val="Compact"/>
+        <w:numPr>
+          <w:ilvl w:val="0"/>
+          <w:numId w:val="1001"/>
+        </w:numPr>
+      </w:pPr>
+      <w:r>
+        <w:t xml:space="preserve">The hole:</w:t>
+      </w:r>
+      <w:r>
+        <w:t xml:space="preserve"> </w:t>
+      </w:r>
+      <w:r>
+        <w:rPr>
+          <w:b/>
+          <w:bCs/>
+        </w:rPr>
+        <w:t xml:space="preserve">player-identity cricket + cards + Shadow Fight campaign spine.</w:t>
       </w:r>
     </w:p>
     <w:p>
@@ -468,7 +467,7 @@
           <w:b/>
           <w:bCs/>
         </w:rPr>
-        <w:t xml:space="preserve">SwitchedHit is a single-player roguelite where each run is one cricketer’s career, each fight is an innings, and your deck is the shots, nerves, and street tricks you refuse to unlearn.</w:t>
+        <w:t xml:space="preserve">SwitchedHit is a single-player act-based cricket deckbuilder: you are an all-rounder climbing from the gully, each stage is a 5–7 minute innings, and your decks (shots / balls) are the technique you keep.</w:t>
       </w:r>
     </w:p>
     <w:p>
@@ -524,7 +523,7 @@
           <w:i/>
           <w:iCs/>
         </w:rPr>
-        <w:t xml:space="preserve">Every run is a career. Every card is a shot.</w:t>
+        <w:t xml:space="preserve">One stage at a time. All the way up.</w:t>
       </w:r>
     </w:p>
     <w:p>
@@ -1689,23 +1688,7 @@
         <w:pStyle w:val="FirstParagraph"/>
       </w:pPr>
       <w:r>
-        <w:t xml:space="preserve">You are not Virat. You are a kid who bats with a taped tennis ball under a streetlight. A coach who may or may not be real (the “Keeper of the Book”) hands you a deck. Each</w:t>
-      </w:r>
-      <w:r>
-        <w:t xml:space="preserve"> </w:t>
-      </w:r>
-      <w:r>
-        <w:rPr>
-          <w:b/>
-          <w:bCs/>
-        </w:rPr>
-        <w:t xml:space="preserve">run</w:t>
-      </w:r>
-      <w:r>
-        <w:t xml:space="preserve"> </w:t>
-      </w:r>
-      <w:r>
-        <w:t xml:space="preserve">is one career. When you get out of the tournament, get injured, or get dropped, that career ends. Meta unlocks (nets, scars, superstitions) persist.</w:t>
+        <w:t xml:space="preserve">You are not Virat. You are a kid who bats with a taped tennis ball under a streetlight. A coach who may or may not be real (the “Keeper of the Book”) hands you a book of shots and balls.</w:t>
       </w:r>
     </w:p>
     <w:p>
@@ -1713,6 +1696,37 @@
         <w:pStyle w:val="BodyText"/>
       </w:pPr>
       <w:r>
+        <w:rPr>
+          <w:b/>
+          <w:bCs/>
+        </w:rPr>
+        <w:t xml:space="preserve">Campaign, not a dying career:</w:t>
+      </w:r>
+      <w:r>
+        <w:t xml:space="preserve"> </w:t>
+      </w:r>
+      <w:r>
+        <w:t xml:space="preserve">Shadow Fight 2 grammar. Acts you clear in order. Lose a fight → retry that fight (optional one ad-revive, then you still retry, you do not lose the act). Kits, cards, relics</w:t>
+      </w:r>
+      <w:r>
+        <w:t xml:space="preserve"> </w:t>
+      </w:r>
+      <w:r>
+        <w:rPr>
+          <w:b/>
+          <w:bCs/>
+        </w:rPr>
+        <w:t xml:space="preserve">persist</w:t>
+      </w:r>
+      <w:r>
+        <w:t xml:space="preserve">. The fantasy of “rising” is the map, not permadeath.</w:t>
+      </w:r>
+    </w:p>
+    <w:p>
+      <w:pPr>
+        <w:pStyle w:val="BodyText"/>
+      </w:pPr>
+      <w:r>
         <w:t xml:space="preserve">Tone:</w:t>
       </w:r>
       <w:r>
@@ -1726,10 +1740,7 @@
         <w:t xml:space="preserve">warm, loud, slightly mythical gully</w:t>
       </w:r>
       <w:r>
-        <w:t xml:space="preserve"> </w:t>
-      </w:r>
-      <w:r>
-        <w:t xml:space="preserve">— not broadcast realism, not grimdark. Think</w:t>
+        <w:t xml:space="preserve">. Think Shadow Fight’s act-to-act hunger + StS</w:t>
       </w:r>
       <w:r>
         <w:t xml:space="preserve"> </w:t>
@@ -1739,45 +1750,13 @@
           <w:i/>
           <w:iCs/>
         </w:rPr>
-        <w:t xml:space="preserve">Hades</w:t>
-      </w:r>
-      <w:r>
-        <w:t xml:space="preserve"> </w:t>
-      </w:r>
-      <w:r>
-        <w:t xml:space="preserve">sincerity +</w:t>
-      </w:r>
-      <w:r>
-        <w:t xml:space="preserve"> </w:t>
-      </w:r>
-      <w:r>
-        <w:rPr>
-          <w:i/>
-          <w:iCs/>
-        </w:rPr>
-        <w:t xml:space="preserve">Slay the Spire</w:t>
-      </w:r>
-      <w:r>
-        <w:t xml:space="preserve"> </w:t>
-      </w:r>
-      <w:r>
-        <w:t xml:space="preserve">clarity +</w:t>
-      </w:r>
-      <w:r>
-        <w:t xml:space="preserve"> </w:t>
-      </w:r>
-      <w:r>
-        <w:rPr>
-          <w:i/>
-          <w:iCs/>
-        </w:rPr>
-        <w:t xml:space="preserve">gully cricket</w:t>
-      </w:r>
-      <w:r>
-        <w:t xml:space="preserve"> </w:t>
-      </w:r>
-      <w:r>
-        <w:t xml:space="preserve">slang. Commentary is a character, not licensed audio.</w:t>
+        <w:t xml:space="preserve">card clarity</w:t>
+      </w:r>
+      <w:r>
+        <w:t xml:space="preserve"> </w:t>
+      </w:r>
+      <w:r>
+        <w:t xml:space="preserve">+ gully slang. Commentary is a character, not licensed audio.</w:t>
       </w:r>
     </w:p>
     <w:bookmarkEnd w:id="17"/>
@@ -2193,7 +2172,7 @@
         <w:t xml:space="preserve"> </w:t>
       </w:r>
       <w:r>
-        <w:t xml:space="preserve">you have a wicket bar (start 10 “lives” that represent confidence + partners + luck,</w:t>
+        <w:t xml:space="preserve">you have a wicket bar (confidence + partners + luck,</w:t>
       </w:r>
       <w:r>
         <w:t xml:space="preserve"> </w:t>
@@ -2209,7 +2188,33 @@
         <w:t xml:space="preserve"> </w:t>
       </w:r>
       <w:r>
-        <w:t xml:space="preserve">10 literal dismissals — tune so a street fight is 6–10 minutes). Hitting 0 = dismissed / career node failed.</w:t>
+        <w:t xml:space="preserve">10 literal dismissals — tune so a street fight is</w:t>
+      </w:r>
+      <w:r>
+        <w:t xml:space="preserve"> </w:t>
+      </w:r>
+      <w:r>
+        <w:rPr>
+          <w:b/>
+          <w:bCs/>
+        </w:rPr>
+        <w:t xml:space="preserve">5–7 minutes</w:t>
+      </w:r>
+      <w:r>
+        <w:t xml:space="preserve">). Hitting 0 = dismissed /</w:t>
+      </w:r>
+      <w:r>
+        <w:t xml:space="preserve"> </w:t>
+      </w:r>
+      <w:r>
+        <w:rPr>
+          <w:b/>
+          <w:bCs/>
+        </w:rPr>
+        <w:t xml:space="preserve">this stage failed</w:t>
+      </w:r>
+      <w:r>
+        <w:t xml:space="preserve">. Retry the node. Campaign stays.</w:t>
       </w:r>
     </w:p>
     <w:p>
@@ -2481,7 +2486,23 @@
         <w:t xml:space="preserve"> </w:t>
       </w:r>
       <w:r>
-        <w:t xml:space="preserve">— inswinger, off-cutter, slow bouncer, yorker, doosra, tape-ball dip. Same deck as shots (all-rounder). How they share a hand is still open (§16).</w:t>
+        <w:t xml:space="preserve">— inswinger, off-cutter, slow bouncer, yorker, doosra, tape-ball dip.</w:t>
+      </w:r>
+      <w:r>
+        <w:t xml:space="preserve"> </w:t>
+      </w:r>
+      <w:r>
+        <w:rPr>
+          <w:b/>
+          <w:bCs/>
+        </w:rPr>
+        <w:t xml:space="preserve">Separate pile.</w:t>
+      </w:r>
+      <w:r>
+        <w:t xml:space="preserve"> </w:t>
+      </w:r>
+      <w:r>
+        <w:t xml:space="preserve">Bat nodes draw Shots; bowl nodes draw Balls.</w:t>
       </w:r>
     </w:p>
     <w:p>
@@ -2543,10 +2564,13 @@
           <w:b/>
           <w:bCs/>
         </w:rPr>
-        <w:t xml:space="preserve">run rewards and meta unlocks</w:t>
-      </w:r>
-      <w:r>
-        <w:t xml:space="preserve">, never an IAP crate of power.</w:t>
+        <w:t xml:space="preserve">campaign rewards</w:t>
+      </w:r>
+      <w:r>
+        <w:t xml:space="preserve"> </w:t>
+      </w:r>
+      <w:r>
+        <w:t xml:space="preserve">(choose 1 of 3), never an IAP crate of power.</w:t>
       </w:r>
     </w:p>
     <w:p>
@@ -2558,13 +2582,13 @@
           <w:b/>
           <w:bCs/>
         </w:rPr>
-        <w:t xml:space="preserve">Deck size:</w:t>
-      </w:r>
-      <w:r>
-        <w:t xml:space="preserve"> </w:t>
-      </w:r>
-      <w:r>
-        <w:t xml:space="preserve">start ~12, grow to 18–22, then thin. Removing a “slog” is as important as adding a “late cut.”</w:t>
+        <w:t xml:space="preserve">Loadout:</w:t>
+      </w:r>
+      <w:r>
+        <w:t xml:space="preserve"> </w:t>
+      </w:r>
+      <w:r>
+        <w:t xml:space="preserve">12–18 cards per pile from a persistent collection. Nets = upgrade / remove. This is closer to Shadow Fight gear + a deckbuilder shop than to a StS run wipe.</w:t>
       </w:r>
     </w:p>
     <w:bookmarkEnd w:id="20"/>
@@ -2602,13 +2626,13 @@
       </w:r>
     </w:p>
     <w:bookmarkEnd w:id="21"/>
-    <w:bookmarkStart w:id="22" w:name="map-career-ladder-the-roguelite"/>
+    <w:bookmarkStart w:id="22" w:name="X18227073d5c9c094e9f826c7fccc7b199f7a133"/>
     <w:p>
       <w:pPr>
         <w:pStyle w:val="Heading3"/>
       </w:pPr>
       <w:r>
-        <w:t xml:space="preserve">4.6 Map / career ladder (the roguelite)</w:t>
+        <w:t xml:space="preserve">4.6 Map / career ladder (act-based, Shadow Fight–style)</w:t>
       </w:r>
     </w:p>
     <w:p>
@@ -2620,7 +2644,26 @@
           <w:b/>
           <w:bCs/>
         </w:rPr>
-        <w:t xml:space="preserve">Acts (one run):</w:t>
+        <w:t xml:space="preserve">Not a permadeath roguelite.</w:t>
+      </w:r>
+      <w:r>
+        <w:t xml:space="preserve"> </w:t>
+      </w:r>
+      <w:r>
+        <w:t xml:space="preserve">You asked to time-gate this for an Indian audience:</w:t>
+      </w:r>
+      <w:r>
+        <w:t xml:space="preserve"> </w:t>
+      </w:r>
+      <w:r>
+        <w:rPr>
+          <w:b/>
+          <w:bCs/>
+        </w:rPr>
+        <w:t xml:space="preserve">one stage at a time</w:t>
+      </w:r>
+      <w:r>
+        <w:t xml:space="preserve">, like Shadow Fight’s acts.</w:t>
       </w:r>
     </w:p>
     <w:tbl>
@@ -2669,7 +2712,7 @@
               <w:pStyle w:val="Compact"/>
             </w:pPr>
             <w:r>
-              <w:t xml:space="preserve">Length</w:t>
+              <w:t xml:space="preserve">Stages</w:t>
             </w:r>
           </w:p>
         </w:tc>
@@ -2726,7 +2769,7 @@
               <w:pStyle w:val="Compact"/>
             </w:pPr>
             <w:r>
-              <w:t xml:space="preserve">Local fast bowler with a new ball</w:t>
+              <w:t xml:space="preserve">Local fast bowler, tennis ball</w:t>
             </w:r>
           </w:p>
         </w:tc>
@@ -2761,18 +2804,18 @@
               <w:pStyle w:val="Compact"/>
             </w:pPr>
             <w:r>
-              <w:t xml:space="preserve">8–10 nodes</w:t>
-            </w:r>
-          </w:p>
-        </w:tc>
-        <w:tc>
-          <w:tcPr/>
-          <w:p>
-            <w:pPr>
-              <w:pStyle w:val="Compact"/>
-            </w:pPr>
-            <w:r>
-              <w:t xml:space="preserve">District seamer + reverse swing</w:t>
+              <w:t xml:space="preserve">6–8 stages</w:t>
+            </w:r>
+          </w:p>
+        </w:tc>
+        <w:tc>
+          <w:tcPr/>
+          <w:p>
+            <w:pPr>
+              <w:pStyle w:val="Compact"/>
+            </w:pPr>
+            <w:r>
+              <w:t xml:space="preserve">District seamer</w:t>
             </w:r>
           </w:p>
         </w:tc>
@@ -2807,18 +2850,18 @@
               <w:pStyle w:val="Compact"/>
             </w:pPr>
             <w:r>
-              <w:t xml:space="preserve">8–10 nodes</w:t>
-            </w:r>
-          </w:p>
-        </w:tc>
-        <w:tc>
-          <w:tcPr/>
-          <w:p>
-            <w:pPr>
-              <w:pStyle w:val="Compact"/>
-            </w:pPr>
-            <w:r>
-              <w:t xml:space="preserve">Mystery spinner, turning deck</w:t>
+              <w:t xml:space="preserve">6–8 stages</w:t>
+            </w:r>
+          </w:p>
+        </w:tc>
+        <w:tc>
+          <w:tcPr/>
+          <w:p>
+            <w:pPr>
+              <w:pStyle w:val="Compact"/>
+            </w:pPr>
+            <w:r>
+              <w:t xml:space="preserve">Mystery spinner</w:t>
             </w:r>
           </w:p>
         </w:tc>
@@ -2853,7 +2896,7 @@
               <w:pStyle w:val="Compact"/>
             </w:pPr>
             <w:r>
-              <w:t xml:space="preserve">8–10 nodes</w:t>
+              <w:t xml:space="preserve">6–8 stages</w:t>
             </w:r>
           </w:p>
         </w:tc>
@@ -2888,29 +2931,29 @@
               <w:pStyle w:val="Compact"/>
             </w:pPr>
             <w:r>
-              <w:t xml:space="preserve">International window</w:t>
-            </w:r>
-          </w:p>
-        </w:tc>
-        <w:tc>
-          <w:tcPr/>
-          <w:p>
-            <w:pPr>
-              <w:pStyle w:val="Compact"/>
-            </w:pPr>
-            <w:r>
-              <w:t xml:space="preserve">6–8 nodes + finale</w:t>
-            </w:r>
-          </w:p>
-        </w:tc>
-        <w:tc>
-          <w:tcPr/>
-          <w:p>
-            <w:pPr>
-              <w:pStyle w:val="Compact"/>
-            </w:pPr>
-            <w:r>
-              <w:t xml:space="preserve">“The New Ball” — pace + crowd as a mechanic</w:t>
+              <w:t xml:space="preserve">International</w:t>
+            </w:r>
+          </w:p>
+        </w:tc>
+        <w:tc>
+          <w:tcPr/>
+          <w:p>
+            <w:pPr>
+              <w:pStyle w:val="Compact"/>
+            </w:pPr>
+            <w:r>
+              <w:t xml:space="preserve">5–7 stages + finale</w:t>
+            </w:r>
+          </w:p>
+        </w:tc>
+        <w:tc>
+          <w:tcPr/>
+          <w:p>
+            <w:pPr>
+              <w:pStyle w:val="Compact"/>
+            </w:pPr>
+            <w:r>
+              <w:t xml:space="preserve">“The New Ball” — pace + crowd</w:t>
             </w:r>
           </w:p>
         </w:tc>
@@ -2918,199 +2961,189 @@
     </w:tbl>
     <w:p>
       <w:pPr>
+        <w:pStyle w:val="Compact"/>
+        <w:numPr>
+          <w:ilvl w:val="0"/>
+          <w:numId w:val="1009"/>
+        </w:numPr>
+      </w:pPr>
+      <w:r>
+        <w:t xml:space="preserve">Map is</w:t>
+      </w:r>
+      <w:r>
+        <w:t xml:space="preserve"> </w:t>
+      </w:r>
+      <w:r>
+        <w:rPr>
+          <w:b/>
+          <w:bCs/>
+        </w:rPr>
+        <w:t xml:space="preserve">linear with optional side fights</w:t>
+      </w:r>
+      <w:r>
+        <w:t xml:space="preserve"> </w:t>
+      </w:r>
+      <w:r>
+        <w:t xml:space="preserve">(nets, chai stall, rival), not a branching StS run that wipes.</w:t>
+      </w:r>
+    </w:p>
+    <w:p>
+      <w:pPr>
+        <w:pStyle w:val="Compact"/>
+        <w:numPr>
+          <w:ilvl w:val="0"/>
+          <w:numId w:val="1009"/>
+        </w:numPr>
+      </w:pPr>
+      <w:r>
+        <w:t xml:space="preserve">Clear a stage to unlock the next.</w:t>
+      </w:r>
+      <w:r>
+        <w:t xml:space="preserve"> </w:t>
+      </w:r>
+      <w:r>
+        <w:rPr>
+          <w:b/>
+          <w:bCs/>
+        </w:rPr>
+        <w:t xml:space="preserve">Lose = retry that stage.</w:t>
+      </w:r>
+      <w:r>
+        <w:t xml:space="preserve"> </w:t>
+      </w:r>
+      <w:r>
+        <w:t xml:space="preserve">One optional</w:t>
+      </w:r>
+      <w:r>
+        <w:t xml:space="preserve"> </w:t>
+      </w:r>
+      <w:r>
+        <w:rPr>
+          <w:b/>
+          <w:bCs/>
+        </w:rPr>
+        <w:t xml:space="preserve">ad-revive per fight</w:t>
+      </w:r>
+      <w:r>
+        <w:t xml:space="preserve">, then you still retry the stage — you do not lose the act.</w:t>
+      </w:r>
+    </w:p>
+    <w:p>
+      <w:pPr>
+        <w:pStyle w:val="Compact"/>
+        <w:numPr>
+          <w:ilvl w:val="0"/>
+          <w:numId w:val="1009"/>
+        </w:numPr>
+      </w:pPr>
+      <w:r>
+        <w:rPr>
+          <w:b/>
+          <w:bCs/>
+        </w:rPr>
+        <w:t xml:space="preserve">Autosave</w:t>
+      </w:r>
+      <w:r>
+        <w:t xml:space="preserve"> </w:t>
+      </w:r>
+      <w:r>
+        <w:t xml:space="preserve">after every stage. Close the app on the bus; open it on the same node.</w:t>
+      </w:r>
+    </w:p>
+    <w:p>
+      <w:pPr>
+        <w:pStyle w:val="Compact"/>
+        <w:numPr>
+          <w:ilvl w:val="0"/>
+          <w:numId w:val="1009"/>
+        </w:numPr>
+      </w:pPr>
+      <w:r>
+        <w:t xml:space="preserve">Bat and bowl stages mixed on the map (icon tells you which pile you will draw).</w:t>
+      </w:r>
+    </w:p>
+    <w:p>
+      <w:pPr>
+        <w:pStyle w:val="Compact"/>
+        <w:numPr>
+          <w:ilvl w:val="0"/>
+          <w:numId w:val="1009"/>
+        </w:numPr>
+      </w:pPr>
+      <w:r>
+        <w:rPr>
+          <w:b/>
+          <w:bCs/>
+        </w:rPr>
+        <w:t xml:space="preserve">Fight length:</w:t>
+      </w:r>
+      <w:r>
+        <w:t xml:space="preserve"> </w:t>
+      </w:r>
+      <w:r>
+        <w:t xml:space="preserve">5–7 minutes. A session is</w:t>
+      </w:r>
+      <w:r>
+        <w:t xml:space="preserve"> </w:t>
+      </w:r>
+      <w:r>
+        <w:rPr>
+          <w:b/>
+          <w:bCs/>
+        </w:rPr>
+        <w:t xml:space="preserve">one or two stages</w:t>
+      </w:r>
+      <w:r>
+        <w:t xml:space="preserve">, not a 70-minute career.</w:t>
+      </w:r>
+    </w:p>
+    <w:p>
+      <w:pPr>
+        <w:pStyle w:val="FirstParagraph"/>
+      </w:pPr>
+      <w:r>
+        <w:rPr>
+          <w:b/>
+          <w:bCs/>
+        </w:rPr>
+        <w:t xml:space="preserve">True roguelite</w:t>
+      </w:r>
+      <w:r>
+        <w:t xml:space="preserve"> </w:t>
+      </w:r>
+      <w:r>
+        <w:t xml:space="preserve">(daily tour, seeded run, death wipes the tour) is a</w:t>
+      </w:r>
+      <w:r>
+        <w:t xml:space="preserve"> </w:t>
+      </w:r>
+      <w:r>
+        <w:rPr>
+          <w:b/>
+          <w:bCs/>
+        </w:rPr>
+        <w:t xml:space="preserve">later mode</w:t>
+      </w:r>
+      <w:r>
+        <w:t xml:space="preserve">, not v1.</w:t>
+      </w:r>
+    </w:p>
+    <w:p>
+      <w:pPr>
         <w:pStyle w:val="BodyText"/>
       </w:pPr>
       <w:r>
-        <w:t xml:space="preserve">Nodes (StS grammar, cricket names):</w:t>
-      </w:r>
-      <w:r>
-        <w:t xml:space="preserve"> </w:t>
-      </w:r>
-      <w:r>
-        <w:rPr>
-          <w:b/>
-          <w:bCs/>
-        </w:rPr>
-        <w:t xml:space="preserve">Nets</w:t>
-      </w:r>
-      <w:r>
-        <w:t xml:space="preserve"> </w:t>
-      </w:r>
-      <w:r>
-        <w:t xml:space="preserve">(upgrade),</w:t>
-      </w:r>
-      <w:r>
-        <w:t xml:space="preserve"> </w:t>
-      </w:r>
-      <w:r>
-        <w:rPr>
-          <w:b/>
-          <w:bCs/>
-        </w:rPr>
-        <w:t xml:space="preserve">Physio</w:t>
-      </w:r>
-      <w:r>
-        <w:t xml:space="preserve"> </w:t>
-      </w:r>
-      <w:r>
-        <w:t xml:space="preserve">(heal),</w:t>
-      </w:r>
-      <w:r>
-        <w:t xml:space="preserve"> </w:t>
-      </w:r>
-      <w:r>
-        <w:rPr>
-          <w:b/>
-          <w:bCs/>
-        </w:rPr>
-        <w:t xml:space="preserve">Chai stall</w:t>
-      </w:r>
-      <w:r>
-        <w:t xml:space="preserve"> </w:t>
-      </w:r>
-      <w:r>
-        <w:t xml:space="preserve">(shop),</w:t>
-      </w:r>
-      <w:r>
-        <w:t xml:space="preserve"> </w:t>
-      </w:r>
-      <w:r>
-        <w:rPr>
-          <w:b/>
-          <w:bCs/>
-        </w:rPr>
-        <w:t xml:space="preserve">Rival</w:t>
-      </w:r>
-      <w:r>
-        <w:t xml:space="preserve"> </w:t>
-      </w:r>
-      <w:r>
-        <w:t xml:space="preserve">(elite),</w:t>
-      </w:r>
-      <w:r>
-        <w:t xml:space="preserve"> </w:t>
-      </w:r>
-      <w:r>
-        <w:rPr>
-          <w:b/>
-          <w:bCs/>
-        </w:rPr>
-        <w:t xml:space="preserve">Net session with a coach</w:t>
-      </w:r>
-      <w:r>
-        <w:t xml:space="preserve"> </w:t>
-      </w:r>
-      <w:r>
-        <w:t xml:space="preserve">(remove/transform),</w:t>
-      </w:r>
-      <w:r>
-        <w:t xml:space="preserve"> </w:t>
-      </w:r>
-      <w:r>
-        <w:rPr>
-          <w:b/>
-          <w:bCs/>
-        </w:rPr>
-        <w:t xml:space="preserve">Rest day</w:t>
-      </w:r>
-      <w:r>
-        <w:t xml:space="preserve">,</w:t>
-      </w:r>
-      <w:r>
-        <w:t xml:space="preserve"> </w:t>
-      </w:r>
-      <w:r>
-        <w:rPr>
-          <w:b/>
-          <w:bCs/>
-        </w:rPr>
-        <w:t xml:space="preserve">Press</w:t>
-      </w:r>
-      <w:r>
-        <w:t xml:space="preserve"> </w:t>
-      </w:r>
-      <w:r>
-        <w:t xml:space="preserve">(gamble / curse).</w:t>
-      </w:r>
-    </w:p>
-    <w:p>
-      <w:pPr>
-        <w:pStyle w:val="BodyText"/>
-      </w:pPr>
-      <w:r>
-        <w:rPr>
-          <w:b/>
-          <w:bCs/>
-        </w:rPr>
-        <w:t xml:space="preserve">Win a run:</w:t>
-      </w:r>
-      <w:r>
-        <w:t xml:space="preserve"> </w:t>
-      </w:r>
-      <w:r>
-        <w:t xml:space="preserve">survive Act 4 as the same career — not a meta of many tournaments (locked 2026-09-02). Unlock a scar, a card, a kit colour.</w:t>
-      </w:r>
-    </w:p>
-    <w:p>
-      <w:pPr>
-        <w:pStyle w:val="BodyText"/>
-      </w:pPr>
-      <w:r>
-        <w:rPr>
-          <w:b/>
-          <w:bCs/>
-        </w:rPr>
-        <w:t xml:space="preserve">Lose a run:</w:t>
-      </w:r>
-      <w:r>
-        <w:t xml:space="preserve"> </w:t>
-      </w:r>
-      <w:r>
-        <w:t xml:space="preserve">dropped, injured, or “sent back to the gully.” Immediate retry. Meta XP still drops.</w:t>
-      </w:r>
-    </w:p>
-    <w:p>
-      <w:pPr>
-        <w:pStyle w:val="BodyText"/>
-      </w:pPr>
-      <w:r>
-        <w:rPr>
-          <w:b/>
-          <w:bCs/>
-        </w:rPr>
-        <w:t xml:space="preserve">Run time target:</w:t>
-      </w:r>
-      <w:r>
-        <w:t xml:space="preserve"> </w:t>
-      </w:r>
-      <w:r>
-        <w:t xml:space="preserve">first win possible in</w:t>
-      </w:r>
-      <w:r>
-        <w:t xml:space="preserve"> </w:t>
-      </w:r>
-      <w:r>
-        <w:rPr>
-          <w:b/>
-          <w:bCs/>
-        </w:rPr>
-        <w:t xml:space="preserve">45–70 minutes</w:t>
-      </w:r>
-      <w:r>
-        <w:t xml:space="preserve">. Individual fight</w:t>
-      </w:r>
-      <w:r>
-        <w:t xml:space="preserve"> </w:t>
-      </w:r>
-      <w:r>
-        <w:rPr>
-          <w:b/>
-          <w:bCs/>
-        </w:rPr>
-        <w:t xml:space="preserve">6–12 minutes</w:t>
-      </w:r>
-      <w:r>
-        <w:t xml:space="preserve">. If a fight exceeds 15 minutes, cut enemy HP, do not add timing minigames.</w:t>
+        <w:rPr>
+          <w:b/>
+          <w:bCs/>
+        </w:rPr>
+        <w:t xml:space="preserve">Win the campaign:</w:t>
+      </w:r>
+      <w:r>
+        <w:t xml:space="preserve"> </w:t>
+      </w:r>
+      <w:r>
+        <w:t xml:space="preserve">finish Act 4. Then New Game+ / harder intents / cosmetics, not “delete the kid.”</w:t>
       </w:r>
     </w:p>
     <w:bookmarkEnd w:id="22"/>
@@ -3128,7 +3161,7 @@
         <w:pStyle w:val="Compact"/>
         <w:numPr>
           <w:ilvl w:val="0"/>
-          <w:numId w:val="1009"/>
+          <w:numId w:val="1010"/>
         </w:numPr>
       </w:pPr>
       <w:r>
@@ -3150,7 +3183,7 @@
         <w:pStyle w:val="Compact"/>
         <w:numPr>
           <w:ilvl w:val="0"/>
-          <w:numId w:val="1009"/>
+          <w:numId w:val="1010"/>
         </w:numPr>
       </w:pPr>
       <w:r>
@@ -3198,7 +3231,7 @@
         <w:pStyle w:val="Compact"/>
         <w:numPr>
           <w:ilvl w:val="0"/>
-          <w:numId w:val="1009"/>
+          <w:numId w:val="1010"/>
         </w:numPr>
       </w:pPr>
       <w:r>
@@ -3230,7 +3263,7 @@
         <w:pStyle w:val="Compact"/>
         <w:numPr>
           <w:ilvl w:val="0"/>
-          <w:numId w:val="1010"/>
+          <w:numId w:val="1011"/>
         </w:numPr>
       </w:pPr>
       <w:r>
@@ -3242,7 +3275,7 @@
         <w:pStyle w:val="Compact"/>
         <w:numPr>
           <w:ilvl w:val="0"/>
-          <w:numId w:val="1010"/>
+          <w:numId w:val="1011"/>
         </w:numPr>
       </w:pPr>
       <w:r>
@@ -3254,7 +3287,7 @@
         <w:pStyle w:val="Compact"/>
         <w:numPr>
           <w:ilvl w:val="0"/>
-          <w:numId w:val="1010"/>
+          <w:numId w:val="1011"/>
         </w:numPr>
       </w:pPr>
       <w:r>
@@ -3266,11 +3299,23 @@
         <w:pStyle w:val="Compact"/>
         <w:numPr>
           <w:ilvl w:val="0"/>
-          <w:numId w:val="1010"/>
+          <w:numId w:val="1011"/>
         </w:numPr>
       </w:pPr>
       <w:r>
         <w:t xml:space="preserve">No Unity.</w:t>
+      </w:r>
+    </w:p>
+    <w:p>
+      <w:pPr>
+        <w:pStyle w:val="Compact"/>
+        <w:numPr>
+          <w:ilvl w:val="0"/>
+          <w:numId w:val="1011"/>
+        </w:numPr>
+      </w:pPr>
+      <w:r>
+        <w:t xml:space="preserve">No permadeath of the campaign. Roguelite daily-tour is post-v1.</w:t>
       </w:r>
     </w:p>
     <w:p>
@@ -3431,29 +3476,29 @@
                 <w:b/>
                 <w:bCs/>
               </w:rPr>
-              <w:t xml:space="preserve">Hades</w:t>
-            </w:r>
-          </w:p>
-        </w:tc>
-        <w:tc>
-          <w:tcPr/>
-          <w:p>
-            <w:pPr>
-              <w:pStyle w:val="Compact"/>
-            </w:pPr>
-            <w:r>
-              <w:t xml:space="preserve">Character, death as story, meta that feels like training</w:t>
-            </w:r>
-          </w:p>
-        </w:tc>
-        <w:tc>
-          <w:tcPr/>
-          <w:p>
-            <w:pPr>
-              <w:pStyle w:val="Compact"/>
-            </w:pPr>
-            <w:r>
-              <w:t xml:space="preserve">Isometric action</w:t>
+              <w:t xml:space="preserve">Shadow Fight 2</w:t>
+            </w:r>
+          </w:p>
+        </w:tc>
+        <w:tc>
+          <w:tcPr/>
+          <w:p>
+            <w:pPr>
+              <w:pStyle w:val="Compact"/>
+            </w:pPr>
+            <w:r>
+              <w:t xml:space="preserve">Act maps, retry-the-fight, persistent gear, India-digestible F2P</w:t>
+            </w:r>
+          </w:p>
+        </w:tc>
+        <w:tc>
+          <w:tcPr/>
+          <w:p>
+            <w:pPr>
+              <w:pStyle w:val="Compact"/>
+            </w:pPr>
+            <w:r>
+              <w:t xml:space="preserve">Weapon gacha, energy that bricks the game</w:t>
             </w:r>
           </w:p>
         </w:tc>
@@ -3673,7 +3718,7 @@
           <w:i/>
           <w:iCs/>
         </w:rPr>
-        <w:t xml:space="preserve">draft a ridiculous reverse-sweep build, die to a bouncer barrage, immediately start again with one more unlocked street card.</w:t>
+        <w:t xml:space="preserve">lose a gully fight to a bouncer, slam the meme reverse-sweep anyway, retry the same kid, beat the stage, open the next chowk.</w:t>
       </w:r>
     </w:p>
     <w:p>
@@ -3741,7 +3786,7 @@
         <w:pStyle w:val="Compact"/>
         <w:numPr>
           <w:ilvl w:val="0"/>
-          <w:numId w:val="1011"/>
+          <w:numId w:val="1012"/>
         </w:numPr>
       </w:pPr>
       <w:r>
@@ -3785,7 +3830,7 @@
         <w:pStyle w:val="Compact"/>
         <w:numPr>
           <w:ilvl w:val="0"/>
-          <w:numId w:val="1011"/>
+          <w:numId w:val="1012"/>
         </w:numPr>
       </w:pPr>
       <w:r>
@@ -3813,7 +3858,7 @@
         <w:pStyle w:val="Compact"/>
         <w:numPr>
           <w:ilvl w:val="0"/>
-          <w:numId w:val="1011"/>
+          <w:numId w:val="1012"/>
         </w:numPr>
       </w:pPr>
       <w:r>
@@ -3825,7 +3870,7 @@
         <w:pStyle w:val="Compact"/>
         <w:numPr>
           <w:ilvl w:val="0"/>
-          <w:numId w:val="1011"/>
+          <w:numId w:val="1012"/>
         </w:numPr>
       </w:pPr>
       <w:r>
@@ -3931,7 +3976,7 @@
         <w:pStyle w:val="Compact"/>
         <w:numPr>
           <w:ilvl w:val="0"/>
-          <w:numId w:val="1012"/>
+          <w:numId w:val="1013"/>
         </w:numPr>
       </w:pPr>
       <w:r>
@@ -3956,7 +4001,7 @@
         <w:pStyle w:val="Compact"/>
         <w:numPr>
           <w:ilvl w:val="0"/>
-          <w:numId w:val="1012"/>
+          <w:numId w:val="1013"/>
         </w:numPr>
       </w:pPr>
       <w:r>
@@ -3968,7 +4013,7 @@
         <w:pStyle w:val="Compact"/>
         <w:numPr>
           <w:ilvl w:val="0"/>
-          <w:numId w:val="1012"/>
+          <w:numId w:val="1013"/>
         </w:numPr>
       </w:pPr>
       <w:r>
@@ -3980,7 +4025,7 @@
         <w:pStyle w:val="Compact"/>
         <w:numPr>
           <w:ilvl w:val="0"/>
-          <w:numId w:val="1012"/>
+          <w:numId w:val="1013"/>
         </w:numPr>
       </w:pPr>
       <w:r>
@@ -4741,7 +4786,7 @@
         <w:pStyle w:val="Compact"/>
         <w:numPr>
           <w:ilvl w:val="0"/>
-          <w:numId w:val="1013"/>
+          <w:numId w:val="1014"/>
         </w:numPr>
       </w:pPr>
       <w:r>
@@ -4766,7 +4811,7 @@
         <w:pStyle w:val="Compact"/>
         <w:numPr>
           <w:ilvl w:val="0"/>
-          <w:numId w:val="1013"/>
+          <w:numId w:val="1014"/>
         </w:numPr>
       </w:pPr>
       <w:r>
@@ -4778,7 +4823,7 @@
         <w:pStyle w:val="Compact"/>
         <w:numPr>
           <w:ilvl w:val="0"/>
-          <w:numId w:val="1013"/>
+          <w:numId w:val="1014"/>
         </w:numPr>
       </w:pPr>
       <w:r>
@@ -4790,7 +4835,7 @@
         <w:pStyle w:val="Compact"/>
         <w:numPr>
           <w:ilvl w:val="0"/>
-          <w:numId w:val="1013"/>
+          <w:numId w:val="1014"/>
         </w:numPr>
       </w:pPr>
       <w:r>
@@ -5024,7 +5069,7 @@
         <w:pStyle w:val="Compact"/>
         <w:numPr>
           <w:ilvl w:val="0"/>
-          <w:numId w:val="1014"/>
+          <w:numId w:val="1015"/>
         </w:numPr>
       </w:pPr>
       <w:r>
@@ -5046,7 +5091,7 @@
         <w:pStyle w:val="Compact"/>
         <w:numPr>
           <w:ilvl w:val="0"/>
-          <w:numId w:val="1014"/>
+          <w:numId w:val="1015"/>
         </w:numPr>
       </w:pPr>
       <w:r>
@@ -5068,7 +5113,7 @@
         <w:pStyle w:val="Compact"/>
         <w:numPr>
           <w:ilvl w:val="0"/>
-          <w:numId w:val="1014"/>
+          <w:numId w:val="1015"/>
         </w:numPr>
       </w:pPr>
       <w:r>
@@ -5106,7 +5151,7 @@
         <w:pStyle w:val="Compact"/>
         <w:numPr>
           <w:ilvl w:val="0"/>
-          <w:numId w:val="1014"/>
+          <w:numId w:val="1015"/>
         </w:numPr>
       </w:pPr>
       <w:r>
@@ -5128,7 +5173,7 @@
         <w:pStyle w:val="Compact"/>
         <w:numPr>
           <w:ilvl w:val="0"/>
-          <w:numId w:val="1014"/>
+          <w:numId w:val="1015"/>
         </w:numPr>
       </w:pPr>
       <w:r>
@@ -5231,7 +5276,7 @@
         <w:pStyle w:val="Compact"/>
         <w:numPr>
           <w:ilvl w:val="0"/>
-          <w:numId w:val="1015"/>
+          <w:numId w:val="1016"/>
         </w:numPr>
       </w:pPr>
       <w:r>
@@ -5256,7 +5301,7 @@
         <w:pStyle w:val="Compact"/>
         <w:numPr>
           <w:ilvl w:val="0"/>
-          <w:numId w:val="1015"/>
+          <w:numId w:val="1016"/>
         </w:numPr>
       </w:pPr>
       <w:r>
@@ -5268,7 +5313,7 @@
         <w:pStyle w:val="Compact"/>
         <w:numPr>
           <w:ilvl w:val="0"/>
-          <w:numId w:val="1015"/>
+          <w:numId w:val="1016"/>
         </w:numPr>
       </w:pPr>
       <w:r>
@@ -5280,7 +5325,7 @@
         <w:pStyle w:val="Compact"/>
         <w:numPr>
           <w:ilvl w:val="0"/>
-          <w:numId w:val="1015"/>
+          <w:numId w:val="1016"/>
         </w:numPr>
       </w:pPr>
       <w:r>
@@ -5905,24 +5950,21 @@
                 <w:b/>
                 <w:bCs/>
               </w:rPr>
-              <w:t xml:space="preserve">1 per run, then you are dead</w:t>
-            </w:r>
-            <w:r>
-              <w:t xml:space="preserve"> </w:t>
-            </w:r>
-            <w:r>
-              <w:t xml:space="preserve">(locked 2026-09-02)</w:t>
-            </w:r>
-          </w:p>
-        </w:tc>
-        <w:tc>
-          <w:tcPr/>
-          <w:p>
-            <w:pPr>
-              <w:pStyle w:val="Compact"/>
-            </w:pPr>
-            <w:r>
-              <w:t xml:space="preserve">Highest eCPM, must be skippable</w:t>
+              <w:t xml:space="preserve">1 per fight</w:t>
+            </w:r>
+            <w:r>
+              <w:t xml:space="preserve">, then retry the stage</w:t>
+            </w:r>
+          </w:p>
+        </w:tc>
+        <w:tc>
+          <w:tcPr/>
+          <w:p>
+            <w:pPr>
+              <w:pStyle w:val="Compact"/>
+            </w:pPr>
+            <w:r>
+              <w:t xml:space="preserve">Highest eCPM. Campaign is not wiped</w:t>
             </w:r>
           </w:p>
         </w:tc>
@@ -6135,7 +6177,7 @@
         <w:pStyle w:val="Compact"/>
         <w:numPr>
           <w:ilvl w:val="0"/>
-          <w:numId w:val="1016"/>
+          <w:numId w:val="1017"/>
         </w:numPr>
       </w:pPr>
       <w:r>
@@ -6208,7 +6250,7 @@
         <w:pStyle w:val="Compact"/>
         <w:numPr>
           <w:ilvl w:val="0"/>
-          <w:numId w:val="1016"/>
+          <w:numId w:val="1017"/>
         </w:numPr>
       </w:pPr>
       <w:r>
@@ -6246,7 +6288,7 @@
         <w:pStyle w:val="Compact"/>
         <w:numPr>
           <w:ilvl w:val="0"/>
-          <w:numId w:val="1016"/>
+          <w:numId w:val="1017"/>
         </w:numPr>
       </w:pPr>
       <w:r>
@@ -6283,7 +6325,7 @@
         <w:pStyle w:val="Compact"/>
         <w:numPr>
           <w:ilvl w:val="0"/>
-          <w:numId w:val="1017"/>
+          <w:numId w:val="1018"/>
         </w:numPr>
       </w:pPr>
       <w:r>
@@ -6317,7 +6359,7 @@
         <w:pStyle w:val="Compact"/>
         <w:numPr>
           <w:ilvl w:val="0"/>
-          <w:numId w:val="1017"/>
+          <w:numId w:val="1018"/>
         </w:numPr>
       </w:pPr>
       <w:r>
@@ -6348,7 +6390,7 @@
         <w:pStyle w:val="Compact"/>
         <w:numPr>
           <w:ilvl w:val="0"/>
-          <w:numId w:val="1017"/>
+          <w:numId w:val="1018"/>
         </w:numPr>
       </w:pPr>
       <w:r>
@@ -6689,7 +6731,7 @@
         <w:pStyle w:val="Compact"/>
         <w:numPr>
           <w:ilvl w:val="0"/>
-          <w:numId w:val="1018"/>
+          <w:numId w:val="1019"/>
         </w:numPr>
       </w:pPr>
       <w:r>
@@ -6749,7 +6791,7 @@
         <w:pStyle w:val="Compact"/>
         <w:numPr>
           <w:ilvl w:val="0"/>
-          <w:numId w:val="1018"/>
+          <w:numId w:val="1019"/>
         </w:numPr>
       </w:pPr>
       <w:r>
@@ -6774,7 +6816,7 @@
         <w:pStyle w:val="Compact"/>
         <w:numPr>
           <w:ilvl w:val="0"/>
-          <w:numId w:val="1018"/>
+          <w:numId w:val="1019"/>
         </w:numPr>
       </w:pPr>
       <w:r>
@@ -6857,7 +6899,7 @@
         <w:pStyle w:val="Compact"/>
         <w:numPr>
           <w:ilvl w:val="0"/>
-          <w:numId w:val="1019"/>
+          <w:numId w:val="1020"/>
         </w:numPr>
       </w:pPr>
       <w:r>
@@ -6869,7 +6911,7 @@
         <w:pStyle w:val="Compact"/>
         <w:numPr>
           <w:ilvl w:val="0"/>
-          <w:numId w:val="1019"/>
+          <w:numId w:val="1020"/>
         </w:numPr>
       </w:pPr>
       <w:r>
@@ -6881,7 +6923,7 @@
         <w:pStyle w:val="Compact"/>
         <w:numPr>
           <w:ilvl w:val="0"/>
-          <w:numId w:val="1019"/>
+          <w:numId w:val="1020"/>
         </w:numPr>
       </w:pPr>
       <w:r>
@@ -7346,7 +7388,7 @@
         <w:pStyle w:val="Compact"/>
         <w:numPr>
           <w:ilvl w:val="0"/>
-          <w:numId w:val="1020"/>
+          <w:numId w:val="1021"/>
         </w:numPr>
       </w:pPr>
       <w:r>
@@ -7358,7 +7400,7 @@
         <w:pStyle w:val="Compact"/>
         <w:numPr>
           <w:ilvl w:val="0"/>
-          <w:numId w:val="1020"/>
+          <w:numId w:val="1021"/>
         </w:numPr>
       </w:pPr>
       <w:r>
@@ -7370,19 +7412,19 @@
         <w:pStyle w:val="Compact"/>
         <w:numPr>
           <w:ilvl w:val="0"/>
-          <w:numId w:val="1020"/>
-        </w:numPr>
-      </w:pPr>
-      <w:r>
-        <w:t xml:space="preserve">1 act map (Gully → club final)</w:t>
-      </w:r>
-    </w:p>
-    <w:p>
-      <w:pPr>
-        <w:pStyle w:val="Compact"/>
-        <w:numPr>
-          <w:ilvl w:val="0"/>
-          <w:numId w:val="1020"/>
+          <w:numId w:val="1021"/>
+        </w:numPr>
+      </w:pPr>
+      <w:r>
+        <w:t xml:space="preserve">Gully act map (2–3 stages, retry on loss)</w:t>
+      </w:r>
+    </w:p>
+    <w:p>
+      <w:pPr>
+        <w:pStyle w:val="Compact"/>
+        <w:numPr>
+          <w:ilvl w:val="0"/>
+          <w:numId w:val="1021"/>
         </w:numPr>
       </w:pPr>
       <w:r>
@@ -7394,7 +7436,7 @@
         <w:pStyle w:val="Compact"/>
         <w:numPr>
           <w:ilvl w:val="0"/>
-          <w:numId w:val="1020"/>
+          <w:numId w:val="1021"/>
         </w:numPr>
       </w:pPr>
       <w:r>
@@ -7406,7 +7448,7 @@
         <w:pStyle w:val="Compact"/>
         <w:numPr>
           <w:ilvl w:val="0"/>
-          <w:numId w:val="1020"/>
+          <w:numId w:val="1021"/>
         </w:numPr>
       </w:pPr>
       <w:r>
@@ -7446,7 +7488,7 @@
         <w:pStyle w:val="Compact"/>
         <w:numPr>
           <w:ilvl w:val="0"/>
-          <w:numId w:val="1021"/>
+          <w:numId w:val="1022"/>
         </w:numPr>
       </w:pPr>
       <w:r>
@@ -7458,7 +7500,7 @@
         <w:pStyle w:val="Compact"/>
         <w:numPr>
           <w:ilvl w:val="0"/>
-          <w:numId w:val="1021"/>
+          <w:numId w:val="1022"/>
         </w:numPr>
       </w:pPr>
       <w:r>
@@ -7470,7 +7512,7 @@
         <w:pStyle w:val="Compact"/>
         <w:numPr>
           <w:ilvl w:val="0"/>
-          <w:numId w:val="1021"/>
+          <w:numId w:val="1022"/>
         </w:numPr>
       </w:pPr>
       <w:r>
@@ -7482,7 +7524,7 @@
         <w:pStyle w:val="Compact"/>
         <w:numPr>
           <w:ilvl w:val="0"/>
-          <w:numId w:val="1021"/>
+          <w:numId w:val="1022"/>
         </w:numPr>
       </w:pPr>
       <w:r>
@@ -7504,7 +7546,7 @@
         <w:pStyle w:val="Compact"/>
         <w:numPr>
           <w:ilvl w:val="0"/>
-          <w:numId w:val="1022"/>
+          <w:numId w:val="1023"/>
         </w:numPr>
       </w:pPr>
       <w:r>
@@ -7516,7 +7558,7 @@
         <w:pStyle w:val="Compact"/>
         <w:numPr>
           <w:ilvl w:val="0"/>
-          <w:numId w:val="1022"/>
+          <w:numId w:val="1023"/>
         </w:numPr>
       </w:pPr>
       <w:r>
@@ -7528,7 +7570,7 @@
         <w:pStyle w:val="Compact"/>
         <w:numPr>
           <w:ilvl w:val="0"/>
-          <w:numId w:val="1022"/>
+          <w:numId w:val="1023"/>
         </w:numPr>
       </w:pPr>
       <w:r>
@@ -7540,7 +7582,7 @@
         <w:pStyle w:val="Compact"/>
         <w:numPr>
           <w:ilvl w:val="0"/>
-          <w:numId w:val="1022"/>
+          <w:numId w:val="1023"/>
         </w:numPr>
       </w:pPr>
       <w:r>
@@ -7562,7 +7604,7 @@
         <w:pStyle w:val="Compact"/>
         <w:numPr>
           <w:ilvl w:val="0"/>
-          <w:numId w:val="1023"/>
+          <w:numId w:val="1024"/>
         </w:numPr>
       </w:pPr>
       <w:r>
@@ -7574,7 +7616,7 @@
         <w:pStyle w:val="Compact"/>
         <w:numPr>
           <w:ilvl w:val="0"/>
-          <w:numId w:val="1023"/>
+          <w:numId w:val="1024"/>
         </w:numPr>
       </w:pPr>
       <w:r>
@@ -7604,7 +7646,7 @@
         <w:pStyle w:val="Compact"/>
         <w:numPr>
           <w:ilvl w:val="0"/>
-          <w:numId w:val="1024"/>
+          <w:numId w:val="1025"/>
         </w:numPr>
       </w:pPr>
       <w:r>
@@ -7616,7 +7658,7 @@
         <w:pStyle w:val="Compact"/>
         <w:numPr>
           <w:ilvl w:val="0"/>
-          <w:numId w:val="1024"/>
+          <w:numId w:val="1025"/>
         </w:numPr>
       </w:pPr>
       <w:r>
@@ -7628,7 +7670,7 @@
         <w:pStyle w:val="Compact"/>
         <w:numPr>
           <w:ilvl w:val="0"/>
-          <w:numId w:val="1024"/>
+          <w:numId w:val="1025"/>
         </w:numPr>
       </w:pPr>
       <w:r>
@@ -7640,7 +7682,7 @@
         <w:pStyle w:val="Compact"/>
         <w:numPr>
           <w:ilvl w:val="0"/>
-          <w:numId w:val="1024"/>
+          <w:numId w:val="1025"/>
         </w:numPr>
       </w:pPr>
       <w:r>
@@ -7670,7 +7712,7 @@
         <w:pStyle w:val="Compact"/>
         <w:numPr>
           <w:ilvl w:val="0"/>
-          <w:numId w:val="1025"/>
+          <w:numId w:val="1026"/>
         </w:numPr>
       </w:pPr>
       <w:r>
@@ -7692,7 +7734,7 @@
         <w:pStyle w:val="Compact"/>
         <w:numPr>
           <w:ilvl w:val="0"/>
-          <w:numId w:val="1025"/>
+          <w:numId w:val="1026"/>
         </w:numPr>
       </w:pPr>
       <w:r>
@@ -7743,7 +7785,7 @@
         <w:pStyle w:val="Compact"/>
         <w:numPr>
           <w:ilvl w:val="0"/>
-          <w:numId w:val="1025"/>
+          <w:numId w:val="1026"/>
         </w:numPr>
       </w:pPr>
       <w:r>
@@ -7765,7 +7807,7 @@
         <w:pStyle w:val="Compact"/>
         <w:numPr>
           <w:ilvl w:val="0"/>
-          <w:numId w:val="1025"/>
+          <w:numId w:val="1026"/>
         </w:numPr>
       </w:pPr>
       <w:r>
@@ -7787,7 +7829,7 @@
         <w:pStyle w:val="Compact"/>
         <w:numPr>
           <w:ilvl w:val="0"/>
-          <w:numId w:val="1025"/>
+          <w:numId w:val="1026"/>
         </w:numPr>
       </w:pPr>
       <w:r>
@@ -8212,7 +8254,23 @@
         <w:pStyle w:val="BodyText"/>
       </w:pPr>
       <w:r>
-        <w:t xml:space="preserve">If after two deaths you still queue another gully fight, continue to Alpha and point the Play closed test at it.</w:t>
+        <w:t xml:space="preserve">If after</w:t>
+      </w:r>
+      <w:r>
+        <w:t xml:space="preserve"> </w:t>
+      </w:r>
+      <w:r>
+        <w:rPr>
+          <w:b/>
+          <w:bCs/>
+        </w:rPr>
+        <w:t xml:space="preserve">losing a gully fight</w:t>
+      </w:r>
+      <w:r>
+        <w:t xml:space="preserve"> </w:t>
+      </w:r>
+      <w:r>
+        <w:t xml:space="preserve">you still tap retry (or the next stage) without being asked, continue to Alpha.</w:t>
       </w:r>
     </w:p>
     <w:p>
@@ -8276,7 +8334,7 @@
         <w:pStyle w:val="Compact"/>
         <w:numPr>
           <w:ilvl w:val="0"/>
-          <w:numId w:val="1026"/>
+          <w:numId w:val="1027"/>
         </w:numPr>
       </w:pPr>
       <w:r>
@@ -8298,36 +8356,52 @@
         <w:pStyle w:val="Compact"/>
         <w:numPr>
           <w:ilvl w:val="0"/>
-          <w:numId w:val="1026"/>
-        </w:numPr>
-      </w:pPr>
-      <w:r>
-        <w:rPr>
-          <w:b/>
-          <w:bCs/>
-        </w:rPr>
-        <w:t xml:space="preserve">Player-based roguelite deckbuilder</w:t>
-      </w:r>
-      <w:r>
-        <w:t xml:space="preserve">, not a franchise manager and not an arcade sim.</w:t>
-      </w:r>
-      <w:r>
-        <w:t xml:space="preserve"> </w:t>
-      </w:r>
-      <w:r>
-        <w:rPr>
-          <w:b/>
-          <w:bCs/>
-        </w:rPr>
-        <w:t xml:space="preserve">One run = whole career. You are an all-rounder; cards mix shots and balls. First three minutes are gully culture. One ad-revive per run, then dead.</w:t>
-      </w:r>
-    </w:p>
-    <w:p>
-      <w:pPr>
-        <w:pStyle w:val="Compact"/>
-        <w:numPr>
-          <w:ilvl w:val="0"/>
-          <w:numId w:val="1026"/>
+          <w:numId w:val="1027"/>
+        </w:numPr>
+      </w:pPr>
+      <w:r>
+        <w:rPr>
+          <w:b/>
+          <w:bCs/>
+        </w:rPr>
+        <w:t xml:space="preserve">Player-based cricket deckbuilder with a Shadow Fight act campaign</w:t>
+      </w:r>
+      <w:r>
+        <w:t xml:space="preserve">, not a permadeath roguelite and not a franchise manager. All-rounder via bat/bowl</w:t>
+      </w:r>
+      <w:r>
+        <w:t xml:space="preserve"> </w:t>
+      </w:r>
+      <w:r>
+        <w:rPr>
+          <w:b/>
+          <w:bCs/>
+        </w:rPr>
+        <w:t xml:space="preserve">stages</w:t>
+      </w:r>
+      <w:r>
+        <w:t xml:space="preserve">. Two card piles. 5–7 min fights. Gully-first. One ad-revive</w:t>
+      </w:r>
+      <w:r>
+        <w:t xml:space="preserve"> </w:t>
+      </w:r>
+      <w:r>
+        <w:rPr>
+          <w:b/>
+          <w:bCs/>
+        </w:rPr>
+        <w:t xml:space="preserve">per fight</w:t>
+      </w:r>
+      <w:r>
+        <w:t xml:space="preserve">.</w:t>
+      </w:r>
+    </w:p>
+    <w:p>
+      <w:pPr>
+        <w:pStyle w:val="Compact"/>
+        <w:numPr>
+          <w:ilvl w:val="0"/>
+          <w:numId w:val="1027"/>
         </w:numPr>
       </w:pPr>
       <w:r>
@@ -8346,7 +8420,7 @@
         <w:pStyle w:val="Compact"/>
         <w:numPr>
           <w:ilvl w:val="0"/>
-          <w:numId w:val="1026"/>
+          <w:numId w:val="1027"/>
         </w:numPr>
       </w:pPr>
       <w:r>
@@ -8365,7 +8439,7 @@
         <w:pStyle w:val="Compact"/>
         <w:numPr>
           <w:ilvl w:val="0"/>
-          <w:numId w:val="1026"/>
+          <w:numId w:val="1027"/>
         </w:numPr>
       </w:pPr>
       <w:r>
@@ -8384,7 +8458,7 @@
         <w:pStyle w:val="Compact"/>
         <w:numPr>
           <w:ilvl w:val="0"/>
-          <w:numId w:val="1026"/>
+          <w:numId w:val="1027"/>
         </w:numPr>
       </w:pPr>
       <w:r>
@@ -8403,7 +8477,7 @@
         <w:pStyle w:val="Compact"/>
         <w:numPr>
           <w:ilvl w:val="0"/>
-          <w:numId w:val="1026"/>
+          <w:numId w:val="1027"/>
         </w:numPr>
       </w:pPr>
       <w:r>
@@ -8439,45 +8513,52 @@
         <w:pStyle w:val="Compact"/>
         <w:numPr>
           <w:ilvl w:val="0"/>
-          <w:numId w:val="1027"/>
-        </w:numPr>
-      </w:pPr>
-      <w:r>
-        <w:rPr>
-          <w:b/>
-          <w:bCs/>
-        </w:rPr>
-        <w:t xml:space="preserve">Ladder:</w:t>
-      </w:r>
-      <w:r>
-        <w:t xml:space="preserve"> </w:t>
-      </w:r>
-      <w:r>
-        <w:t xml:space="preserve">one run</w:t>
-      </w:r>
-      <w:r>
-        <w:t xml:space="preserve"> </w:t>
-      </w:r>
-      <w:r>
-        <w:rPr>
-          <w:b/>
-          <w:bCs/>
-        </w:rPr>
-        <w:t xml:space="preserve">is</w:t>
-      </w:r>
-      <w:r>
-        <w:t xml:space="preserve"> </w:t>
-      </w:r>
-      <w:r>
-        <w:t xml:space="preserve">the whole career (gully → international). Death ends that life. International is the Act 4 boss. Not a meta of many tournaments.</w:t>
-      </w:r>
-    </w:p>
-    <w:p>
-      <w:pPr>
-        <w:pStyle w:val="Compact"/>
-        <w:numPr>
-          <w:ilvl w:val="0"/>
-          <w:numId w:val="1027"/>
+          <w:numId w:val="1028"/>
+        </w:numPr>
+      </w:pPr>
+      <w:r>
+        <w:rPr>
+          <w:b/>
+          <w:bCs/>
+        </w:rPr>
+        <w:t xml:space="preserve">Ladder (updated):</w:t>
+      </w:r>
+      <w:r>
+        <w:t xml:space="preserve"> </w:t>
+      </w:r>
+      <w:r>
+        <w:rPr>
+          <w:b/>
+          <w:bCs/>
+        </w:rPr>
+        <w:t xml:space="preserve">act-based campaign</w:t>
+      </w:r>
+      <w:r>
+        <w:t xml:space="preserve">, one stage at a time (Shadow Fight / ninja-act grammar).</w:t>
+      </w:r>
+      <w:r>
+        <w:t xml:space="preserve"> </w:t>
+      </w:r>
+      <w:r>
+        <w:rPr>
+          <w:b/>
+          <w:bCs/>
+        </w:rPr>
+        <w:t xml:space="preserve">Not</w:t>
+      </w:r>
+      <w:r>
+        <w:t xml:space="preserve"> </w:t>
+      </w:r>
+      <w:r>
+        <w:t xml:space="preserve">a permadeath whole-career run. Street → international is the map you keep.</w:t>
+      </w:r>
+    </w:p>
+    <w:p>
+      <w:pPr>
+        <w:pStyle w:val="Compact"/>
+        <w:numPr>
+          <w:ilvl w:val="0"/>
+          <w:numId w:val="1028"/>
         </w:numPr>
       </w:pPr>
       <w:r>
@@ -8525,7 +8606,7 @@
         <w:pStyle w:val="Compact"/>
         <w:numPr>
           <w:ilvl w:val="0"/>
-          <w:numId w:val="1027"/>
+          <w:numId w:val="1028"/>
         </w:numPr>
       </w:pPr>
       <w:r>
@@ -8543,18 +8624,34 @@
           <w:b/>
           <w:bCs/>
         </w:rPr>
-        <w:t xml:space="preserve">one optional rewarded revive per run</w:t>
-      </w:r>
-      <w:r>
-        <w:t xml:space="preserve">, then you are dead. Not premium-currency revives. Not ads-off-only.</w:t>
-      </w:r>
-    </w:p>
-    <w:p>
-      <w:pPr>
-        <w:pStyle w:val="Compact"/>
-        <w:numPr>
-          <w:ilvl w:val="0"/>
-          <w:numId w:val="1027"/>
+        <w:t xml:space="preserve">one optional rewarded revive per fight</w:t>
+      </w:r>
+      <w:r>
+        <w:t xml:space="preserve">, then you retry the</w:t>
+      </w:r>
+      <w:r>
+        <w:t xml:space="preserve"> </w:t>
+      </w:r>
+      <w:r>
+        <w:rPr>
+          <w:b/>
+          <w:bCs/>
+        </w:rPr>
+        <w:t xml:space="preserve">stage</w:t>
+      </w:r>
+      <w:r>
+        <w:t xml:space="preserve"> </w:t>
+      </w:r>
+      <w:r>
+        <w:t xml:space="preserve">(you do not lose the act). Not premium-currency revives.</w:t>
+      </w:r>
+    </w:p>
+    <w:p>
+      <w:pPr>
+        <w:pStyle w:val="Compact"/>
+        <w:numPr>
+          <w:ilvl w:val="0"/>
+          <w:numId w:val="1028"/>
         </w:numPr>
       </w:pPr>
       <w:r>
@@ -8579,6 +8676,351 @@
       </w:r>
       <w:r>
         <w:t xml:space="preserve">Culture first. Cards second. India-native.</w:t>
+      </w:r>
+    </w:p>
+    <w:p>
+      <w:pPr>
+        <w:pStyle w:val="Compact"/>
+        <w:numPr>
+          <w:ilvl w:val="0"/>
+          <w:numId w:val="1028"/>
+        </w:numPr>
+      </w:pPr>
+      <w:r>
+        <w:rPr>
+          <w:b/>
+          <w:bCs/>
+        </w:rPr>
+        <w:t xml:space="preserve">Node:</w:t>
+      </w:r>
+      <w:r>
+        <w:t xml:space="preserve"> </w:t>
+      </w:r>
+      <w:r>
+        <w:t xml:space="preserve">one</w:t>
+      </w:r>
+      <w:r>
+        <w:t xml:space="preserve"> </w:t>
+      </w:r>
+      <w:r>
+        <w:rPr>
+          <w:b/>
+          <w:bCs/>
+        </w:rPr>
+        <w:t xml:space="preserve">innings</w:t>
+      </w:r>
+      <w:r>
+        <w:t xml:space="preserve">, bat</w:t>
+      </w:r>
+      <w:r>
+        <w:t xml:space="preserve"> </w:t>
+      </w:r>
+      <w:r>
+        <w:rPr>
+          <w:b/>
+          <w:bCs/>
+        </w:rPr>
+        <w:t xml:space="preserve">or</w:t>
+      </w:r>
+      <w:r>
+        <w:t xml:space="preserve"> </w:t>
+      </w:r>
+      <w:r>
+        <w:t xml:space="preserve">bowl. Map tells you which. Not a full match per node.</w:t>
+      </w:r>
+    </w:p>
+    <w:p>
+      <w:pPr>
+        <w:pStyle w:val="Compact"/>
+        <w:numPr>
+          <w:ilvl w:val="0"/>
+          <w:numId w:val="1028"/>
+        </w:numPr>
+      </w:pPr>
+      <w:r>
+        <w:rPr>
+          <w:b/>
+          <w:bCs/>
+        </w:rPr>
+        <w:t xml:space="preserve">Saves:</w:t>
+      </w:r>
+      <w:r>
+        <w:t xml:space="preserve"> </w:t>
+      </w:r>
+      <w:r>
+        <w:rPr>
+          <w:b/>
+          <w:bCs/>
+        </w:rPr>
+        <w:t xml:space="preserve">silent autosave after every stage.</w:t>
+      </w:r>
+      <w:r>
+        <w:t xml:space="preserve"> </w:t>
+      </w:r>
+      <w:r>
+        <w:t xml:space="preserve">Resume the campaign forever. Death is local to the fight.</w:t>
+      </w:r>
+    </w:p>
+    <w:p>
+      <w:pPr>
+        <w:pStyle w:val="Compact"/>
+        <w:numPr>
+          <w:ilvl w:val="0"/>
+          <w:numId w:val="1028"/>
+        </w:numPr>
+      </w:pPr>
+      <w:r>
+        <w:rPr>
+          <w:b/>
+          <w:bCs/>
+        </w:rPr>
+        <w:t xml:space="preserve">Reverse-sweep:</w:t>
+      </w:r>
+      <w:r>
+        <w:t xml:space="preserve"> </w:t>
+      </w:r>
+      <w:r>
+        <w:t xml:space="preserve">a</w:t>
+      </w:r>
+      <w:r>
+        <w:t xml:space="preserve"> </w:t>
+      </w:r>
+      <w:r>
+        <w:rPr>
+          <w:b/>
+          <w:bCs/>
+        </w:rPr>
+        <w:t xml:space="preserve">meme</w:t>
+      </w:r>
+      <w:r>
+        <w:t xml:space="preserve"> </w:t>
+      </w:r>
+      <w:r>
+        <w:t xml:space="preserve">— funny vignette,</w:t>
+      </w:r>
+      <w:r>
+        <w:t xml:space="preserve"> </w:t>
+      </w:r>
+      <w:r>
+        <w:rPr>
+          <w:b/>
+          <w:bCs/>
+        </w:rPr>
+        <w:t xml:space="preserve">bad expected value</w:t>
+      </w:r>
+      <w:r>
+        <w:t xml:space="preserve">, people slam it anyway. Personality, not EV.</w:t>
+      </w:r>
+    </w:p>
+    <w:p>
+      <w:pPr>
+        <w:pStyle w:val="Compact"/>
+        <w:numPr>
+          <w:ilvl w:val="0"/>
+          <w:numId w:val="1028"/>
+        </w:numPr>
+      </w:pPr>
+      <w:r>
+        <w:rPr>
+          <w:b/>
+          <w:bCs/>
+        </w:rPr>
+        <w:t xml:space="preserve">Hands:</w:t>
+      </w:r>
+      <w:r>
+        <w:t xml:space="preserve"> </w:t>
+      </w:r>
+      <w:r>
+        <w:rPr>
+          <w:b/>
+          <w:bCs/>
+        </w:rPr>
+        <w:t xml:space="preserve">two piles</w:t>
+      </w:r>
+      <w:r>
+        <w:t xml:space="preserve"> </w:t>
+      </w:r>
+      <w:r>
+        <w:t xml:space="preserve">— Shot deck and Ball deck. Node picks which you draw from. (This is</w:t>
+      </w:r>
+      <w:r>
+        <w:t xml:space="preserve"> </w:t>
+      </w:r>
+      <w:r>
+        <w:rPr>
+          <w:i/>
+          <w:iCs/>
+        </w:rPr>
+        <w:t xml:space="preserve">not</w:t>
+      </w:r>
+      <w:r>
+        <w:t xml:space="preserve"> </w:t>
+      </w:r>
+      <w:r>
+        <w:t xml:space="preserve">a mixed hand; it is two games sharing relics/meta. Flagged in §16.)</w:t>
+      </w:r>
+    </w:p>
+    <w:p>
+      <w:pPr>
+        <w:pStyle w:val="Compact"/>
+        <w:numPr>
+          <w:ilvl w:val="0"/>
+          <w:numId w:val="1028"/>
+        </w:numPr>
+      </w:pPr>
+      <w:r>
+        <w:rPr>
+          <w:b/>
+          <w:bCs/>
+        </w:rPr>
+        <w:t xml:space="preserve">Enemy (stated):</w:t>
+      </w:r>
+      <w:r>
+        <w:t xml:space="preserve"> </w:t>
+      </w:r>
+      <w:r>
+        <w:rPr>
+          <w:b/>
+          <w:bCs/>
+        </w:rPr>
+        <w:t xml:space="preserve">one named bowler</w:t>
+      </w:r>
+      <w:r>
+        <w:t xml:space="preserve">, intent = next ball. Portrait-scale. Bowl-node opponent still unspecified.</w:t>
+      </w:r>
+    </w:p>
+    <w:p>
+      <w:pPr>
+        <w:pStyle w:val="Compact"/>
+        <w:numPr>
+          <w:ilvl w:val="0"/>
+          <w:numId w:val="1028"/>
+        </w:numPr>
+      </w:pPr>
+      <w:r>
+        <w:rPr>
+          <w:b/>
+          <w:bCs/>
+        </w:rPr>
+        <w:t xml:space="preserve">Format:</w:t>
+      </w:r>
+      <w:r>
+        <w:t xml:space="preserve"> </w:t>
+      </w:r>
+      <w:r>
+        <w:rPr>
+          <w:b/>
+          <w:bCs/>
+        </w:rPr>
+        <w:t xml:space="preserve">always T20-shaped.</w:t>
+      </w:r>
+      <w:r>
+        <w:t xml:space="preserve"> </w:t>
+      </w:r>
+      <w:r>
+        <w:t xml:space="preserve">International = nastier intents and better kits, not Test rules.</w:t>
+      </w:r>
+    </w:p>
+    <w:p>
+      <w:pPr>
+        <w:pStyle w:val="Compact"/>
+        <w:numPr>
+          <w:ilvl w:val="0"/>
+          <w:numId w:val="1028"/>
+        </w:numPr>
+      </w:pPr>
+      <w:r>
+        <w:rPr>
+          <w:b/>
+          <w:bCs/>
+        </w:rPr>
+        <w:t xml:space="preserve">All-rounder means map, not hand:</w:t>
+      </w:r>
+      <w:r>
+        <w:t xml:space="preserve"> </w:t>
+      </w:r>
+      <w:r>
+        <w:t xml:space="preserve">you take bat nodes</w:t>
+      </w:r>
+      <w:r>
+        <w:t xml:space="preserve"> </w:t>
+      </w:r>
+      <w:r>
+        <w:rPr>
+          <w:i/>
+          <w:iCs/>
+        </w:rPr>
+        <w:t xml:space="preserve">and</w:t>
+      </w:r>
+      <w:r>
+        <w:t xml:space="preserve"> </w:t>
+      </w:r>
+      <w:r>
+        <w:t xml:space="preserve">bowl nodes. Hands are never mixed. Relics/meta are the mix.</w:t>
+      </w:r>
+    </w:p>
+    <w:p>
+      <w:pPr>
+        <w:pStyle w:val="Compact"/>
+        <w:numPr>
+          <w:ilvl w:val="0"/>
+          <w:numId w:val="1028"/>
+        </w:numPr>
+      </w:pPr>
+      <w:r>
+        <w:rPr>
+          <w:b/>
+          <w:bCs/>
+        </w:rPr>
+        <w:t xml:space="preserve">Bowl node enemy:</w:t>
+      </w:r>
+      <w:r>
+        <w:t xml:space="preserve"> </w:t>
+      </w:r>
+      <w:r>
+        <w:rPr>
+          <w:b/>
+          <w:bCs/>
+        </w:rPr>
+        <w:t xml:space="preserve">named batter with an innings bar.</w:t>
+      </w:r>
+      <w:r>
+        <w:t xml:space="preserve"> </w:t>
+      </w:r>
+      <w:r>
+        <w:t xml:space="preserve">Symmetric engine.</w:t>
+      </w:r>
+    </w:p>
+    <w:p>
+      <w:pPr>
+        <w:pStyle w:val="Compact"/>
+        <w:numPr>
+          <w:ilvl w:val="0"/>
+          <w:numId w:val="1028"/>
+        </w:numPr>
+      </w:pPr>
+      <w:r>
+        <w:rPr>
+          <w:b/>
+          <w:bCs/>
+        </w:rPr>
+        <w:t xml:space="preserve">Fight length:</w:t>
+      </w:r>
+      <w:r>
+        <w:t xml:space="preserve"> </w:t>
+      </w:r>
+      <w:r>
+        <w:rPr>
+          <w:b/>
+          <w:bCs/>
+        </w:rPr>
+        <w:t xml:space="preserve">5–7 minutes.</w:t>
+      </w:r>
+      <w:r>
+        <w:t xml:space="preserve"> </w:t>
+      </w:r>
+      <w:r>
+        <w:t xml:space="preserve">Cut the fight if longer.</w:t>
       </w:r>
     </w:p>
     <w:bookmarkEnd w:id="60"/>
@@ -8596,21 +9038,103 @@
         <w:pStyle w:val="Compact"/>
         <w:numPr>
           <w:ilvl w:val="0"/>
-          <w:numId w:val="1028"/>
-        </w:numPr>
-      </w:pPr>
-      <w:r>
-        <w:rPr>
-          <w:b/>
-          <w:bCs/>
-        </w:rPr>
-        <w:t xml:space="preserve">All-rounder, in a single node:</w:t>
-      </w:r>
-      <w:r>
-        <w:t xml:space="preserve"> </w:t>
-      </w:r>
-      <w:r>
-        <w:t xml:space="preserve">is a map fight one innings (bat</w:t>
+          <w:numId w:val="1029"/>
+        </w:numPr>
+      </w:pPr>
+      <w:r>
+        <w:rPr>
+          <w:b/>
+          <w:bCs/>
+        </w:rPr>
+        <w:t xml:space="preserve">Street kid body:</w:t>
+      </w:r>
+      <w:r>
+        <w:t xml:space="preserve"> </w:t>
+      </w:r>
+      <w:r>
+        <w:t xml:space="preserve">boy / girl / pick-at-start / unstated.</w:t>
+      </w:r>
+    </w:p>
+    <w:p>
+      <w:pPr>
+        <w:pStyle w:val="Compact"/>
+        <w:numPr>
+          <w:ilvl w:val="0"/>
+          <w:numId w:val="1029"/>
+        </w:numPr>
+      </w:pPr>
+      <w:r>
+        <w:rPr>
+          <w:b/>
+          <w:bCs/>
+        </w:rPr>
+        <w:t xml:space="preserve">How Pune-specific is the gully?</w:t>
+      </w:r>
+    </w:p>
+    <w:p>
+      <w:pPr>
+        <w:pStyle w:val="Compact"/>
+        <w:numPr>
+          <w:ilvl w:val="0"/>
+          <w:numId w:val="1029"/>
+        </w:numPr>
+      </w:pPr>
+      <w:r>
+        <w:rPr>
+          <w:b/>
+          <w:bCs/>
+        </w:rPr>
+        <w:t xml:space="preserve">Company:</w:t>
+      </w:r>
+      <w:r>
+        <w:t xml:space="preserve"> </w:t>
+      </w:r>
+      <w:r>
+        <w:t xml:space="preserve">personal Play account vs Pvt Ltd.</w:t>
+      </w:r>
+    </w:p>
+    <w:p>
+      <w:pPr>
+        <w:pStyle w:val="Compact"/>
+        <w:numPr>
+          <w:ilvl w:val="0"/>
+          <w:numId w:val="1029"/>
+        </w:numPr>
+      </w:pPr>
+      <w:r>
+        <w:rPr>
+          <w:b/>
+          <w:bCs/>
+        </w:rPr>
+        <w:t xml:space="preserve">Energy gate (Shadow Fight did this):</w:t>
+      </w:r>
+      <w:r>
+        <w:t xml:space="preserve"> </w:t>
+      </w:r>
+      <w:r>
+        <w:t xml:space="preserve">do stages cost “match tickets / stamina,” or can you retry forever for free?</w:t>
+      </w:r>
+    </w:p>
+    <w:p>
+      <w:pPr>
+        <w:pStyle w:val="Compact"/>
+        <w:numPr>
+          <w:ilvl w:val="0"/>
+          <w:numId w:val="1029"/>
+        </w:numPr>
+      </w:pPr>
+      <w:r>
+        <w:rPr>
+          <w:b/>
+          <w:bCs/>
+        </w:rPr>
+        <w:t xml:space="preserve">Deckbuilding without gacha:</w:t>
+      </w:r>
+      <w:r>
+        <w:t xml:space="preserve"> </w:t>
+      </w:r>
+      <w:r>
+        <w:t xml:space="preserve">after each stage, choose 1 of 3 cards (deterministic). OK, or do you want a collection book that still</w:t>
       </w:r>
       <w:r>
         <w:t xml:space="preserve"> </w:t>
@@ -8620,145 +9144,13 @@
           <w:i/>
           <w:iCs/>
         </w:rPr>
-        <w:t xml:space="preserve">or</w:t>
-      </w:r>
-      <w:r>
-        <w:t xml:space="preserve"> </w:t>
-      </w:r>
-      <w:r>
-        <w:t xml:space="preserve">bowl) or a whole match (both)?</w:t>
-      </w:r>
-    </w:p>
-    <w:p>
-      <w:pPr>
-        <w:pStyle w:val="Compact"/>
-        <w:numPr>
-          <w:ilvl w:val="0"/>
-          <w:numId w:val="1028"/>
-        </w:numPr>
-      </w:pPr>
-      <w:r>
-        <w:rPr>
-          <w:b/>
-          <w:bCs/>
-        </w:rPr>
-        <w:t xml:space="preserve">Long run vs bus:</w:t>
-      </w:r>
-      <w:r>
-        <w:t xml:space="preserve"> </w:t>
-      </w:r>
-      <w:r>
-        <w:t xml:space="preserve">45–90 min career with no mid-run save will lose Android users to process death. Ironman, or checkpoints between acts?</w:t>
-      </w:r>
-    </w:p>
-    <w:p>
-      <w:pPr>
-        <w:pStyle w:val="Compact"/>
-        <w:numPr>
-          <w:ilvl w:val="0"/>
-          <w:numId w:val="1028"/>
-        </w:numPr>
-      </w:pPr>
-      <w:r>
-        <w:rPr>
-          <w:b/>
-          <w:bCs/>
-        </w:rPr>
-        <w:t xml:space="preserve">Mixed cards physically:</w:t>
-      </w:r>
-      <w:r>
-        <w:t xml:space="preserve"> </w:t>
-      </w:r>
-      <w:r>
-        <w:t xml:space="preserve">dual-faced (bat/bowl on one card), two draw piles, or “skill” cards that work in both innings?</w:t>
-      </w:r>
-    </w:p>
-    <w:p>
-      <w:pPr>
-        <w:pStyle w:val="Compact"/>
-        <w:numPr>
-          <w:ilvl w:val="0"/>
-          <w:numId w:val="1028"/>
-        </w:numPr>
-      </w:pPr>
-      <w:r>
-        <w:rPr>
-          <w:b/>
-          <w:bCs/>
-        </w:rPr>
-        <w:t xml:space="preserve">Combat length:</w:t>
-      </w:r>
-      <w:r>
-        <w:t xml:space="preserve"> </w:t>
-      </w:r>
-      <w:r>
-        <w:t xml:space="preserve">6-minute street fights vs 12-minute “proper T20 overs.”</w:t>
-      </w:r>
-    </w:p>
-    <w:p>
-      <w:pPr>
-        <w:pStyle w:val="Compact"/>
-        <w:numPr>
-          <w:ilvl w:val="0"/>
-          <w:numId w:val="1028"/>
-        </w:numPr>
-      </w:pPr>
-      <w:r>
-        <w:rPr>
-          <w:b/>
-          <w:bCs/>
-        </w:rPr>
-        <w:t xml:space="preserve">How Pune-specific is the gully?</w:t>
-      </w:r>
-      <w:r>
-        <w:t xml:space="preserve"> </w:t>
-      </w:r>
-      <w:r>
-        <w:t xml:space="preserve">Named chowks vs generic Indian street.</w:t>
-      </w:r>
-    </w:p>
-    <w:p>
-      <w:pPr>
-        <w:pStyle w:val="Compact"/>
-        <w:numPr>
-          <w:ilvl w:val="0"/>
-          <w:numId w:val="1028"/>
-        </w:numPr>
-      </w:pPr>
-      <w:r>
-        <w:rPr>
-          <w:b/>
-          <w:bCs/>
-        </w:rPr>
-        <w:t xml:space="preserve">Player body:</w:t>
-      </w:r>
-      <w:r>
-        <w:t xml:space="preserve"> </w:t>
-      </w:r>
-      <w:r>
-        <w:t xml:space="preserve">boy / girl / pick-at-start / unstated.</w:t>
-      </w:r>
-    </w:p>
-    <w:p>
-      <w:pPr>
-        <w:pStyle w:val="Compact"/>
-        <w:numPr>
-          <w:ilvl w:val="0"/>
-          <w:numId w:val="1028"/>
-        </w:numPr>
-      </w:pPr>
-      <w:r>
-        <w:rPr>
-          <w:b/>
-          <w:bCs/>
-        </w:rPr>
-        <w:t xml:space="preserve">Company:</w:t>
-      </w:r>
-      <w:r>
-        <w:t xml:space="preserve"> </w:t>
-      </w:r>
-      <w:r>
-        <w:t xml:space="preserve">personal Play account (12 testers per app) vs Pvt Ltd org account.</w:t>
+        <w:t xml:space="preserve">looks</w:t>
+      </w:r>
+      <w:r>
+        <w:t xml:space="preserve"> </w:t>
+      </w:r>
+      <w:r>
+        <w:t xml:space="preserve">like opening packs (cosmetic only)?</w:t>
       </w:r>
     </w:p>
     <w:p>
@@ -8783,7 +9175,7 @@
         <w:pStyle w:val="Compact"/>
         <w:numPr>
           <w:ilvl w:val="0"/>
-          <w:numId w:val="1029"/>
+          <w:numId w:val="1030"/>
         </w:numPr>
       </w:pPr>
       <w:r>
@@ -8795,7 +9187,7 @@
         <w:pStyle w:val="Compact"/>
         <w:numPr>
           <w:ilvl w:val="0"/>
-          <w:numId w:val="1029"/>
+          <w:numId w:val="1030"/>
         </w:numPr>
       </w:pPr>
       <w:r>
@@ -8807,7 +9199,7 @@
         <w:pStyle w:val="Compact"/>
         <w:numPr>
           <w:ilvl w:val="0"/>
-          <w:numId w:val="1029"/>
+          <w:numId w:val="1030"/>
         </w:numPr>
       </w:pPr>
       <w:r>
@@ -8819,7 +9211,7 @@
         <w:pStyle w:val="Compact"/>
         <w:numPr>
           <w:ilvl w:val="0"/>
-          <w:numId w:val="1029"/>
+          <w:numId w:val="1030"/>
         </w:numPr>
       </w:pPr>
       <w:r>
@@ -8831,7 +9223,7 @@
         <w:pStyle w:val="Compact"/>
         <w:numPr>
           <w:ilvl w:val="0"/>
-          <w:numId w:val="1029"/>
+          <w:numId w:val="1030"/>
         </w:numPr>
       </w:pPr>
       <w:r>
@@ -8843,7 +9235,7 @@
         <w:pStyle w:val="Compact"/>
         <w:numPr>
           <w:ilvl w:val="0"/>
-          <w:numId w:val="1029"/>
+          <w:numId w:val="1030"/>
         </w:numPr>
       </w:pPr>
       <w:r>
@@ -8855,7 +9247,7 @@
         <w:pStyle w:val="Compact"/>
         <w:numPr>
           <w:ilvl w:val="0"/>
-          <w:numId w:val="1029"/>
+          <w:numId w:val="1030"/>
         </w:numPr>
       </w:pPr>
       <w:r>
@@ -8867,7 +9259,7 @@
         <w:pStyle w:val="Compact"/>
         <w:numPr>
           <w:ilvl w:val="0"/>
-          <w:numId w:val="1029"/>
+          <w:numId w:val="1030"/>
         </w:numPr>
       </w:pPr>
       <w:r>
@@ -8879,7 +9271,7 @@
         <w:pStyle w:val="Compact"/>
         <w:numPr>
           <w:ilvl w:val="0"/>
-          <w:numId w:val="1029"/>
+          <w:numId w:val="1030"/>
         </w:numPr>
       </w:pPr>
       <w:r>
@@ -8891,7 +9283,7 @@
         <w:pStyle w:val="Compact"/>
         <w:numPr>
           <w:ilvl w:val="0"/>
-          <w:numId w:val="1029"/>
+          <w:numId w:val="1030"/>
         </w:numPr>
       </w:pPr>
       <w:r>
@@ -8903,7 +9295,7 @@
         <w:pStyle w:val="Compact"/>
         <w:numPr>
           <w:ilvl w:val="0"/>
-          <w:numId w:val="1029"/>
+          <w:numId w:val="1030"/>
         </w:numPr>
       </w:pPr>
       <w:r>
@@ -8915,7 +9307,7 @@
         <w:pStyle w:val="Compact"/>
         <w:numPr>
           <w:ilvl w:val="0"/>
-          <w:numId w:val="1029"/>
+          <w:numId w:val="1030"/>
         </w:numPr>
       </w:pPr>
       <w:r>
@@ -8927,7 +9319,7 @@
         <w:pStyle w:val="Compact"/>
         <w:numPr>
           <w:ilvl w:val="0"/>
-          <w:numId w:val="1029"/>
+          <w:numId w:val="1030"/>
         </w:numPr>
       </w:pPr>
       <w:r>
@@ -8939,7 +9331,7 @@
         <w:pStyle w:val="Compact"/>
         <w:numPr>
           <w:ilvl w:val="0"/>
-          <w:numId w:val="1029"/>
+          <w:numId w:val="1030"/>
         </w:numPr>
       </w:pPr>
       <w:r>
@@ -8951,7 +9343,7 @@
         <w:pStyle w:val="Compact"/>
         <w:numPr>
           <w:ilvl w:val="0"/>
-          <w:numId w:val="1029"/>
+          <w:numId w:val="1030"/>
         </w:numPr>
       </w:pPr>
       <w:r>
@@ -8963,7 +9355,7 @@
         <w:pStyle w:val="Compact"/>
         <w:numPr>
           <w:ilvl w:val="0"/>
-          <w:numId w:val="1029"/>
+          <w:numId w:val="1030"/>
         </w:numPr>
       </w:pPr>
       <w:r>
@@ -9416,34 +9808,7 @@
     <w:abstractNumId w:val="991"/>
   </w:num>
   <w:num w:numId="1026">
-    <w:abstractNumId w:val="99411"/>
-    <w:lvlOverride w:ilvl="0">
-      <w:startOverride w:val="1"/>
-    </w:lvlOverride>
-    <w:lvlOverride w:ilvl="1">
-      <w:startOverride w:val="1"/>
-    </w:lvlOverride>
-    <w:lvlOverride w:ilvl="2">
-      <w:startOverride w:val="1"/>
-    </w:lvlOverride>
-    <w:lvlOverride w:ilvl="3">
-      <w:startOverride w:val="1"/>
-    </w:lvlOverride>
-    <w:lvlOverride w:ilvl="4">
-      <w:startOverride w:val="1"/>
-    </w:lvlOverride>
-    <w:lvlOverride w:ilvl="5">
-      <w:startOverride w:val="1"/>
-    </w:lvlOverride>
-    <w:lvlOverride w:ilvl="6">
-      <w:startOverride w:val="1"/>
-    </w:lvlOverride>
-    <w:lvlOverride w:ilvl="7">
-      <w:startOverride w:val="1"/>
-    </w:lvlOverride>
-    <w:lvlOverride w:ilvl="8">
-      <w:startOverride w:val="1"/>
-    </w:lvlOverride>
+    <w:abstractNumId w:val="991"/>
   </w:num>
   <w:num w:numId="1027">
     <w:abstractNumId w:val="99411"/>
@@ -9506,6 +9871,36 @@
     </w:lvlOverride>
   </w:num>
   <w:num w:numId="1029">
+    <w:abstractNumId w:val="99411"/>
+    <w:lvlOverride w:ilvl="0">
+      <w:startOverride w:val="1"/>
+    </w:lvlOverride>
+    <w:lvlOverride w:ilvl="1">
+      <w:startOverride w:val="1"/>
+    </w:lvlOverride>
+    <w:lvlOverride w:ilvl="2">
+      <w:startOverride w:val="1"/>
+    </w:lvlOverride>
+    <w:lvlOverride w:ilvl="3">
+      <w:startOverride w:val="1"/>
+    </w:lvlOverride>
+    <w:lvlOverride w:ilvl="4">
+      <w:startOverride w:val="1"/>
+    </w:lvlOverride>
+    <w:lvlOverride w:ilvl="5">
+      <w:startOverride w:val="1"/>
+    </w:lvlOverride>
+    <w:lvlOverride w:ilvl="6">
+      <w:startOverride w:val="1"/>
+    </w:lvlOverride>
+    <w:lvlOverride w:ilvl="7">
+      <w:startOverride w:val="1"/>
+    </w:lvlOverride>
+    <w:lvlOverride w:ilvl="8">
+      <w:startOverride w:val="1"/>
+    </w:lvlOverride>
+  </w:num>
+  <w:num w:numId="1030">
     <w:abstractNumId w:val="991"/>
   </w:num>
 </w:numbering>

</xml_diff>

<commit_message>
Lock act campaign economy: soft energy and story-early packs.
Five daily tickets, ad or wait refill, story never paywalled. Packs can roll power cards that the campaign also grants later; pity is mandatory.
</commit_message>
<xml_diff>
--- a/SwitchedHit_Roguelite_Plan.docx
+++ b/SwitchedHit_Roguelite_Plan.docx
@@ -9023,6 +9023,198 @@
         <w:t xml:space="preserve">Cut the fight if longer.</w:t>
       </w:r>
     </w:p>
+    <w:p>
+      <w:pPr>
+        <w:pStyle w:val="Compact"/>
+        <w:numPr>
+          <w:ilvl w:val="0"/>
+          <w:numId w:val="1028"/>
+        </w:numPr>
+      </w:pPr>
+      <w:r>
+        <w:rPr>
+          <w:b/>
+          <w:bCs/>
+        </w:rPr>
+        <w:t xml:space="preserve">Spine:</w:t>
+      </w:r>
+      <w:r>
+        <w:t xml:space="preserve"> </w:t>
+      </w:r>
+      <w:r>
+        <w:rPr>
+          <w:b/>
+          <w:bCs/>
+        </w:rPr>
+        <w:t xml:space="preserve">Shadow Fight–style acts</w:t>
+      </w:r>
+      <w:r>
+        <w:t xml:space="preserve">, not a permadeath roguelite. One stage at a time. Indian-digestible.</w:t>
+      </w:r>
+    </w:p>
+    <w:p>
+      <w:pPr>
+        <w:pStyle w:val="Compact"/>
+        <w:numPr>
+          <w:ilvl w:val="0"/>
+          <w:numId w:val="1028"/>
+        </w:numPr>
+      </w:pPr>
+      <w:r>
+        <w:rPr>
+          <w:b/>
+          <w:bCs/>
+        </w:rPr>
+        <w:t xml:space="preserve">Energy:</w:t>
+      </w:r>
+      <w:r>
+        <w:t xml:space="preserve"> </w:t>
+      </w:r>
+      <w:r>
+        <w:rPr>
+          <w:b/>
+          <w:bCs/>
+        </w:rPr>
+        <w:t xml:space="preserve">soft.</w:t>
+      </w:r>
+      <w:r>
+        <w:t xml:space="preserve"> </w:t>
+      </w:r>
+      <w:r>
+        <w:t xml:space="preserve">5 match tickets / day. Refill with</w:t>
+      </w:r>
+      <w:r>
+        <w:t xml:space="preserve"> </w:t>
+      </w:r>
+      <w:r>
+        <w:rPr>
+          <w:b/>
+          <w:bCs/>
+        </w:rPr>
+        <w:t xml:space="preserve">ad or wait</w:t>
+      </w:r>
+      <w:r>
+        <w:t xml:space="preserve">.</w:t>
+      </w:r>
+      <w:r>
+        <w:t xml:space="preserve"> </w:t>
+      </w:r>
+      <w:r>
+        <w:rPr>
+          <w:b/>
+          <w:bCs/>
+        </w:rPr>
+        <w:t xml:space="preserve">Never paywall the story</w:t>
+      </w:r>
+      <w:r>
+        <w:t xml:space="preserve"> </w:t>
+      </w:r>
+      <w:r>
+        <w:t xml:space="preserve">— you can always progress, slowly.</w:t>
+      </w:r>
+    </w:p>
+    <w:p>
+      <w:pPr>
+        <w:pStyle w:val="Compact"/>
+        <w:numPr>
+          <w:ilvl w:val="0"/>
+          <w:numId w:val="1028"/>
+        </w:numPr>
+      </w:pPr>
+      <w:r>
+        <w:rPr>
+          <w:b/>
+          <w:bCs/>
+        </w:rPr>
+        <w:t xml:space="preserve">Economy:</w:t>
+      </w:r>
+      <w:r>
+        <w:t xml:space="preserve"> </w:t>
+      </w:r>
+      <w:r>
+        <w:t xml:space="preserve">power cards are</w:t>
+      </w:r>
+      <w:r>
+        <w:t xml:space="preserve"> </w:t>
+      </w:r>
+      <w:r>
+        <w:rPr>
+          <w:b/>
+          <w:bCs/>
+        </w:rPr>
+        <w:t xml:space="preserve">story</w:t>
+      </w:r>
+      <w:r>
+        <w:t xml:space="preserve">. Grind (dailies, challenges) →</w:t>
+      </w:r>
+      <w:r>
+        <w:t xml:space="preserve"> </w:t>
+      </w:r>
+      <w:r>
+        <w:rPr>
+          <w:b/>
+          <w:bCs/>
+        </w:rPr>
+        <w:t xml:space="preserve">coins → packs</w:t>
+      </w:r>
+      <w:r>
+        <w:t xml:space="preserve">. F2P can finish; it just takes time (more ad inventory).</w:t>
+      </w:r>
+    </w:p>
+    <w:p>
+      <w:pPr>
+        <w:pStyle w:val="Compact"/>
+        <w:numPr>
+          <w:ilvl w:val="0"/>
+          <w:numId w:val="1028"/>
+        </w:numPr>
+      </w:pPr>
+      <w:r>
+        <w:rPr>
+          <w:b/>
+          <w:bCs/>
+        </w:rPr>
+        <w:t xml:space="preserve">Packs:</w:t>
+      </w:r>
+      <w:r>
+        <w:t xml:space="preserve"> </w:t>
+      </w:r>
+      <w:r>
+        <w:t xml:space="preserve">chance at a</w:t>
+      </w:r>
+      <w:r>
+        <w:t xml:space="preserve"> </w:t>
+      </w:r>
+      <w:r>
+        <w:rPr>
+          <w:b/>
+          <w:bCs/>
+        </w:rPr>
+        <w:t xml:space="preserve">new power card you would also earn later in the story</w:t>
+      </w:r>
+      <w:r>
+        <w:t xml:space="preserve"> </w:t>
+      </w:r>
+      <w:r>
+        <w:t xml:space="preserve">(early, not exclusive).</w:t>
+      </w:r>
+      <w:r>
+        <w:t xml:space="preserve"> </w:t>
+      </w:r>
+      <w:r>
+        <w:rPr>
+          <w:b/>
+          <w:bCs/>
+        </w:rPr>
+        <w:t xml:space="preserve">Pity</w:t>
+      </w:r>
+      <w:r>
+        <w:t xml:space="preserve"> </w:t>
+      </w:r>
+      <w:r>
+        <w:t xml:space="preserve">required. Story remains a complete path. This is the gacha-adjacent line — keep it documented and tight.</w:t>
+      </w:r>
+    </w:p>
     <w:bookmarkEnd w:id="60"/>
     <w:bookmarkStart w:id="61" w:name="open-questions-need-you"/>
     <w:p>
@@ -9106,13 +9298,13 @@
           <w:b/>
           <w:bCs/>
         </w:rPr>
-        <w:t xml:space="preserve">Energy gate (Shadow Fight did this):</w:t>
-      </w:r>
-      <w:r>
-        <w:t xml:space="preserve"> </w:t>
-      </w:r>
-      <w:r>
-        <w:t xml:space="preserve">do stages cost “match tickets / stamina,” or can you retry forever for free?</w:t>
+        <w:t xml:space="preserve">Pity numbers</w:t>
+      </w:r>
+      <w:r>
+        <w:t xml:space="preserve"> </w:t>
+      </w:r>
+      <w:r>
+        <w:t xml:space="preserve">for story-early pack drops (e.g. guaranteed in N packs / cannot duplicate until the set is complete).</w:t>
       </w:r>
     </w:p>
     <w:p>
@@ -9128,29 +9320,51 @@
           <w:b/>
           <w:bCs/>
         </w:rPr>
-        <w:t xml:space="preserve">Deckbuilding without gacha:</w:t>
-      </w:r>
-      <w:r>
-        <w:t xml:space="preserve"> </w:t>
-      </w:r>
-      <w:r>
-        <w:t xml:space="preserve">after each stage, choose 1 of 3 cards (deterministic). OK, or do you want a collection book that still</w:t>
-      </w:r>
-      <w:r>
-        <w:t xml:space="preserve"> </w:t>
-      </w:r>
-      <w:r>
-        <w:rPr>
-          <w:i/>
-          <w:iCs/>
-        </w:rPr>
-        <w:t xml:space="preserve">looks</w:t>
-      </w:r>
-      <w:r>
-        <w:t xml:space="preserve"> </w:t>
-      </w:r>
-      <w:r>
-        <w:t xml:space="preserve">like opening packs (cosmetic only)?</w:t>
+        <w:t xml:space="preserve">Street kid body:</w:t>
+      </w:r>
+      <w:r>
+        <w:t xml:space="preserve"> </w:t>
+      </w:r>
+      <w:r>
+        <w:t xml:space="preserve">boy / girl / pick-at-start / unstated.</w:t>
+      </w:r>
+    </w:p>
+    <w:p>
+      <w:pPr>
+        <w:pStyle w:val="Compact"/>
+        <w:numPr>
+          <w:ilvl w:val="0"/>
+          <w:numId w:val="1029"/>
+        </w:numPr>
+      </w:pPr>
+      <w:r>
+        <w:rPr>
+          <w:b/>
+          <w:bCs/>
+        </w:rPr>
+        <w:t xml:space="preserve">How Pune-specific is the gully?</w:t>
+      </w:r>
+    </w:p>
+    <w:p>
+      <w:pPr>
+        <w:pStyle w:val="Compact"/>
+        <w:numPr>
+          <w:ilvl w:val="0"/>
+          <w:numId w:val="1029"/>
+        </w:numPr>
+      </w:pPr>
+      <w:r>
+        <w:rPr>
+          <w:b/>
+          <w:bCs/>
+        </w:rPr>
+        <w:t xml:space="preserve">Company:</w:t>
+      </w:r>
+      <w:r>
+        <w:t xml:space="preserve"> </w:t>
+      </w:r>
+      <w:r>
+        <w:t xml:space="preserve">personal Play account vs Pvt Ltd.</w:t>
       </w:r>
     </w:p>
     <w:p>

</xml_diff>

<commit_message>
Add India vs West monetization ratings and 10/10 path.
Score typical cricket F2P vs our plan. Dual-market 10/10 is battle pass, cosmetics, published odds, craftable cards, soft energy, and ads that never sit mid-over.
</commit_message>
<xml_diff>
--- a/SwitchedHit_Roguelite_Plan.docx
+++ b/SwitchedHit_Roguelite_Plan.docx
@@ -2,7 +2,7 @@
 <file path=word/document.xml><?xml version="1.0" encoding="utf-8"?>
 <w:document xmlns:w="http://schemas.openxmlformats.org/wordprocessingml/2006/main" xmlns:m="http://schemas.openxmlformats.org/officeDocument/2006/math" xmlns:r="http://schemas.openxmlformats.org/officeDocument/2006/relationships" xmlns:o="urn:schemas-microsoft-com:office:office" xmlns:v="urn:schemas-microsoft-com:vml" xmlns:w10="urn:schemas-microsoft-com:office:word" xmlns:a="http://schemas.openxmlformats.org/drawingml/2006/main" xmlns:pic="http://schemas.openxmlformats.org/drawingml/2006/picture" xmlns:wp="http://schemas.openxmlformats.org/drawingml/2006/wordprocessingDrawing">
   <w:body>
-    <w:bookmarkStart w:id="63" w:name="switchedhit"/>
+    <w:bookmarkStart w:id="64" w:name="switchedhit"/>
     <w:p>
       <w:pPr>
         <w:pStyle w:val="Heading1"/>
@@ -7357,22 +7357,13 @@
     </w:p>
     <w:bookmarkEnd w:id="48"/>
     <w:bookmarkEnd w:id="49"/>
-    <w:bookmarkStart w:id="55" w:name="build-plan-what-to-make-in-order"/>
+    <w:bookmarkStart w:id="50" w:name="X6aa8b93b117ffc1ae25350cc88761d43712c1c6"/>
     <w:p>
       <w:pPr>
         <w:pStyle w:val="Heading2"/>
       </w:pPr>
       <w:r>
-        <w:t xml:space="preserve">10. Build plan (what to make, in order)</w:t>
-      </w:r>
-    </w:p>
-    <w:bookmarkStart w:id="50" w:name="vertical-slice-46-weeks-kill-or-continue"/>
-    <w:p>
-      <w:pPr>
-        <w:pStyle w:val="Heading3"/>
-      </w:pPr>
-      <w:r>
-        <w:t xml:space="preserve">10.1 Vertical slice (4–6 weeks) — kill or continue</w:t>
+        <w:t xml:space="preserve">9.8 India-ok vs West-fair: ratings and the path to 10/10</w:t>
       </w:r>
     </w:p>
     <w:p>
@@ -7380,7 +7371,19 @@
         <w:pStyle w:val="FirstParagraph"/>
       </w:pPr>
       <w:r>
-        <w:t xml:space="preserve">Must be fun on a mid-range Android without accounts:</w:t>
+        <w:t xml:space="preserve">Research snapshot (Sep 2025–Mar 2026). Figures are industry reports, not our forecasts.</w:t>
+      </w:r>
+    </w:p>
+    <w:p>
+      <w:pPr>
+        <w:pStyle w:val="BodyText"/>
+      </w:pPr>
+      <w:r>
+        <w:rPr>
+          <w:b/>
+          <w:bCs/>
+        </w:rPr>
+        <w:t xml:space="preserve">What Indian players actually tolerate / buy</w:t>
       </w:r>
     </w:p>
     <w:p>
@@ -7392,7 +7395,7 @@
         </w:numPr>
       </w:pPr>
       <w:r>
-        <w:t xml:space="preserve">1 archetype (Dasher)</w:t>
+        <w:t xml:space="preserve">India is volume, not ARPU: ~$3 ARPU vs ~$215 US (Lightbox / Economic Times 2025–26). Downloads are huge; paying is a minority, but that minority is growing.</w:t>
       </w:r>
     </w:p>
     <w:p>
@@ -7404,7 +7407,68 @@
         </w:numPr>
       </w:pPr>
       <w:r>
-        <w:t xml:space="preserve">18 cards, 8 relics, 4 enemies, 1 boss</w:t>
+        <w:t xml:space="preserve">Lightbox × Rooter:</w:t>
+      </w:r>
+      <w:r>
+        <w:t xml:space="preserve"> </w:t>
+      </w:r>
+      <w:r>
+        <w:rPr>
+          <w:b/>
+          <w:bCs/>
+        </w:rPr>
+        <w:t xml:space="preserve">74.9%</w:t>
+      </w:r>
+      <w:r>
+        <w:t xml:space="preserve"> </w:t>
+      </w:r>
+      <w:r>
+        <w:t xml:space="preserve">of surveyed gamers already spend on</w:t>
+      </w:r>
+      <w:r>
+        <w:t xml:space="preserve"> </w:t>
+      </w:r>
+      <w:r>
+        <w:rPr>
+          <w:i/>
+          <w:iCs/>
+        </w:rPr>
+        <w:t xml:space="preserve">non-RMG</w:t>
+      </w:r>
+      <w:r>
+        <w:t xml:space="preserve"> </w:t>
+      </w:r>
+      <w:r>
+        <w:t xml:space="preserve">IAP;</w:t>
+      </w:r>
+      <w:r>
+        <w:t xml:space="preserve"> </w:t>
+      </w:r>
+      <w:r>
+        <w:rPr>
+          <w:b/>
+          <w:bCs/>
+        </w:rPr>
+        <w:t xml:space="preserve">31.2%</w:t>
+      </w:r>
+      <w:r>
+        <w:t xml:space="preserve"> </w:t>
+      </w:r>
+      <w:r>
+        <w:t xml:space="preserve">spend ₹1,000+/month; spend mix</w:t>
+      </w:r>
+      <w:r>
+        <w:t xml:space="preserve"> </w:t>
+      </w:r>
+      <w:r>
+        <w:rPr>
+          <w:b/>
+          <w:bCs/>
+        </w:rPr>
+        <w:t xml:space="preserve">battle passes 40% / cosmetics 37% / unlockable content 23%</w:t>
+      </w:r>
+      <w:r>
+        <w:t xml:space="preserve">.</w:t>
       </w:r>
     </w:p>
     <w:p>
@@ -7416,7 +7480,33 @@
         </w:numPr>
       </w:pPr>
       <w:r>
-        <w:t xml:space="preserve">Gully act map (2–3 stages, retry on loss)</w:t>
+        <w:rPr>
+          <w:b/>
+          <w:bCs/>
+        </w:rPr>
+        <w:t xml:space="preserve">12%</w:t>
+      </w:r>
+      <w:r>
+        <w:t xml:space="preserve"> </w:t>
+      </w:r>
+      <w:r>
+        <w:t xml:space="preserve">call in-game ads annoying;</w:t>
+      </w:r>
+      <w:r>
+        <w:t xml:space="preserve"> </w:t>
+      </w:r>
+      <w:r>
+        <w:rPr>
+          <w:b/>
+          <w:bCs/>
+        </w:rPr>
+        <w:t xml:space="preserve">38% would quit if ad load is excessive</w:t>
+      </w:r>
+      <w:r>
+        <w:t xml:space="preserve"> </w:t>
+      </w:r>
+      <w:r>
+        <w:t xml:space="preserve">— hybrid ads+IAP is required, ad spam is not.</w:t>
       </w:r>
     </w:p>
     <w:p>
@@ -7428,7 +7518,94 @@
         </w:numPr>
       </w:pPr>
       <w:r>
-        <w:t xml:space="preserve">Flame vignette for 4 shot types</w:t>
+        <w:t xml:space="preserve">BW Disrupt (Nov 2025):</w:t>
+      </w:r>
+      <w:r>
+        <w:t xml:space="preserve"> </w:t>
+      </w:r>
+      <w:r>
+        <w:rPr>
+          <w:b/>
+          <w:bCs/>
+        </w:rPr>
+        <w:t xml:space="preserve">~33%</w:t>
+      </w:r>
+      <w:r>
+        <w:t xml:space="preserve"> </w:t>
+      </w:r>
+      <w:r>
+        <w:t xml:space="preserve">report making purchases;</w:t>
+      </w:r>
+      <w:r>
+        <w:t xml:space="preserve"> </w:t>
+      </w:r>
+      <w:r>
+        <w:rPr>
+          <w:b/>
+          <w:bCs/>
+        </w:rPr>
+        <w:t xml:space="preserve">mid-core takes ~50% of spend</w:t>
+      </w:r>
+      <w:r>
+        <w:t xml:space="preserve">; people pay for</w:t>
+      </w:r>
+      <w:r>
+        <w:t xml:space="preserve"> </w:t>
+      </w:r>
+      <w:r>
+        <w:rPr>
+          <w:b/>
+          <w:bCs/>
+        </w:rPr>
+        <w:t xml:space="preserve">cosmetics and power-ups</w:t>
+      </w:r>
+      <w:r>
+        <w:t xml:space="preserve">, not gambling.</w:t>
+      </w:r>
+      <w:r>
+        <w:t xml:space="preserve"> </w:t>
+      </w:r>
+      <w:r>
+        <w:rPr>
+          <w:b/>
+          <w:bCs/>
+        </w:rPr>
+        <w:t xml:space="preserve">UPI ~80%</w:t>
+      </w:r>
+      <w:r>
+        <w:t xml:space="preserve"> </w:t>
+      </w:r>
+      <w:r>
+        <w:t xml:space="preserve">of gaming payments;</w:t>
+      </w:r>
+      <w:r>
+        <w:t xml:space="preserve"> </w:t>
+      </w:r>
+      <w:r>
+        <w:rPr>
+          <w:b/>
+          <w:bCs/>
+        </w:rPr>
+        <w:t xml:space="preserve">54%</w:t>
+      </w:r>
+      <w:r>
+        <w:t xml:space="preserve"> </w:t>
+      </w:r>
+      <w:r>
+        <w:t xml:space="preserve">of payers convert in the</w:t>
+      </w:r>
+      <w:r>
+        <w:t xml:space="preserve"> </w:t>
+      </w:r>
+      <w:r>
+        <w:rPr>
+          <w:b/>
+          <w:bCs/>
+        </w:rPr>
+        <w:t xml:space="preserve">first week</w:t>
+      </w:r>
+      <w:r>
+        <w:t xml:space="preserve">.</w:t>
       </w:r>
     </w:p>
     <w:p>
@@ -7440,7 +7617,36 @@
         </w:numPr>
       </w:pPr>
       <w:r>
-        <w:t xml:space="preserve">Local save</w:t>
+        <w:t xml:space="preserve">Hitwicket / Krafton commentary: Gen Z spend is</w:t>
+      </w:r>
+      <w:r>
+        <w:t xml:space="preserve"> </w:t>
+      </w:r>
+      <w:r>
+        <w:rPr>
+          <w:b/>
+          <w:bCs/>
+        </w:rPr>
+        <w:t xml:space="preserve">mostly cosmetics</w:t>
+      </w:r>
+      <w:r>
+        <w:t xml:space="preserve">; older spenders still buy power. BGMI’s move toward cheaper, clearer cosmetics was reported to lift satisfaction</w:t>
+      </w:r>
+      <w:r>
+        <w:t xml:space="preserve"> </w:t>
+      </w:r>
+      <w:r>
+        <w:rPr>
+          <w:i/>
+          <w:iCs/>
+        </w:rPr>
+        <w:t xml:space="preserve">and</w:t>
+      </w:r>
+      <w:r>
+        <w:t xml:space="preserve"> </w:t>
+      </w:r>
+      <w:r>
+        <w:t xml:space="preserve">revenue (Krafton India / trade press).</w:t>
       </w:r>
     </w:p>
     <w:p>
@@ -7452,7 +7658,32 @@
         </w:numPr>
       </w:pPr>
       <w:r>
-        <w:t xml:space="preserve">Fake shop (no real money yet)</w:t>
+        <w:t xml:space="preserve">Cultural: games should feel</w:t>
+      </w:r>
+      <w:r>
+        <w:t xml:space="preserve"> </w:t>
+      </w:r>
+      <w:r>
+        <w:rPr>
+          <w:b/>
+          <w:bCs/>
+        </w:rPr>
+        <w:t xml:space="preserve">free</w:t>
+      </w:r>
+      <w:r>
+        <w:t xml:space="preserve">. ₹49–199 UPI taps work; ₹800 Western battle-pass prices do not. Regional language (Hindi/Tamil/Telugu) is a conversion lever, not a nice-to-have.</w:t>
+      </w:r>
+    </w:p>
+    <w:p>
+      <w:pPr>
+        <w:pStyle w:val="Compact"/>
+        <w:numPr>
+          <w:ilvl w:val="0"/>
+          <w:numId w:val="1021"/>
+        </w:numPr>
+      </w:pPr>
+      <w:r>
+        <w:t xml:space="preserve">Energy gates and opaque loot are familiar from Shadow Fight / Free Fire / cricket F2P. Familiar ≠ loved. They work on whales and get one-starred by everyone else.</w:t>
       </w:r>
     </w:p>
     <w:p>
@@ -7464,23 +7695,7 @@
           <w:b/>
           <w:bCs/>
         </w:rPr>
-        <w:t xml:space="preserve">Kill criterion:</w:t>
-      </w:r>
-      <w:r>
-        <w:t xml:space="preserve"> </w:t>
-      </w:r>
-      <w:r>
-        <w:t xml:space="preserve">if you do not start a second run after a death without being asked, stop. Do not add ads to a boring slice.</w:t>
-      </w:r>
-    </w:p>
-    <w:bookmarkEnd w:id="50"/>
-    <w:bookmarkStart w:id="51" w:name="alpha-weeks-714"/>
-    <w:p>
-      <w:pPr>
-        <w:pStyle w:val="Heading3"/>
-      </w:pPr>
-      <w:r>
-        <w:t xml:space="preserve">10.2 Alpha (weeks 7–14)</w:t>
+        <w:t xml:space="preserve">What international (esp. US/UK/EU) players call predatory</w:t>
       </w:r>
     </w:p>
     <w:p>
@@ -7492,7 +7707,23 @@
         </w:numPr>
       </w:pPr>
       <w:r>
-        <w:t xml:space="preserve">3 archetypes, 60 cards, 3 acts</w:t>
+        <w:t xml:space="preserve">Random</w:t>
+      </w:r>
+      <w:r>
+        <w:t xml:space="preserve"> </w:t>
+      </w:r>
+      <w:r>
+        <w:rPr>
+          <w:b/>
+          <w:bCs/>
+        </w:rPr>
+        <w:t xml:space="preserve">paid power</w:t>
+      </w:r>
+      <w:r>
+        <w:t xml:space="preserve"> </w:t>
+      </w:r>
+      <w:r>
+        <w:t xml:space="preserve">(Battlefront II, FIFA Ultimate Team, Madden packs) is the radioactive pattern. Review bombs, creator boycotts, congressional language (“Star Wars-themed casino”).</w:t>
       </w:r>
     </w:p>
     <w:p>
@@ -7504,7 +7735,62 @@
         </w:numPr>
       </w:pPr>
       <w:r>
-        <w:t xml:space="preserve">Daily net</w:t>
+        <w:rPr>
+          <w:b/>
+          <w:bCs/>
+        </w:rPr>
+        <w:t xml:space="preserve">Loot boxes</w:t>
+      </w:r>
+      <w:r>
+        <w:t xml:space="preserve"> </w:t>
+      </w:r>
+      <w:r>
+        <w:t xml:space="preserve">= gambling-adjacent: Belgium treats</w:t>
+      </w:r>
+      <w:r>
+        <w:t xml:space="preserve"> </w:t>
+      </w:r>
+      <w:r>
+        <w:rPr>
+          <w:i/>
+          <w:iCs/>
+        </w:rPr>
+        <w:t xml:space="preserve">paid</w:t>
+      </w:r>
+      <w:r>
+        <w:t xml:space="preserve"> </w:t>
+      </w:r>
+      <w:r>
+        <w:t xml:space="preserve">loot boxes as illegal chance games (2018 opinion; Antwerp</w:t>
+      </w:r>
+      <w:r>
+        <w:t xml:space="preserve"> </w:t>
+      </w:r>
+      <w:r>
+        <w:rPr>
+          <w:i/>
+          <w:iCs/>
+        </w:rPr>
+        <w:t xml:space="preserve">LS v Apple</w:t>
+      </w:r>
+      <w:r>
+        <w:t xml:space="preserve"> </w:t>
+      </w:r>
+      <w:r>
+        <w:t xml:space="preserve">Jan 2025). Play/App Store already require</w:t>
+      </w:r>
+      <w:r>
+        <w:t xml:space="preserve"> </w:t>
+      </w:r>
+      <w:r>
+        <w:rPr>
+          <w:b/>
+          <w:bCs/>
+        </w:rPr>
+        <w:t xml:space="preserve">odds before purchase</w:t>
+      </w:r>
+      <w:r>
+        <w:t xml:space="preserve">. EU/UK/US lawsuits and 18+ pressure are the trend, not a fad.</w:t>
       </w:r>
     </w:p>
     <w:p>
@@ -7516,7 +7802,20 @@
         </w:numPr>
       </w:pPr>
       <w:r>
-        <w:t xml:space="preserve">Analytics events (start_run, card_play, death, revive_ad)</w:t>
+        <w:t xml:space="preserve">Other west-hated patterns (Norwegian Consumer Council</w:t>
+      </w:r>
+      <w:r>
+        <w:t xml:space="preserve"> </w:t>
+      </w:r>
+      <w:r>
+        <w:rPr>
+          <w:i/>
+          <w:iCs/>
+        </w:rPr>
+        <w:t xml:space="preserve">Get Played</w:t>
+      </w:r>
+      <w:r>
+        <w:t xml:space="preserve">): leftover premium currency, two-layer gems, paywalls on the story, “just short of the price” bundles (FF14 Mobile 2025 backlash).</w:t>
       </w:r>
     </w:p>
     <w:p>
@@ -7528,17 +7827,868 @@
         </w:numPr>
       </w:pPr>
       <w:r>
-        <w:t xml:space="preserve">Closed testing track, 12 testers, 14 days</w:t>
-      </w:r>
-    </w:p>
-    <w:bookmarkEnd w:id="51"/>
-    <w:bookmarkStart w:id="52" w:name="beta-weeks-1522"/>
-    <w:p>
-      <w:pPr>
-        <w:pStyle w:val="Heading3"/>
-      </w:pPr>
-      <w:r>
-        <w:t xml:space="preserve">10.3 Beta (weeks 15–22)</w:t>
+        <w:t xml:space="preserve">West</w:t>
+      </w:r>
+      <w:r>
+        <w:t xml:space="preserve"> </w:t>
+      </w:r>
+      <w:r>
+        <w:rPr>
+          <w:i/>
+          <w:iCs/>
+        </w:rPr>
+        <w:t xml:space="preserve">does</w:t>
+      </w:r>
+      <w:r>
+        <w:t xml:space="preserve"> </w:t>
+      </w:r>
+      <w:r>
+        <w:t xml:space="preserve">pay:</w:t>
+      </w:r>
+      <w:r>
+        <w:t xml:space="preserve"> </w:t>
+      </w:r>
+      <w:r>
+        <w:rPr>
+          <w:b/>
+          <w:bCs/>
+        </w:rPr>
+        <w:t xml:space="preserve">battle pass + cosmetics</w:t>
+      </w:r>
+      <w:r>
+        <w:t xml:space="preserve"> </w:t>
+      </w:r>
+      <w:r>
+        <w:t xml:space="preserve">(Fortnite, Brawl Stars, Clash Royale). Clash Royale added</w:t>
+      </w:r>
+      <w:r>
+        <w:t xml:space="preserve"> </w:t>
+      </w:r>
+      <w:r>
+        <w:rPr>
+          <w:b/>
+          <w:bCs/>
+        </w:rPr>
+        <w:t xml:space="preserve">regional pricing</w:t>
+      </w:r>
+      <w:r>
+        <w:t xml:space="preserve"> </w:t>
+      </w:r>
+      <w:r>
+        <w:t xml:space="preserve">(2025) so India/LATAM are not charged US rates. That is the global-fair playbook.</w:t>
+      </w:r>
+    </w:p>
+    <w:p>
+      <w:pPr>
+        <w:pStyle w:val="Compact"/>
+        <w:numPr>
+          <w:ilvl w:val="0"/>
+          <w:numId w:val="1022"/>
+        </w:numPr>
+      </w:pPr>
+      <w:r>
+        <w:t xml:space="preserve">Gacha can still print money in the West (</w:t>
+      </w:r>
+      <w:r>
+        <w:rPr>
+          <w:i/>
+          <w:iCs/>
+        </w:rPr>
+        <w:t xml:space="preserve">Genshin</w:t>
+      </w:r>
+      <w:r>
+        <w:t xml:space="preserve">)</w:t>
+      </w:r>
+      <w:r>
+        <w:t xml:space="preserve"> </w:t>
+      </w:r>
+      <w:r>
+        <w:rPr>
+          <w:b/>
+          <w:bCs/>
+        </w:rPr>
+        <w:t xml:space="preserve">if</w:t>
+      </w:r>
+      <w:r>
+        <w:t xml:space="preserve"> </w:t>
+      </w:r>
+      <w:r>
+        <w:t xml:space="preserve">pity is honest and you can eventually get the thing by playing. It will never feel “fair” to a Steam/Balatro audience.</w:t>
+      </w:r>
+    </w:p>
+    <w:p>
+      <w:pPr>
+        <w:pStyle w:val="FirstParagraph"/>
+      </w:pPr>
+      <w:r>
+        <w:rPr>
+          <w:b/>
+          <w:bCs/>
+        </w:rPr>
+        <w:t xml:space="preserve">Game types that sit in the overlap (India-ok AND not radioactive in the West)</w:t>
+      </w:r>
+    </w:p>
+    <w:tbl>
+      <w:tblPr>
+        <w:tblStyle w:val="Table"/>
+        <w:tblW w:type="pct" w:w="5000"/>
+        <w:tblLayout w:type="fixed"/>
+        <w:tblLook w:firstRow="1" w:lastRow="0" w:firstColumn="0" w:lastColumn="0" w:noHBand="0" w:noVBand="0" w:val="0020"/>
+      </w:tblPr>
+      <w:tblGrid>
+        <w:gridCol w:w="1980"/>
+        <w:gridCol w:w="1980"/>
+        <w:gridCol w:w="1980"/>
+        <w:gridCol w:w="1980"/>
+      </w:tblGrid>
+      <w:tr>
+        <w:trPr>
+          <w:tblHeader w:val="on"/>
+        </w:trPr>
+        <w:tc>
+          <w:tcPr/>
+          <w:p>
+            <w:pPr>
+              <w:pStyle w:val="Compact"/>
+            </w:pPr>
+            <w:r>
+              <w:t xml:space="preserve">Type</w:t>
+            </w:r>
+          </w:p>
+        </w:tc>
+        <w:tc>
+          <w:tcPr/>
+          <w:p>
+            <w:pPr>
+              <w:pStyle w:val="Compact"/>
+            </w:pPr>
+            <w:r>
+              <w:t xml:space="preserve">India</w:t>
+            </w:r>
+          </w:p>
+        </w:tc>
+        <w:tc>
+          <w:tcPr/>
+          <w:p>
+            <w:pPr>
+              <w:pStyle w:val="Compact"/>
+            </w:pPr>
+            <w:r>
+              <w:t xml:space="preserve">West</w:t>
+            </w:r>
+          </w:p>
+        </w:tc>
+        <w:tc>
+          <w:tcPr/>
+          <w:p>
+            <w:pPr>
+              <w:pStyle w:val="Compact"/>
+            </w:pPr>
+            <w:r>
+              <w:t xml:space="preserve">Notes</w:t>
+            </w:r>
+          </w:p>
+        </w:tc>
+      </w:tr>
+      <w:tr>
+        <w:tc>
+          <w:tcPr/>
+          <w:p>
+            <w:pPr>
+              <w:pStyle w:val="Compact"/>
+            </w:pPr>
+            <w:r>
+              <w:t xml:space="preserve">Act campaign, retry stages (Shadow Fight 2)</w:t>
+            </w:r>
+          </w:p>
+        </w:tc>
+        <w:tc>
+          <w:tcPr/>
+          <w:p>
+            <w:pPr>
+              <w:pStyle w:val="Compact"/>
+            </w:pPr>
+            <w:r>
+              <w:t xml:space="preserve">High</w:t>
+            </w:r>
+          </w:p>
+        </w:tc>
+        <w:tc>
+          <w:tcPr/>
+          <w:p>
+            <w:pPr>
+              <w:pStyle w:val="Compact"/>
+            </w:pPr>
+            <w:r>
+              <w:t xml:space="preserve">Medium</w:t>
+            </w:r>
+          </w:p>
+        </w:tc>
+        <w:tc>
+          <w:tcPr/>
+          <w:p>
+            <w:pPr>
+              <w:pStyle w:val="Compact"/>
+            </w:pPr>
+            <w:r>
+              <w:t xml:space="preserve">Native to India. Fine in West if not energy-bricked</w:t>
+            </w:r>
+          </w:p>
+        </w:tc>
+      </w:tr>
+      <w:tr>
+        <w:tc>
+          <w:tcPr/>
+          <w:p>
+            <w:pPr>
+              <w:pStyle w:val="Compact"/>
+            </w:pPr>
+            <w:r>
+              <w:t xml:space="preserve">Short card fights + persistent loadout (Clash Royale / Brawl Stars)</w:t>
+            </w:r>
+          </w:p>
+        </w:tc>
+        <w:tc>
+          <w:tcPr/>
+          <w:p>
+            <w:pPr>
+              <w:pStyle w:val="Compact"/>
+            </w:pPr>
+            <w:r>
+              <w:t xml:space="preserve">High if priced locally</w:t>
+            </w:r>
+          </w:p>
+        </w:tc>
+        <w:tc>
+          <w:tcPr/>
+          <w:p>
+            <w:pPr>
+              <w:pStyle w:val="Compact"/>
+            </w:pPr>
+            <w:r>
+              <w:t xml:space="preserve">High</w:t>
+            </w:r>
+          </w:p>
+        </w:tc>
+        <w:tc>
+          <w:tcPr/>
+          <w:p>
+            <w:pPr>
+              <w:pStyle w:val="Compact"/>
+            </w:pPr>
+            <w:r>
+              <w:t xml:space="preserve">Best dual-market model</w:t>
+            </w:r>
+          </w:p>
+        </w:tc>
+      </w:tr>
+      <w:tr>
+        <w:tc>
+          <w:tcPr/>
+          <w:p>
+            <w:pPr>
+              <w:pStyle w:val="Compact"/>
+            </w:pPr>
+            <w:r>
+              <w:t xml:space="preserve">Cosmetic + battle pass F2P (BGMI / Fortnite)</w:t>
+            </w:r>
+          </w:p>
+        </w:tc>
+        <w:tc>
+          <w:tcPr/>
+          <w:p>
+            <w:pPr>
+              <w:pStyle w:val="Compact"/>
+            </w:pPr>
+            <w:r>
+              <w:t xml:space="preserve">High (identity spend)</w:t>
+            </w:r>
+          </w:p>
+        </w:tc>
+        <w:tc>
+          <w:tcPr/>
+          <w:p>
+            <w:pPr>
+              <w:pStyle w:val="Compact"/>
+            </w:pPr>
+            <w:r>
+              <w:t xml:space="preserve">High</w:t>
+            </w:r>
+          </w:p>
+        </w:tc>
+        <w:tc>
+          <w:tcPr/>
+          <w:p>
+            <w:pPr>
+              <w:pStyle w:val="Compact"/>
+            </w:pPr>
+            <w:r>
+              <w:t xml:space="preserve">Needs scale</w:t>
+            </w:r>
+          </w:p>
+        </w:tc>
+      </w:tr>
+      <w:tr>
+        <w:tc>
+          <w:tcPr/>
+          <w:p>
+            <w:pPr>
+              <w:pStyle w:val="Compact"/>
+            </w:pPr>
+            <w:r>
+              <w:t xml:space="preserve">Premium one-price (Balatro / StS)</w:t>
+            </w:r>
+          </w:p>
+        </w:tc>
+        <w:tc>
+          <w:tcPr/>
+          <w:p>
+            <w:pPr>
+              <w:pStyle w:val="Compact"/>
+            </w:pPr>
+            <w:r>
+              <w:t xml:space="preserve">Low in India cricket</w:t>
+            </w:r>
+          </w:p>
+        </w:tc>
+        <w:tc>
+          <w:tcPr/>
+          <w:p>
+            <w:pPr>
+              <w:pStyle w:val="Compact"/>
+            </w:pPr>
+            <w:r>
+              <w:t xml:space="preserve">Very high</w:t>
+            </w:r>
+          </w:p>
+        </w:tc>
+        <w:tc>
+          <w:tcPr/>
+          <w:p>
+            <w:pPr>
+              <w:pStyle w:val="Compact"/>
+            </w:pPr>
+            <w:r>
+              <w:t xml:space="preserve">Wrong funnel vs free cricket games</w:t>
+            </w:r>
+          </w:p>
+        </w:tc>
+      </w:tr>
+      <w:tr>
+        <w:tc>
+          <w:tcPr/>
+          <w:p>
+            <w:pPr>
+              <w:pStyle w:val="Compact"/>
+            </w:pPr>
+            <w:r>
+              <w:t xml:space="preserve">Hard gacha P2W cricket</w:t>
+            </w:r>
+          </w:p>
+        </w:tc>
+        <w:tc>
+          <w:tcPr/>
+          <w:p>
+            <w:pPr>
+              <w:pStyle w:val="Compact"/>
+            </w:pPr>
+            <w:r>
+              <w:t xml:space="preserve">High short-term rupees</w:t>
+            </w:r>
+          </w:p>
+        </w:tc>
+        <w:tc>
+          <w:tcPr/>
+          <w:p>
+            <w:pPr>
+              <w:pStyle w:val="Compact"/>
+            </w:pPr>
+            <w:r>
+              <w:t xml:space="preserve">Toxic</w:t>
+            </w:r>
+          </w:p>
+        </w:tc>
+        <w:tc>
+          <w:tcPr/>
+          <w:p>
+            <w:pPr>
+              <w:pStyle w:val="Compact"/>
+            </w:pPr>
+            <w:r>
+              <w:t xml:space="preserve">Legal-adjacent after RMG ban</w:t>
+            </w:r>
+          </w:p>
+        </w:tc>
+      </w:tr>
+      <w:tr>
+        <w:tc>
+          <w:tcPr/>
+          <w:p>
+            <w:pPr>
+              <w:pStyle w:val="Compact"/>
+            </w:pPr>
+            <w:r>
+              <w:t xml:space="preserve">Ad-only hypercasual</w:t>
+            </w:r>
+          </w:p>
+        </w:tc>
+        <w:tc>
+          <w:tcPr/>
+          <w:p>
+            <w:pPr>
+              <w:pStyle w:val="Compact"/>
+            </w:pPr>
+            <w:r>
+              <w:t xml:space="preserve">High installs, tiny $</w:t>
+            </w:r>
+          </w:p>
+        </w:tc>
+        <w:tc>
+          <w:tcPr/>
+          <w:p>
+            <w:pPr>
+              <w:pStyle w:val="Compact"/>
+            </w:pPr>
+            <w:r>
+              <w:t xml:space="preserve">Fine</w:t>
+            </w:r>
+          </w:p>
+        </w:tc>
+        <w:tc>
+          <w:tcPr/>
+          <w:p>
+            <w:pPr>
+              <w:pStyle w:val="Compact"/>
+            </w:pPr>
+            <w:r>
+              <w:t xml:space="preserve">Not a career game</w:t>
+            </w:r>
+          </w:p>
+        </w:tc>
+      </w:tr>
+    </w:tbl>
+    <w:p>
+      <w:pPr>
+        <w:pStyle w:val="BodyText"/>
+      </w:pPr>
+      <w:r>
+        <w:rPr>
+          <w:b/>
+          <w:bCs/>
+        </w:rPr>
+        <w:t xml:space="preserve">Ratings (1 = predatory / unworkable, 10 = dual-market gold)</w:t>
+      </w:r>
+    </w:p>
+    <w:p>
+      <w:pPr>
+        <w:pStyle w:val="BodyText"/>
+      </w:pPr>
+      <w:r>
+        <w:t xml:space="preserve">Score is</w:t>
+      </w:r>
+      <w:r>
+        <w:t xml:space="preserve"> </w:t>
+      </w:r>
+      <w:r>
+        <w:rPr>
+          <w:b/>
+          <w:bCs/>
+        </w:rPr>
+        <w:t xml:space="preserve">blended</w:t>
+      </w:r>
+      <w:r>
+        <w:t xml:space="preserve">: 50% India fit (will they play and pay via UPI/ads) + 50% international fairness (reviews, EU loot-box risk, diaspora eCPM).</w:t>
+      </w:r>
+    </w:p>
+    <w:tbl>
+      <w:tblPr>
+        <w:tblStyle w:val="Table"/>
+        <w:tblW w:type="pct" w:w="5000"/>
+        <w:tblLayout w:type="fixed"/>
+        <w:tblLook w:firstRow="1" w:lastRow="0" w:firstColumn="0" w:lastColumn="0" w:noHBand="0" w:noVBand="0" w:val="0020"/>
+      </w:tblPr>
+      <w:tblGrid>
+        <w:gridCol w:w="1980"/>
+        <w:gridCol w:w="1980"/>
+        <w:gridCol w:w="1980"/>
+        <w:gridCol w:w="1980"/>
+      </w:tblGrid>
+      <w:tr>
+        <w:trPr>
+          <w:tblHeader w:val="on"/>
+        </w:trPr>
+        <w:tc>
+          <w:tcPr/>
+          <w:p>
+            <w:pPr>
+              <w:pStyle w:val="Compact"/>
+            </w:pPr>
+            <w:r>
+              <w:t xml:space="preserve">Dimension</w:t>
+            </w:r>
+          </w:p>
+        </w:tc>
+        <w:tc>
+          <w:tcPr/>
+          <w:p>
+            <w:pPr>
+              <w:pStyle w:val="Compact"/>
+            </w:pPr>
+            <w:r>
+              <w:t xml:space="preserve">Typical India cricket / Shadow Fight F2P (“their” default)</w:t>
+            </w:r>
+          </w:p>
+        </w:tc>
+        <w:tc>
+          <w:tcPr/>
+          <w:p>
+            <w:pPr>
+              <w:pStyle w:val="Compact"/>
+            </w:pPr>
+            <w:r>
+              <w:t xml:space="preserve">Our current plan</w:t>
+            </w:r>
+          </w:p>
+        </w:tc>
+        <w:tc>
+          <w:tcPr/>
+          <w:p>
+            <w:pPr>
+              <w:pStyle w:val="Compact"/>
+            </w:pPr>
+            <w:r>
+              <w:t xml:space="preserve">10/10 target</w:t>
+            </w:r>
+          </w:p>
+        </w:tc>
+      </w:tr>
+      <w:tr>
+        <w:tc>
+          <w:tcPr/>
+          <w:p>
+            <w:pPr>
+              <w:pStyle w:val="Compact"/>
+            </w:pPr>
+            <w:r>
+              <w:t xml:space="preserve">India play/pay fit</w:t>
+            </w:r>
+          </w:p>
+        </w:tc>
+        <w:tc>
+          <w:tcPr/>
+          <w:p>
+            <w:pPr>
+              <w:pStyle w:val="Compact"/>
+            </w:pPr>
+            <w:r>
+              <w:t xml:space="preserve">8</w:t>
+            </w:r>
+          </w:p>
+        </w:tc>
+        <w:tc>
+          <w:tcPr/>
+          <w:p>
+            <w:pPr>
+              <w:pStyle w:val="Compact"/>
+            </w:pPr>
+            <w:r>
+              <w:t xml:space="preserve">7</w:t>
+            </w:r>
+          </w:p>
+        </w:tc>
+        <w:tc>
+          <w:tcPr/>
+          <w:p>
+            <w:pPr>
+              <w:pStyle w:val="Compact"/>
+            </w:pPr>
+            <w:r>
+              <w:t xml:space="preserve">9</w:t>
+            </w:r>
+          </w:p>
+        </w:tc>
+      </w:tr>
+      <w:tr>
+        <w:tc>
+          <w:tcPr/>
+          <w:p>
+            <w:pPr>
+              <w:pStyle w:val="Compact"/>
+            </w:pPr>
+            <w:r>
+              <w:t xml:space="preserve">International fairness</w:t>
+            </w:r>
+          </w:p>
+        </w:tc>
+        <w:tc>
+          <w:tcPr/>
+          <w:p>
+            <w:pPr>
+              <w:pStyle w:val="Compact"/>
+            </w:pPr>
+            <w:r>
+              <w:t xml:space="preserve">3</w:t>
+            </w:r>
+          </w:p>
+        </w:tc>
+        <w:tc>
+          <w:tcPr/>
+          <w:p>
+            <w:pPr>
+              <w:pStyle w:val="Compact"/>
+            </w:pPr>
+            <w:r>
+              <w:t xml:space="preserve">6</w:t>
+            </w:r>
+          </w:p>
+        </w:tc>
+        <w:tc>
+          <w:tcPr/>
+          <w:p>
+            <w:pPr>
+              <w:pStyle w:val="Compact"/>
+            </w:pPr>
+            <w:r>
+              <w:t xml:space="preserve">9</w:t>
+            </w:r>
+          </w:p>
+        </w:tc>
+      </w:tr>
+      <w:tr>
+        <w:tc>
+          <w:tcPr/>
+          <w:p>
+            <w:pPr>
+              <w:pStyle w:val="Compact"/>
+            </w:pPr>
+            <w:r>
+              <w:t xml:space="preserve">Legal / store (odds, RMG-adjacent, Belgium)</w:t>
+            </w:r>
+          </w:p>
+        </w:tc>
+        <w:tc>
+          <w:tcPr/>
+          <w:p>
+            <w:pPr>
+              <w:pStyle w:val="Compact"/>
+            </w:pPr>
+            <w:r>
+              <w:t xml:space="preserve">3</w:t>
+            </w:r>
+          </w:p>
+        </w:tc>
+        <w:tc>
+          <w:tcPr/>
+          <w:p>
+            <w:pPr>
+              <w:pStyle w:val="Compact"/>
+            </w:pPr>
+            <w:r>
+              <w:t xml:space="preserve">5</w:t>
+            </w:r>
+          </w:p>
+        </w:tc>
+        <w:tc>
+          <w:tcPr/>
+          <w:p>
+            <w:pPr>
+              <w:pStyle w:val="Compact"/>
+            </w:pPr>
+            <w:r>
+              <w:t xml:space="preserve">9</w:t>
+            </w:r>
+          </w:p>
+        </w:tc>
+      </w:tr>
+      <w:tr>
+        <w:tc>
+          <w:tcPr/>
+          <w:p>
+            <w:pPr>
+              <w:pStyle w:val="Compact"/>
+            </w:pPr>
+            <w:r>
+              <w:t xml:space="preserve">Long-term LTV (not whale-burn)</w:t>
+            </w:r>
+          </w:p>
+        </w:tc>
+        <w:tc>
+          <w:tcPr/>
+          <w:p>
+            <w:pPr>
+              <w:pStyle w:val="Compact"/>
+            </w:pPr>
+            <w:r>
+              <w:t xml:space="preserve">4</w:t>
+            </w:r>
+          </w:p>
+        </w:tc>
+        <w:tc>
+          <w:tcPr/>
+          <w:p>
+            <w:pPr>
+              <w:pStyle w:val="Compact"/>
+            </w:pPr>
+            <w:r>
+              <w:t xml:space="preserve">7</w:t>
+            </w:r>
+          </w:p>
+        </w:tc>
+        <w:tc>
+          <w:tcPr/>
+          <w:p>
+            <w:pPr>
+              <w:pStyle w:val="Compact"/>
+            </w:pPr>
+            <w:r>
+              <w:t xml:space="preserve">9</w:t>
+            </w:r>
+          </w:p>
+        </w:tc>
+      </w:tr>
+      <w:tr>
+        <w:tc>
+          <w:tcPr/>
+          <w:p>
+            <w:pPr>
+              <w:pStyle w:val="Compact"/>
+            </w:pPr>
+            <w:r>
+              <w:t xml:space="preserve">Ads without churn</w:t>
+            </w:r>
+          </w:p>
+        </w:tc>
+        <w:tc>
+          <w:tcPr/>
+          <w:p>
+            <w:pPr>
+              <w:pStyle w:val="Compact"/>
+            </w:pPr>
+            <w:r>
+              <w:t xml:space="preserve">4</w:t>
+            </w:r>
+          </w:p>
+        </w:tc>
+        <w:tc>
+          <w:tcPr/>
+          <w:p>
+            <w:pPr>
+              <w:pStyle w:val="Compact"/>
+            </w:pPr>
+            <w:r>
+              <w:t xml:space="preserve">7</w:t>
+            </w:r>
+          </w:p>
+        </w:tc>
+        <w:tc>
+          <w:tcPr/>
+          <w:p>
+            <w:pPr>
+              <w:pStyle w:val="Compact"/>
+            </w:pPr>
+            <w:r>
+              <w:t xml:space="preserve">9</w:t>
+            </w:r>
+          </w:p>
+        </w:tc>
+      </w:tr>
+      <w:tr>
+        <w:tc>
+          <w:tcPr/>
+          <w:p>
+            <w:pPr>
+              <w:pStyle w:val="Compact"/>
+            </w:pPr>
+            <w:r>
+              <w:rPr>
+                <w:b/>
+                <w:bCs/>
+              </w:rPr>
+              <w:t xml:space="preserve">Blended</w:t>
+            </w:r>
+          </w:p>
+        </w:tc>
+        <w:tc>
+          <w:tcPr/>
+          <w:p>
+            <w:pPr>
+              <w:pStyle w:val="Compact"/>
+            </w:pPr>
+            <w:r>
+              <w:rPr>
+                <w:b/>
+                <w:bCs/>
+              </w:rPr>
+              <w:t xml:space="preserve">4.5 / 10</w:t>
+            </w:r>
+          </w:p>
+        </w:tc>
+        <w:tc>
+          <w:tcPr/>
+          <w:p>
+            <w:pPr>
+              <w:pStyle w:val="Compact"/>
+            </w:pPr>
+            <w:r>
+              <w:rPr>
+                <w:b/>
+                <w:bCs/>
+              </w:rPr>
+              <w:t xml:space="preserve">6.5 / 10</w:t>
+            </w:r>
+          </w:p>
+        </w:tc>
+        <w:tc>
+          <w:tcPr/>
+          <w:p>
+            <w:pPr>
+              <w:pStyle w:val="Compact"/>
+            </w:pPr>
+            <w:r>
+              <w:rPr>
+                <w:b/>
+                <w:bCs/>
+              </w:rPr>
+              <w:t xml:space="preserve">10</w:t>
+            </w:r>
+          </w:p>
+        </w:tc>
+      </w:tr>
+    </w:tbl>
+    <w:p>
+      <w:pPr>
+        <w:pStyle w:val="BodyText"/>
+      </w:pPr>
+      <w:r>
+        <w:t xml:space="preserve">Why we are not a 10 yet:</w:t>
+      </w:r>
+      <w:r>
+        <w:t xml:space="preserve"> </w:t>
+      </w:r>
+      <w:r>
+        <w:rPr>
+          <w:b/>
+          <w:bCs/>
+        </w:rPr>
+        <w:t xml:space="preserve">packs that can roll new power cards</w:t>
+      </w:r>
+      <w:r>
+        <w:t xml:space="preserve"> </w:t>
+      </w:r>
+      <w:r>
+        <w:t xml:space="preserve">(even if the story also grants them later) are still a paid loot box. That fails Belgium, needs Play odds disclosure, and is the first thing a Western reviewer will screenshot. Soft energy and “story never paywalled” are the parts that already score well.</w:t>
+      </w:r>
+    </w:p>
+    <w:p>
+      <w:pPr>
+        <w:pStyle w:val="BodyText"/>
+      </w:pPr>
+      <w:r>
+        <w:rPr>
+          <w:b/>
+          <w:bCs/>
+        </w:rPr>
+        <w:t xml:space="preserve">Steps to 10/10 (do in this order)</w:t>
       </w:r>
     </w:p>
     <w:p>
@@ -7550,7 +8700,43 @@
         </w:numPr>
       </w:pPr>
       <w:r>
-        <w:t xml:space="preserve">Act 4 stub</w:t>
+        <w:rPr>
+          <w:b/>
+          <w:bCs/>
+        </w:rPr>
+        <w:t xml:space="preserve">Direct buy / craft every power card.</w:t>
+      </w:r>
+      <w:r>
+        <w:t xml:space="preserve"> </w:t>
+      </w:r>
+      <w:r>
+        <w:t xml:space="preserve">If it can appear in a pack, it has a</w:t>
+      </w:r>
+      <w:r>
+        <w:t xml:space="preserve"> </w:t>
+      </w:r>
+      <w:r>
+        <w:rPr>
+          <w:b/>
+          <w:bCs/>
+        </w:rPr>
+        <w:t xml:space="preserve">published coin price</w:t>
+      </w:r>
+      <w:r>
+        <w:t xml:space="preserve">. China draft rules and Western “I just want that cover drive” both require this. Packs become a</w:t>
+      </w:r>
+      <w:r>
+        <w:t xml:space="preserve"> </w:t>
+      </w:r>
+      <w:r>
+        <w:rPr>
+          <w:i/>
+          <w:iCs/>
+        </w:rPr>
+        <w:t xml:space="preserve">discount on random</w:t>
+      </w:r>
+      <w:r>
+        <w:t xml:space="preserve">, not the only door.</w:t>
       </w:r>
     </w:p>
     <w:p>
@@ -7562,7 +8748,17 @@
         </w:numPr>
       </w:pPr>
       <w:r>
-        <w:t xml:space="preserve">Real AdMob (test devices) + 3 IAP SKUs (ad remove, starter, pass)</w:t>
+        <w:rPr>
+          <w:b/>
+          <w:bCs/>
+        </w:rPr>
+        <w:t xml:space="preserve">Odds on the pack screen before spend.</w:t>
+      </w:r>
+      <w:r>
+        <w:t xml:space="preserve"> </w:t>
+      </w:r>
+      <w:r>
+        <w:t xml:space="preserve">Play/App Store requirement. Also print pity: e.g. featured card guaranteed by pack 10; no duplicate of a missing story card until the set is complete.</w:t>
       </w:r>
     </w:p>
     <w:p>
@@ -7574,7 +8770,17 @@
         </w:numPr>
       </w:pPr>
       <w:r>
-        <w:t xml:space="preserve">Hindi flavour pass</w:t>
+        <w:rPr>
+          <w:b/>
+          <w:bCs/>
+        </w:rPr>
+        <w:t xml:space="preserve">Story path beats Act 4 on story cards alone.</w:t>
+      </w:r>
+      <w:r>
+        <w:t xml:space="preserve"> </w:t>
+      </w:r>
+      <w:r>
+        <w:t xml:space="preserve">Pack-early is convenience, never a DPS check. QA a F2P account with zero packs through the finale every patch.</w:t>
       </w:r>
     </w:p>
     <w:p>
@@ -7586,51 +8792,353 @@
         </w:numPr>
       </w:pPr>
       <w:r>
-        <w:t xml:space="preserve">Store listing, shots, 30s trailer (one run, no licensed footage)</w:t>
-      </w:r>
-    </w:p>
-    <w:bookmarkEnd w:id="52"/>
-    <w:bookmarkStart w:id="53" w:name="production"/>
-    <w:p>
-      <w:pPr>
-        <w:pStyle w:val="Heading3"/>
-      </w:pPr>
-      <w:r>
-        <w:t xml:space="preserve">10.4 Production</w:t>
-      </w:r>
-    </w:p>
-    <w:p>
-      <w:pPr>
-        <w:pStyle w:val="Compact"/>
-        <w:numPr>
-          <w:ilvl w:val="0"/>
-          <w:numId w:val="1024"/>
-        </w:numPr>
-      </w:pPr>
-      <w:r>
-        <w:t xml:space="preserve">Staged rollout before a cricket window</w:t>
-      </w:r>
-    </w:p>
-    <w:p>
-      <w:pPr>
-        <w:pStyle w:val="Compact"/>
-        <w:numPr>
-          <w:ilvl w:val="0"/>
-          <w:numId w:val="1024"/>
-        </w:numPr>
-      </w:pPr>
-      <w:r>
-        <w:t xml:space="preserve">Season 0 pass (free track fat, paid track cosmetic)</w:t>
-      </w:r>
-    </w:p>
-    <w:bookmarkEnd w:id="53"/>
-    <w:bookmarkStart w:id="54" w:name="team-v1"/>
-    <w:p>
-      <w:pPr>
-        <w:pStyle w:val="Heading3"/>
-      </w:pPr>
-      <w:r>
-        <w:t xml:space="preserve">10.5 Team (v1)</w:t>
+        <w:rPr>
+          <w:b/>
+          <w:bCs/>
+        </w:rPr>
+        <w:t xml:space="preserve">Keep soft energy exactly as locked:</w:t>
+      </w:r>
+      <w:r>
+        <w:t xml:space="preserve"> </w:t>
+      </w:r>
+      <w:r>
+        <w:t xml:space="preserve">5 tickets/day, ad or wait refill,</w:t>
+      </w:r>
+      <w:r>
+        <w:t xml:space="preserve"> </w:t>
+      </w:r>
+      <w:r>
+        <w:rPr>
+          <w:b/>
+          <w:bCs/>
+        </w:rPr>
+        <w:t xml:space="preserve">story stages always playable</w:t>
+      </w:r>
+      <w:r>
+        <w:t xml:space="preserve"> </w:t>
+      </w:r>
+      <w:r>
+        <w:t xml:space="preserve">(maybe slower). Never Shadow Fight hard-lock.</w:t>
+      </w:r>
+    </w:p>
+    <w:p>
+      <w:pPr>
+        <w:pStyle w:val="Compact"/>
+        <w:numPr>
+          <w:ilvl w:val="0"/>
+          <w:numId w:val="1023"/>
+        </w:numPr>
+      </w:pPr>
+      <w:r>
+        <w:rPr>
+          <w:b/>
+          <w:bCs/>
+        </w:rPr>
+        <w:t xml:space="preserve">Battle pass ₹149–249</w:t>
+      </w:r>
+      <w:r>
+        <w:t xml:space="preserve"> </w:t>
+      </w:r>
+      <w:r>
+        <w:t xml:space="preserve">(not $9.99). Earn-back enough coins to buy the</w:t>
+      </w:r>
+      <w:r>
+        <w:t xml:space="preserve"> </w:t>
+      </w:r>
+      <w:r>
+        <w:rPr>
+          <w:i/>
+          <w:iCs/>
+        </w:rPr>
+        <w:t xml:space="preserve">next</w:t>
+      </w:r>
+      <w:r>
+        <w:t xml:space="preserve"> </w:t>
+      </w:r>
+      <w:r>
+        <w:t xml:space="preserve">pass by playing. Cosmetics + card backs + titles.</w:t>
+      </w:r>
+      <w:r>
+        <w:t xml:space="preserve"> </w:t>
+      </w:r>
+      <w:r>
+        <w:rPr>
+          <w:b/>
+          <w:bCs/>
+        </w:rPr>
+        <w:t xml:space="preserve">No unique power on the paid track.</w:t>
+      </w:r>
+    </w:p>
+    <w:p>
+      <w:pPr>
+        <w:pStyle w:val="Compact"/>
+        <w:numPr>
+          <w:ilvl w:val="0"/>
+          <w:numId w:val="1023"/>
+        </w:numPr>
+      </w:pPr>
+      <w:r>
+        <w:rPr>
+          <w:b/>
+          <w:bCs/>
+        </w:rPr>
+        <w:t xml:space="preserve">Regional pricing</w:t>
+      </w:r>
+      <w:r>
+        <w:t xml:space="preserve"> </w:t>
+      </w:r>
+      <w:r>
+        <w:t xml:space="preserve">on every SKU (Clash Royale 2025). India ₹49 / ₹99 / ₹199 rungs. US/UK can be 3–4×. Block gifting from cheap regions.</w:t>
+      </w:r>
+    </w:p>
+    <w:p>
+      <w:pPr>
+        <w:pStyle w:val="Compact"/>
+        <w:numPr>
+          <w:ilvl w:val="0"/>
+          <w:numId w:val="1023"/>
+        </w:numPr>
+      </w:pPr>
+      <w:r>
+        <w:rPr>
+          <w:b/>
+          <w:bCs/>
+        </w:rPr>
+        <w:t xml:space="preserve">Ads:</w:t>
+      </w:r>
+      <w:r>
+        <w:t xml:space="preserve"> </w:t>
+      </w:r>
+      <w:r>
+        <w:t xml:space="preserve">rewarded only at</w:t>
+      </w:r>
+      <w:r>
+        <w:t xml:space="preserve"> </w:t>
+      </w:r>
+      <w:r>
+        <w:rPr>
+          <w:i/>
+          <w:iCs/>
+        </w:rPr>
+        <w:t xml:space="preserve">opt-in</w:t>
+      </w:r>
+      <w:r>
+        <w:t xml:space="preserve"> </w:t>
+      </w:r>
+      <w:r>
+        <w:t xml:space="preserve">(ticket refill, extra 1-of-3 reroll, one revive). Interstitial only after a</w:t>
+      </w:r>
+      <w:r>
+        <w:t xml:space="preserve"> </w:t>
+      </w:r>
+      <w:r>
+        <w:rPr>
+          <w:i/>
+          <w:iCs/>
+        </w:rPr>
+        <w:t xml:space="preserve">lost</w:t>
+      </w:r>
+      <w:r>
+        <w:t xml:space="preserve"> </w:t>
+      </w:r>
+      <w:r>
+        <w:t xml:space="preserve">fight or returning to the act map.</w:t>
+      </w:r>
+      <w:r>
+        <w:t xml:space="preserve"> </w:t>
+      </w:r>
+      <w:r>
+        <w:rPr>
+          <w:b/>
+          <w:bCs/>
+        </w:rPr>
+        <w:t xml:space="preserve">Never mid-over.</w:t>
+      </w:r>
+      <w:r>
+        <w:t xml:space="preserve"> </w:t>
+      </w:r>
+      <w:r>
+        <w:t xml:space="preserve">Cap ~2 rewarded / session.</w:t>
+      </w:r>
+      <w:r>
+        <w:t xml:space="preserve"> </w:t>
+      </w:r>
+      <w:r>
+        <w:rPr>
+          <w:b/>
+          <w:bCs/>
+        </w:rPr>
+        <w:t xml:space="preserve">38% of Indian surveyed players said they would quit if ads are excessive.</w:t>
+      </w:r>
+    </w:p>
+    <w:p>
+      <w:pPr>
+        <w:pStyle w:val="Compact"/>
+        <w:numPr>
+          <w:ilvl w:val="0"/>
+          <w:numId w:val="1023"/>
+        </w:numPr>
+      </w:pPr>
+      <w:r>
+        <w:rPr>
+          <w:b/>
+          <w:bCs/>
+        </w:rPr>
+        <w:t xml:space="preserve">Remove-ads IAP</w:t>
+      </w:r>
+      <w:r>
+        <w:t xml:space="preserve"> </w:t>
+      </w:r>
+      <w:r>
+        <w:t xml:space="preserve">(₹199–349) so diaspora and haters of ads have an exit. Does not grant power.</w:t>
+      </w:r>
+    </w:p>
+    <w:p>
+      <w:pPr>
+        <w:pStyle w:val="Compact"/>
+        <w:numPr>
+          <w:ilvl w:val="0"/>
+          <w:numId w:val="1023"/>
+        </w:numPr>
+      </w:pPr>
+      <w:r>
+        <w:rPr>
+          <w:b/>
+          <w:bCs/>
+        </w:rPr>
+        <w:t xml:space="preserve">No leftover-gem traps.</w:t>
+      </w:r>
+      <w:r>
+        <w:t xml:space="preserve"> </w:t>
+      </w:r>
+      <w:r>
+        <w:t xml:space="preserve">SKUs map onto prices. If a kit is ₹99, sell a ₹99 pack, not 80 crystals then 150.</w:t>
+      </w:r>
+    </w:p>
+    <w:p>
+      <w:pPr>
+        <w:pStyle w:val="Compact"/>
+        <w:numPr>
+          <w:ilvl w:val="0"/>
+          <w:numId w:val="1023"/>
+        </w:numPr>
+      </w:pPr>
+      <w:r>
+        <w:rPr>
+          <w:b/>
+          <w:bCs/>
+        </w:rPr>
+        <w:t xml:space="preserve">UPI-first first-week offer</w:t>
+      </w:r>
+      <w:r>
+        <w:t xml:space="preserve"> </w:t>
+      </w:r>
+      <w:r>
+        <w:t xml:space="preserve">(₹49–79 starter cosmetics + 2 ticket refills). 54% of Indian payers convert in week one — that SKU is the conversion machine, not a ₹2,999 whale crate.</w:t>
+      </w:r>
+    </w:p>
+    <w:p>
+      <w:pPr>
+        <w:pStyle w:val="Compact"/>
+        <w:numPr>
+          <w:ilvl w:val="0"/>
+          <w:numId w:val="1023"/>
+        </w:numPr>
+      </w:pPr>
+      <w:r>
+        <w:rPr>
+          <w:b/>
+          <w:bCs/>
+        </w:rPr>
+        <w:t xml:space="preserve">Duplicate → dust → craft.</w:t>
+      </w:r>
+      <w:r>
+        <w:t xml:space="preserve"> </w:t>
+      </w:r>
+      <w:r>
+        <w:t xml:space="preserve">Packs that hit cards you own become upgrade currency, not garbage.</w:t>
+      </w:r>
+    </w:p>
+    <w:p>
+      <w:pPr>
+        <w:pStyle w:val="Compact"/>
+        <w:numPr>
+          <w:ilvl w:val="0"/>
+          <w:numId w:val="1023"/>
+        </w:numPr>
+      </w:pPr>
+      <w:r>
+        <w:rPr>
+          <w:b/>
+          <w:bCs/>
+        </w:rPr>
+        <w:t xml:space="preserve">Belgium / strict-EU:</w:t>
+      </w:r>
+      <w:r>
+        <w:t xml:space="preserve"> </w:t>
+      </w:r>
+      <w:r>
+        <w:t xml:space="preserve">geo-disable</w:t>
+      </w:r>
+      <w:r>
+        <w:t xml:space="preserve"> </w:t>
+      </w:r>
+      <w:r>
+        <w:rPr>
+          <w:i/>
+          <w:iCs/>
+        </w:rPr>
+        <w:t xml:space="preserve">paid random</w:t>
+      </w:r>
+      <w:r>
+        <w:t xml:space="preserve"> </w:t>
+      </w:r>
+      <w:r>
+        <w:t xml:space="preserve">packs or replace them with the craft shop only. Safer than arguing with gambling law.</w:t>
+      </w:r>
+    </w:p>
+    <w:p>
+      <w:pPr>
+        <w:pStyle w:val="Compact"/>
+        <w:numPr>
+          <w:ilvl w:val="0"/>
+          <w:numId w:val="1023"/>
+        </w:numPr>
+      </w:pPr>
+      <w:r>
+        <w:rPr>
+          <w:b/>
+          <w:bCs/>
+        </w:rPr>
+        <w:t xml:space="preserve">12+ rating, parental spend cap, no loot marketed at kids.</w:t>
+      </w:r>
+      <w:r>
+        <w:t xml:space="preserve"> </w:t>
+      </w:r>
+      <w:r>
+        <w:t xml:space="preserve">Cricket audience includes minors; we do not need them on packs.</w:t>
+      </w:r>
+    </w:p>
+    <w:p>
+      <w:pPr>
+        <w:pStyle w:val="Compact"/>
+        <w:numPr>
+          <w:ilvl w:val="0"/>
+          <w:numId w:val="1023"/>
+        </w:numPr>
+      </w:pPr>
+      <w:r>
+        <w:rPr>
+          <w:b/>
+          <w:bCs/>
+        </w:rPr>
+        <w:t xml:space="preserve">Live dashboard:</w:t>
+      </w:r>
+      <w:r>
+        <w:t xml:space="preserve"> </w:t>
+      </w:r>
+      <w:r>
+        <w:t xml:space="preserve">ARPDAU ads vs IAP, ticket-ad attach, pass conversion, D7 by payer/non-payer. If D7 of payers &lt; D7 of F2P, the economy is predatory and we roll it back.</w:t>
       </w:r>
     </w:p>
     <w:p>
@@ -7638,55 +9146,7 @@
         <w:pStyle w:val="FirstParagraph"/>
       </w:pPr>
       <w:r>
-        <w:t xml:space="preserve">Solo + specialists:</w:t>
-      </w:r>
-    </w:p>
-    <w:p>
-      <w:pPr>
-        <w:pStyle w:val="Compact"/>
-        <w:numPr>
-          <w:ilvl w:val="0"/>
-          <w:numId w:val="1025"/>
-        </w:numPr>
-      </w:pPr>
-      <w:r>
-        <w:t xml:space="preserve">You: design, Dart, combat</w:t>
-      </w:r>
-    </w:p>
-    <w:p>
-      <w:pPr>
-        <w:pStyle w:val="Compact"/>
-        <w:numPr>
-          <w:ilvl w:val="0"/>
-          <w:numId w:val="1025"/>
-        </w:numPr>
-      </w:pPr>
-      <w:r>
-        <w:t xml:space="preserve">1 illustrator (cards + portraits), contract</w:t>
-      </w:r>
-    </w:p>
-    <w:p>
-      <w:pPr>
-        <w:pStyle w:val="Compact"/>
-        <w:numPr>
-          <w:ilvl w:val="0"/>
-          <w:numId w:val="1025"/>
-        </w:numPr>
-      </w:pPr>
-      <w:r>
-        <w:t xml:space="preserve">1 audio (optional Fiverr-grade, then replace)</w:t>
-      </w:r>
-    </w:p>
-    <w:p>
-      <w:pPr>
-        <w:pStyle w:val="Compact"/>
-        <w:numPr>
-          <w:ilvl w:val="0"/>
-          <w:numId w:val="1025"/>
-        </w:numPr>
-      </w:pPr>
-      <w:r>
-        <w:t xml:space="preserve">No UA agency until §9.5 gates</w:t>
+        <w:t xml:space="preserve">Do 1–4 before closed testing. Do 5–11 before production. Do 12–14 in the first live season.</w:t>
       </w:r>
     </w:p>
     <w:p>
@@ -7696,154 +9156,337 @@
         </w:pict>
       </w:r>
     </w:p>
+    <w:bookmarkEnd w:id="50"/>
+    <w:bookmarkStart w:id="56" w:name="build-plan-what-to-make-in-order"/>
+    <w:p>
+      <w:pPr>
+        <w:pStyle w:val="Heading2"/>
+      </w:pPr>
+      <w:r>
+        <w:t xml:space="preserve">10. Build plan (what to make, in order)</w:t>
+      </w:r>
+    </w:p>
+    <w:bookmarkStart w:id="51" w:name="vertical-slice-46-weeks-kill-or-continue"/>
+    <w:p>
+      <w:pPr>
+        <w:pStyle w:val="Heading3"/>
+      </w:pPr>
+      <w:r>
+        <w:t xml:space="preserve">10.1 Vertical slice (4–6 weeks) — kill or continue</w:t>
+      </w:r>
+    </w:p>
+    <w:p>
+      <w:pPr>
+        <w:pStyle w:val="FirstParagraph"/>
+      </w:pPr>
+      <w:r>
+        <w:t xml:space="preserve">Must be fun on a mid-range Android without accounts:</w:t>
+      </w:r>
+    </w:p>
+    <w:p>
+      <w:pPr>
+        <w:pStyle w:val="Compact"/>
+        <w:numPr>
+          <w:ilvl w:val="0"/>
+          <w:numId w:val="1024"/>
+        </w:numPr>
+      </w:pPr>
+      <w:r>
+        <w:t xml:space="preserve">1 archetype (Dasher)</w:t>
+      </w:r>
+    </w:p>
+    <w:p>
+      <w:pPr>
+        <w:pStyle w:val="Compact"/>
+        <w:numPr>
+          <w:ilvl w:val="0"/>
+          <w:numId w:val="1024"/>
+        </w:numPr>
+      </w:pPr>
+      <w:r>
+        <w:t xml:space="preserve">18 cards, 8 relics, 4 enemies, 1 boss</w:t>
+      </w:r>
+    </w:p>
+    <w:p>
+      <w:pPr>
+        <w:pStyle w:val="Compact"/>
+        <w:numPr>
+          <w:ilvl w:val="0"/>
+          <w:numId w:val="1024"/>
+        </w:numPr>
+      </w:pPr>
+      <w:r>
+        <w:t xml:space="preserve">Gully act map (2–3 stages, retry on loss)</w:t>
+      </w:r>
+    </w:p>
+    <w:p>
+      <w:pPr>
+        <w:pStyle w:val="Compact"/>
+        <w:numPr>
+          <w:ilvl w:val="0"/>
+          <w:numId w:val="1024"/>
+        </w:numPr>
+      </w:pPr>
+      <w:r>
+        <w:t xml:space="preserve">Flame vignette for 4 shot types</w:t>
+      </w:r>
+    </w:p>
+    <w:p>
+      <w:pPr>
+        <w:pStyle w:val="Compact"/>
+        <w:numPr>
+          <w:ilvl w:val="0"/>
+          <w:numId w:val="1024"/>
+        </w:numPr>
+      </w:pPr>
+      <w:r>
+        <w:t xml:space="preserve">Local save</w:t>
+      </w:r>
+    </w:p>
+    <w:p>
+      <w:pPr>
+        <w:pStyle w:val="Compact"/>
+        <w:numPr>
+          <w:ilvl w:val="0"/>
+          <w:numId w:val="1024"/>
+        </w:numPr>
+      </w:pPr>
+      <w:r>
+        <w:t xml:space="preserve">Fake shop (no real money yet)</w:t>
+      </w:r>
+    </w:p>
+    <w:p>
+      <w:pPr>
+        <w:pStyle w:val="FirstParagraph"/>
+      </w:pPr>
+      <w:r>
+        <w:rPr>
+          <w:b/>
+          <w:bCs/>
+        </w:rPr>
+        <w:t xml:space="preserve">Kill criterion:</w:t>
+      </w:r>
+      <w:r>
+        <w:t xml:space="preserve"> </w:t>
+      </w:r>
+      <w:r>
+        <w:t xml:space="preserve">if you do not start a second run after a death without being asked, stop. Do not add ads to a boring slice.</w:t>
+      </w:r>
+    </w:p>
+    <w:bookmarkEnd w:id="51"/>
+    <w:bookmarkStart w:id="52" w:name="alpha-weeks-714"/>
+    <w:p>
+      <w:pPr>
+        <w:pStyle w:val="Heading3"/>
+      </w:pPr>
+      <w:r>
+        <w:t xml:space="preserve">10.2 Alpha (weeks 7–14)</w:t>
+      </w:r>
+    </w:p>
+    <w:p>
+      <w:pPr>
+        <w:pStyle w:val="Compact"/>
+        <w:numPr>
+          <w:ilvl w:val="0"/>
+          <w:numId w:val="1025"/>
+        </w:numPr>
+      </w:pPr>
+      <w:r>
+        <w:t xml:space="preserve">3 archetypes, 60 cards, 3 acts</w:t>
+      </w:r>
+    </w:p>
+    <w:p>
+      <w:pPr>
+        <w:pStyle w:val="Compact"/>
+        <w:numPr>
+          <w:ilvl w:val="0"/>
+          <w:numId w:val="1025"/>
+        </w:numPr>
+      </w:pPr>
+      <w:r>
+        <w:t xml:space="preserve">Daily net</w:t>
+      </w:r>
+    </w:p>
+    <w:p>
+      <w:pPr>
+        <w:pStyle w:val="Compact"/>
+        <w:numPr>
+          <w:ilvl w:val="0"/>
+          <w:numId w:val="1025"/>
+        </w:numPr>
+      </w:pPr>
+      <w:r>
+        <w:t xml:space="preserve">Analytics events (start_run, card_play, death, revive_ad)</w:t>
+      </w:r>
+    </w:p>
+    <w:p>
+      <w:pPr>
+        <w:pStyle w:val="Compact"/>
+        <w:numPr>
+          <w:ilvl w:val="0"/>
+          <w:numId w:val="1025"/>
+        </w:numPr>
+      </w:pPr>
+      <w:r>
+        <w:t xml:space="preserve">Closed testing track, 12 testers, 14 days</w:t>
+      </w:r>
+    </w:p>
+    <w:bookmarkEnd w:id="52"/>
+    <w:bookmarkStart w:id="53" w:name="beta-weeks-1522"/>
+    <w:p>
+      <w:pPr>
+        <w:pStyle w:val="Heading3"/>
+      </w:pPr>
+      <w:r>
+        <w:t xml:space="preserve">10.3 Beta (weeks 15–22)</w:t>
+      </w:r>
+    </w:p>
+    <w:p>
+      <w:pPr>
+        <w:pStyle w:val="Compact"/>
+        <w:numPr>
+          <w:ilvl w:val="0"/>
+          <w:numId w:val="1026"/>
+        </w:numPr>
+      </w:pPr>
+      <w:r>
+        <w:t xml:space="preserve">Act 4 stub</w:t>
+      </w:r>
+    </w:p>
+    <w:p>
+      <w:pPr>
+        <w:pStyle w:val="Compact"/>
+        <w:numPr>
+          <w:ilvl w:val="0"/>
+          <w:numId w:val="1026"/>
+        </w:numPr>
+      </w:pPr>
+      <w:r>
+        <w:t xml:space="preserve">Real AdMob (test devices) + 3 IAP SKUs (ad remove, starter, pass)</w:t>
+      </w:r>
+    </w:p>
+    <w:p>
+      <w:pPr>
+        <w:pStyle w:val="Compact"/>
+        <w:numPr>
+          <w:ilvl w:val="0"/>
+          <w:numId w:val="1026"/>
+        </w:numPr>
+      </w:pPr>
+      <w:r>
+        <w:t xml:space="preserve">Hindi flavour pass</w:t>
+      </w:r>
+    </w:p>
+    <w:p>
+      <w:pPr>
+        <w:pStyle w:val="Compact"/>
+        <w:numPr>
+          <w:ilvl w:val="0"/>
+          <w:numId w:val="1026"/>
+        </w:numPr>
+      </w:pPr>
+      <w:r>
+        <w:t xml:space="preserve">Store listing, shots, 30s trailer (one run, no licensed footage)</w:t>
+      </w:r>
+    </w:p>
+    <w:bookmarkEnd w:id="53"/>
+    <w:bookmarkStart w:id="54" w:name="production"/>
+    <w:p>
+      <w:pPr>
+        <w:pStyle w:val="Heading3"/>
+      </w:pPr>
+      <w:r>
+        <w:t xml:space="preserve">10.4 Production</w:t>
+      </w:r>
+    </w:p>
+    <w:p>
+      <w:pPr>
+        <w:pStyle w:val="Compact"/>
+        <w:numPr>
+          <w:ilvl w:val="0"/>
+          <w:numId w:val="1027"/>
+        </w:numPr>
+      </w:pPr>
+      <w:r>
+        <w:t xml:space="preserve">Staged rollout before a cricket window</w:t>
+      </w:r>
+    </w:p>
+    <w:p>
+      <w:pPr>
+        <w:pStyle w:val="Compact"/>
+        <w:numPr>
+          <w:ilvl w:val="0"/>
+          <w:numId w:val="1027"/>
+        </w:numPr>
+      </w:pPr>
+      <w:r>
+        <w:t xml:space="preserve">Season 0 pass (free track fat, paid track cosmetic)</w:t>
+      </w:r>
+    </w:p>
     <w:bookmarkEnd w:id="54"/>
-    <w:bookmarkEnd w:id="55"/>
-    <w:bookmarkStart w:id="56" w:name="legal-policy-and-dont-get-banned"/>
-    <w:p>
-      <w:pPr>
-        <w:pStyle w:val="Heading2"/>
-      </w:pPr>
-      <w:r>
-        <w:t xml:space="preserve">11. Legal, policy, and “don’t get banned”</w:t>
-      </w:r>
-    </w:p>
-    <w:p>
-      <w:pPr>
-        <w:pStyle w:val="Compact"/>
-        <w:numPr>
-          <w:ilvl w:val="0"/>
-          <w:numId w:val="1026"/>
-        </w:numPr>
-      </w:pPr>
-      <w:r>
-        <w:rPr>
-          <w:b/>
-          <w:bCs/>
-        </w:rPr>
-        <w:t xml:space="preserve">No BCCI, ICC, IPL, franchise names, crests, anthems, player faces.</w:t>
-      </w:r>
-      <w:r>
-        <w:t xml:space="preserve"> </w:t>
-      </w:r>
-      <w:r>
-        <w:t xml:space="preserve">Street kits. Made-up club names (“Cotton Green Colts,” “Marine Drive XI”).</w:t>
-      </w:r>
-    </w:p>
-    <w:p>
-      <w:pPr>
-        <w:pStyle w:val="Compact"/>
-        <w:numPr>
-          <w:ilvl w:val="0"/>
-          <w:numId w:val="1026"/>
-        </w:numPr>
-      </w:pPr>
-      <w:r>
-        <w:rPr>
-          <w:b/>
-          <w:bCs/>
-        </w:rPr>
-        <w:t xml:space="preserve">Not gambling.</w:t>
-      </w:r>
-      <w:r>
-        <w:t xml:space="preserve"> </w:t>
-      </w:r>
-      <w:r>
-        <w:t xml:space="preserve">Cards are shots, not bets. No real-money prizes. India’s</w:t>
-      </w:r>
-      <w:r>
-        <w:t xml:space="preserve"> </w:t>
-      </w:r>
-      <w:r>
-        <w:rPr>
-          <w:b/>
-          <w:bCs/>
-        </w:rPr>
-        <w:t xml:space="preserve">Promotion and Regulation of Online Gaming Act 2025</w:t>
-      </w:r>
-      <w:r>
-        <w:t xml:space="preserve"> </w:t>
-      </w:r>
-      <w:r>
-        <w:t xml:space="preserve">wiped RMG / fantasy ad money off IPL; looking like Dream11 is how you die twice (law + ads). Copy must say</w:t>
-      </w:r>
-      <w:r>
-        <w:t xml:space="preserve"> </w:t>
-      </w:r>
-      <w:r>
-        <w:rPr>
-          <w:i/>
-          <w:iCs/>
-        </w:rPr>
-        <w:t xml:space="preserve">single-player career game</w:t>
-      </w:r>
-      <w:r>
-        <w:t xml:space="preserve">.</w:t>
-      </w:r>
-    </w:p>
-    <w:p>
-      <w:pPr>
-        <w:pStyle w:val="Compact"/>
-        <w:numPr>
-          <w:ilvl w:val="0"/>
-          <w:numId w:val="1026"/>
-        </w:numPr>
-      </w:pPr>
-      <w:r>
-        <w:rPr>
-          <w:b/>
-          <w:bCs/>
-        </w:rPr>
-        <w:t xml:space="preserve">Ads:</w:t>
-      </w:r>
-      <w:r>
-        <w:t xml:space="preserve"> </w:t>
-      </w:r>
-      <w:r>
-        <w:t xml:space="preserve">UMP / families if you ever drop below 13 — don’t. Rewarded must be optional. GDPR/DPDP: consent SDK.</w:t>
-      </w:r>
-    </w:p>
-    <w:p>
-      <w:pPr>
-        <w:pStyle w:val="Compact"/>
-        <w:numPr>
-          <w:ilvl w:val="0"/>
-          <w:numId w:val="1026"/>
-        </w:numPr>
-      </w:pPr>
-      <w:r>
-        <w:rPr>
-          <w:b/>
-          <w:bCs/>
-        </w:rPr>
-        <w:t xml:space="preserve">IAP:</w:t>
-      </w:r>
-      <w:r>
-        <w:t xml:space="preserve"> </w:t>
-      </w:r>
-      <w:r>
-        <w:t xml:space="preserve">restore purchases, clear prices, no dark patterns (Google Play Payments policy).</w:t>
-      </w:r>
-    </w:p>
-    <w:p>
-      <w:pPr>
-        <w:pStyle w:val="Compact"/>
-        <w:numPr>
-          <w:ilvl w:val="0"/>
-          <w:numId w:val="1026"/>
-        </w:numPr>
-      </w:pPr>
-      <w:r>
-        <w:rPr>
-          <w:b/>
-          <w:bCs/>
-        </w:rPr>
-        <w:t xml:space="preserve">Crashes in closed test</w:t>
-      </w:r>
-      <w:r>
-        <w:t xml:space="preserve"> </w:t>
-      </w:r>
-      <w:r>
-        <w:t xml:space="preserve">are a gift. Production one-stars are not.</w:t>
+    <w:bookmarkStart w:id="55" w:name="team-v1"/>
+    <w:p>
+      <w:pPr>
+        <w:pStyle w:val="Heading3"/>
+      </w:pPr>
+      <w:r>
+        <w:t xml:space="preserve">10.5 Team (v1)</w:t>
+      </w:r>
+    </w:p>
+    <w:p>
+      <w:pPr>
+        <w:pStyle w:val="FirstParagraph"/>
+      </w:pPr>
+      <w:r>
+        <w:t xml:space="preserve">Solo + specialists:</w:t>
+      </w:r>
+    </w:p>
+    <w:p>
+      <w:pPr>
+        <w:pStyle w:val="Compact"/>
+        <w:numPr>
+          <w:ilvl w:val="0"/>
+          <w:numId w:val="1028"/>
+        </w:numPr>
+      </w:pPr>
+      <w:r>
+        <w:t xml:space="preserve">You: design, Dart, combat</w:t>
+      </w:r>
+    </w:p>
+    <w:p>
+      <w:pPr>
+        <w:pStyle w:val="Compact"/>
+        <w:numPr>
+          <w:ilvl w:val="0"/>
+          <w:numId w:val="1028"/>
+        </w:numPr>
+      </w:pPr>
+      <w:r>
+        <w:t xml:space="preserve">1 illustrator (cards + portraits), contract</w:t>
+      </w:r>
+    </w:p>
+    <w:p>
+      <w:pPr>
+        <w:pStyle w:val="Compact"/>
+        <w:numPr>
+          <w:ilvl w:val="0"/>
+          <w:numId w:val="1028"/>
+        </w:numPr>
+      </w:pPr>
+      <w:r>
+        <w:t xml:space="preserve">1 audio (optional Fiverr-grade, then replace)</w:t>
+      </w:r>
+    </w:p>
+    <w:p>
+      <w:pPr>
+        <w:pStyle w:val="Compact"/>
+        <w:numPr>
+          <w:ilvl w:val="0"/>
+          <w:numId w:val="1028"/>
+        </w:numPr>
+      </w:pPr>
+      <w:r>
+        <w:t xml:space="preserve">No UA agency until §9.5 gates</w:t>
       </w:r>
     </w:p>
     <w:p>
@@ -7853,8 +9496,165 @@
         </w:pict>
       </w:r>
     </w:p>
+    <w:bookmarkEnd w:id="55"/>
     <w:bookmarkEnd w:id="56"/>
-    <w:bookmarkStart w:id="57" w:name="risks"/>
+    <w:bookmarkStart w:id="57" w:name="legal-policy-and-dont-get-banned"/>
+    <w:p>
+      <w:pPr>
+        <w:pStyle w:val="Heading2"/>
+      </w:pPr>
+      <w:r>
+        <w:t xml:space="preserve">11. Legal, policy, and “don’t get banned”</w:t>
+      </w:r>
+    </w:p>
+    <w:p>
+      <w:pPr>
+        <w:pStyle w:val="Compact"/>
+        <w:numPr>
+          <w:ilvl w:val="0"/>
+          <w:numId w:val="1029"/>
+        </w:numPr>
+      </w:pPr>
+      <w:r>
+        <w:rPr>
+          <w:b/>
+          <w:bCs/>
+        </w:rPr>
+        <w:t xml:space="preserve">No BCCI, ICC, IPL, franchise names, crests, anthems, player faces.</w:t>
+      </w:r>
+      <w:r>
+        <w:t xml:space="preserve"> </w:t>
+      </w:r>
+      <w:r>
+        <w:t xml:space="preserve">Street kits. Made-up club names (“Cotton Green Colts,” “Marine Drive XI”).</w:t>
+      </w:r>
+    </w:p>
+    <w:p>
+      <w:pPr>
+        <w:pStyle w:val="Compact"/>
+        <w:numPr>
+          <w:ilvl w:val="0"/>
+          <w:numId w:val="1029"/>
+        </w:numPr>
+      </w:pPr>
+      <w:r>
+        <w:rPr>
+          <w:b/>
+          <w:bCs/>
+        </w:rPr>
+        <w:t xml:space="preserve">Not gambling.</w:t>
+      </w:r>
+      <w:r>
+        <w:t xml:space="preserve"> </w:t>
+      </w:r>
+      <w:r>
+        <w:t xml:space="preserve">Cards are shots, not bets. No real-money prizes. India’s</w:t>
+      </w:r>
+      <w:r>
+        <w:t xml:space="preserve"> </w:t>
+      </w:r>
+      <w:r>
+        <w:rPr>
+          <w:b/>
+          <w:bCs/>
+        </w:rPr>
+        <w:t xml:space="preserve">Promotion and Regulation of Online Gaming Act 2025</w:t>
+      </w:r>
+      <w:r>
+        <w:t xml:space="preserve"> </w:t>
+      </w:r>
+      <w:r>
+        <w:t xml:space="preserve">wiped RMG / fantasy ad money off IPL; looking like Dream11 is how you die twice (law + ads). Copy must say</w:t>
+      </w:r>
+      <w:r>
+        <w:t xml:space="preserve"> </w:t>
+      </w:r>
+      <w:r>
+        <w:rPr>
+          <w:i/>
+          <w:iCs/>
+        </w:rPr>
+        <w:t xml:space="preserve">single-player career game</w:t>
+      </w:r>
+      <w:r>
+        <w:t xml:space="preserve">.</w:t>
+      </w:r>
+    </w:p>
+    <w:p>
+      <w:pPr>
+        <w:pStyle w:val="Compact"/>
+        <w:numPr>
+          <w:ilvl w:val="0"/>
+          <w:numId w:val="1029"/>
+        </w:numPr>
+      </w:pPr>
+      <w:r>
+        <w:rPr>
+          <w:b/>
+          <w:bCs/>
+        </w:rPr>
+        <w:t xml:space="preserve">Ads:</w:t>
+      </w:r>
+      <w:r>
+        <w:t xml:space="preserve"> </w:t>
+      </w:r>
+      <w:r>
+        <w:t xml:space="preserve">UMP / families if you ever drop below 13 — don’t. Rewarded must be optional. GDPR/DPDP: consent SDK.</w:t>
+      </w:r>
+    </w:p>
+    <w:p>
+      <w:pPr>
+        <w:pStyle w:val="Compact"/>
+        <w:numPr>
+          <w:ilvl w:val="0"/>
+          <w:numId w:val="1029"/>
+        </w:numPr>
+      </w:pPr>
+      <w:r>
+        <w:rPr>
+          <w:b/>
+          <w:bCs/>
+        </w:rPr>
+        <w:t xml:space="preserve">IAP:</w:t>
+      </w:r>
+      <w:r>
+        <w:t xml:space="preserve"> </w:t>
+      </w:r>
+      <w:r>
+        <w:t xml:space="preserve">restore purchases, clear prices, no dark patterns (Google Play Payments policy).</w:t>
+      </w:r>
+    </w:p>
+    <w:p>
+      <w:pPr>
+        <w:pStyle w:val="Compact"/>
+        <w:numPr>
+          <w:ilvl w:val="0"/>
+          <w:numId w:val="1029"/>
+        </w:numPr>
+      </w:pPr>
+      <w:r>
+        <w:rPr>
+          <w:b/>
+          <w:bCs/>
+        </w:rPr>
+        <w:t xml:space="preserve">Crashes in closed test</w:t>
+      </w:r>
+      <w:r>
+        <w:t xml:space="preserve"> </w:t>
+      </w:r>
+      <w:r>
+        <w:t xml:space="preserve">are a gift. Production one-stars are not.</w:t>
+      </w:r>
+    </w:p>
+    <w:p>
+      <w:r>
+        <w:pict>
+          <v:rect style="width:0;height:1.5pt" o:hralign="center" o:hrstd="t" o:hr="t"/>
+        </w:pict>
+      </w:r>
+    </w:p>
+    <w:bookmarkEnd w:id="57"/>
+    <w:bookmarkStart w:id="58" w:name="risks"/>
     <w:p>
       <w:pPr>
         <w:pStyle w:val="Heading2"/>
@@ -8227,8 +10027,8 @@
         </w:pict>
       </w:r>
     </w:p>
-    <w:bookmarkEnd w:id="57"/>
-    <w:bookmarkStart w:id="58" w:name="recommendation"/>
+    <w:bookmarkEnd w:id="58"/>
+    <w:bookmarkStart w:id="59" w:name="recommendation"/>
     <w:p>
       <w:pPr>
         <w:pStyle w:val="Heading2"/>
@@ -8319,8 +10119,8 @@
         </w:pict>
       </w:r>
     </w:p>
-    <w:bookmarkEnd w:id="58"/>
-    <w:bookmarkStart w:id="59" w:name="key-decisions"/>
+    <w:bookmarkEnd w:id="59"/>
+    <w:bookmarkStart w:id="60" w:name="key-decisions"/>
     <w:p>
       <w:pPr>
         <w:pStyle w:val="Heading2"/>
@@ -8334,7 +10134,7 @@
         <w:pStyle w:val="Compact"/>
         <w:numPr>
           <w:ilvl w:val="0"/>
-          <w:numId w:val="1027"/>
+          <w:numId w:val="1030"/>
         </w:numPr>
       </w:pPr>
       <w:r>
@@ -8356,7 +10156,7 @@
         <w:pStyle w:val="Compact"/>
         <w:numPr>
           <w:ilvl w:val="0"/>
-          <w:numId w:val="1027"/>
+          <w:numId w:val="1030"/>
         </w:numPr>
       </w:pPr>
       <w:r>
@@ -8401,7 +10201,7 @@
         <w:pStyle w:val="Compact"/>
         <w:numPr>
           <w:ilvl w:val="0"/>
-          <w:numId w:val="1027"/>
+          <w:numId w:val="1030"/>
         </w:numPr>
       </w:pPr>
       <w:r>
@@ -8420,7 +10220,7 @@
         <w:pStyle w:val="Compact"/>
         <w:numPr>
           <w:ilvl w:val="0"/>
-          <w:numId w:val="1027"/>
+          <w:numId w:val="1030"/>
         </w:numPr>
       </w:pPr>
       <w:r>
@@ -8439,7 +10239,7 @@
         <w:pStyle w:val="Compact"/>
         <w:numPr>
           <w:ilvl w:val="0"/>
-          <w:numId w:val="1027"/>
+          <w:numId w:val="1030"/>
         </w:numPr>
       </w:pPr>
       <w:r>
@@ -8458,7 +10258,7 @@
         <w:pStyle w:val="Compact"/>
         <w:numPr>
           <w:ilvl w:val="0"/>
-          <w:numId w:val="1027"/>
+          <w:numId w:val="1030"/>
         </w:numPr>
       </w:pPr>
       <w:r>
@@ -8477,7 +10277,7 @@
         <w:pStyle w:val="Compact"/>
         <w:numPr>
           <w:ilvl w:val="0"/>
-          <w:numId w:val="1027"/>
+          <w:numId w:val="1030"/>
         </w:numPr>
       </w:pPr>
       <w:r>
@@ -8498,8 +10298,8 @@
         </w:pict>
       </w:r>
     </w:p>
-    <w:bookmarkEnd w:id="59"/>
-    <w:bookmarkStart w:id="60" w:name="decisions-already-made-2026-09-02"/>
+    <w:bookmarkEnd w:id="60"/>
+    <w:bookmarkStart w:id="61" w:name="decisions-already-made-2026-09-02"/>
     <w:p>
       <w:pPr>
         <w:pStyle w:val="Heading2"/>
@@ -8513,7 +10313,7 @@
         <w:pStyle w:val="Compact"/>
         <w:numPr>
           <w:ilvl w:val="0"/>
-          <w:numId w:val="1028"/>
+          <w:numId w:val="1031"/>
         </w:numPr>
       </w:pPr>
       <w:r>
@@ -8558,7 +10358,7 @@
         <w:pStyle w:val="Compact"/>
         <w:numPr>
           <w:ilvl w:val="0"/>
-          <w:numId w:val="1028"/>
+          <w:numId w:val="1031"/>
         </w:numPr>
       </w:pPr>
       <w:r>
@@ -8606,7 +10406,7 @@
         <w:pStyle w:val="Compact"/>
         <w:numPr>
           <w:ilvl w:val="0"/>
-          <w:numId w:val="1028"/>
+          <w:numId w:val="1031"/>
         </w:numPr>
       </w:pPr>
       <w:r>
@@ -8651,7 +10451,7 @@
         <w:pStyle w:val="Compact"/>
         <w:numPr>
           <w:ilvl w:val="0"/>
-          <w:numId w:val="1028"/>
+          <w:numId w:val="1031"/>
         </w:numPr>
       </w:pPr>
       <w:r>
@@ -8683,7 +10483,7 @@
         <w:pStyle w:val="Compact"/>
         <w:numPr>
           <w:ilvl w:val="0"/>
-          <w:numId w:val="1028"/>
+          <w:numId w:val="1031"/>
         </w:numPr>
       </w:pPr>
       <w:r>
@@ -8734,7 +10534,7 @@
         <w:pStyle w:val="Compact"/>
         <w:numPr>
           <w:ilvl w:val="0"/>
-          <w:numId w:val="1028"/>
+          <w:numId w:val="1031"/>
         </w:numPr>
       </w:pPr>
       <w:r>
@@ -8766,7 +10566,7 @@
         <w:pStyle w:val="Compact"/>
         <w:numPr>
           <w:ilvl w:val="0"/>
-          <w:numId w:val="1028"/>
+          <w:numId w:val="1031"/>
         </w:numPr>
       </w:pPr>
       <w:r>
@@ -8817,7 +10617,7 @@
         <w:pStyle w:val="Compact"/>
         <w:numPr>
           <w:ilvl w:val="0"/>
-          <w:numId w:val="1028"/>
+          <w:numId w:val="1031"/>
         </w:numPr>
       </w:pPr>
       <w:r>
@@ -8865,7 +10665,7 @@
         <w:pStyle w:val="Compact"/>
         <w:numPr>
           <w:ilvl w:val="0"/>
-          <w:numId w:val="1028"/>
+          <w:numId w:val="1031"/>
         </w:numPr>
       </w:pPr>
       <w:r>
@@ -8894,7 +10694,7 @@
         <w:pStyle w:val="Compact"/>
         <w:numPr>
           <w:ilvl w:val="0"/>
-          <w:numId w:val="1028"/>
+          <w:numId w:val="1031"/>
         </w:numPr>
       </w:pPr>
       <w:r>
@@ -8926,7 +10726,7 @@
         <w:pStyle w:val="Compact"/>
         <w:numPr>
           <w:ilvl w:val="0"/>
-          <w:numId w:val="1028"/>
+          <w:numId w:val="1031"/>
         </w:numPr>
       </w:pPr>
       <w:r>
@@ -8964,7 +10764,7 @@
         <w:pStyle w:val="Compact"/>
         <w:numPr>
           <w:ilvl w:val="0"/>
-          <w:numId w:val="1028"/>
+          <w:numId w:val="1031"/>
         </w:numPr>
       </w:pPr>
       <w:r>
@@ -8996,7 +10796,7 @@
         <w:pStyle w:val="Compact"/>
         <w:numPr>
           <w:ilvl w:val="0"/>
-          <w:numId w:val="1028"/>
+          <w:numId w:val="1031"/>
         </w:numPr>
       </w:pPr>
       <w:r>
@@ -9028,7 +10828,7 @@
         <w:pStyle w:val="Compact"/>
         <w:numPr>
           <w:ilvl w:val="0"/>
-          <w:numId w:val="1028"/>
+          <w:numId w:val="1031"/>
         </w:numPr>
       </w:pPr>
       <w:r>
@@ -9057,7 +10857,7 @@
         <w:pStyle w:val="Compact"/>
         <w:numPr>
           <w:ilvl w:val="0"/>
-          <w:numId w:val="1028"/>
+          <w:numId w:val="1031"/>
         </w:numPr>
       </w:pPr>
       <w:r>
@@ -9118,7 +10918,7 @@
         <w:pStyle w:val="Compact"/>
         <w:numPr>
           <w:ilvl w:val="0"/>
-          <w:numId w:val="1028"/>
+          <w:numId w:val="1031"/>
         </w:numPr>
       </w:pPr>
       <w:r>
@@ -9166,7 +10966,7 @@
         <w:pStyle w:val="Compact"/>
         <w:numPr>
           <w:ilvl w:val="0"/>
-          <w:numId w:val="1028"/>
+          <w:numId w:val="1031"/>
         </w:numPr>
       </w:pPr>
       <w:r>
@@ -9215,8 +11015,8 @@
         <w:t xml:space="preserve">required. Story remains a complete path. This is the gacha-adjacent line — keep it documented and tight.</w:t>
       </w:r>
     </w:p>
-    <w:bookmarkEnd w:id="60"/>
-    <w:bookmarkStart w:id="61" w:name="open-questions-need-you"/>
+    <w:bookmarkEnd w:id="61"/>
+    <w:bookmarkStart w:id="62" w:name="open-questions-need-you"/>
     <w:p>
       <w:pPr>
         <w:pStyle w:val="Heading2"/>
@@ -9230,7 +11030,7 @@
         <w:pStyle w:val="Compact"/>
         <w:numPr>
           <w:ilvl w:val="0"/>
-          <w:numId w:val="1029"/>
+          <w:numId w:val="1032"/>
         </w:numPr>
       </w:pPr>
       <w:r>
@@ -9252,7 +11052,7 @@
         <w:pStyle w:val="Compact"/>
         <w:numPr>
           <w:ilvl w:val="0"/>
-          <w:numId w:val="1029"/>
+          <w:numId w:val="1032"/>
         </w:numPr>
       </w:pPr>
       <w:r>
@@ -9268,7 +11068,7 @@
         <w:pStyle w:val="Compact"/>
         <w:numPr>
           <w:ilvl w:val="0"/>
-          <w:numId w:val="1029"/>
+          <w:numId w:val="1032"/>
         </w:numPr>
       </w:pPr>
       <w:r>
@@ -9290,7 +11090,7 @@
         <w:pStyle w:val="Compact"/>
         <w:numPr>
           <w:ilvl w:val="0"/>
-          <w:numId w:val="1029"/>
+          <w:numId w:val="1032"/>
         </w:numPr>
       </w:pPr>
       <w:r>
@@ -9312,7 +11112,7 @@
         <w:pStyle w:val="Compact"/>
         <w:numPr>
           <w:ilvl w:val="0"/>
-          <w:numId w:val="1029"/>
+          <w:numId w:val="1032"/>
         </w:numPr>
       </w:pPr>
       <w:r>
@@ -9334,7 +11134,7 @@
         <w:pStyle w:val="Compact"/>
         <w:numPr>
           <w:ilvl w:val="0"/>
-          <w:numId w:val="1029"/>
+          <w:numId w:val="1032"/>
         </w:numPr>
       </w:pPr>
       <w:r>
@@ -9350,7 +11150,7 @@
         <w:pStyle w:val="Compact"/>
         <w:numPr>
           <w:ilvl w:val="0"/>
-          <w:numId w:val="1029"/>
+          <w:numId w:val="1032"/>
         </w:numPr>
       </w:pPr>
       <w:r>
@@ -9374,8 +11174,8 @@
         </w:pict>
       </w:r>
     </w:p>
-    <w:bookmarkEnd w:id="61"/>
-    <w:bookmarkStart w:id="62" w:name="sources-planning-not-audited-financials"/>
+    <w:bookmarkEnd w:id="62"/>
+    <w:bookmarkStart w:id="63" w:name="sources-planning-not-audited-financials"/>
     <w:p>
       <w:pPr>
         <w:pStyle w:val="Heading2"/>
@@ -9389,7 +11189,7 @@
         <w:pStyle w:val="Compact"/>
         <w:numPr>
           <w:ilvl w:val="0"/>
-          <w:numId w:val="1030"/>
+          <w:numId w:val="1033"/>
         </w:numPr>
       </w:pPr>
       <w:r>
@@ -9401,7 +11201,7 @@
         <w:pStyle w:val="Compact"/>
         <w:numPr>
           <w:ilvl w:val="0"/>
-          <w:numId w:val="1030"/>
+          <w:numId w:val="1033"/>
         </w:numPr>
       </w:pPr>
       <w:r>
@@ -9413,7 +11213,7 @@
         <w:pStyle w:val="Compact"/>
         <w:numPr>
           <w:ilvl w:val="0"/>
-          <w:numId w:val="1030"/>
+          <w:numId w:val="1033"/>
         </w:numPr>
       </w:pPr>
       <w:r>
@@ -9425,7 +11225,7 @@
         <w:pStyle w:val="Compact"/>
         <w:numPr>
           <w:ilvl w:val="0"/>
-          <w:numId w:val="1030"/>
+          <w:numId w:val="1033"/>
         </w:numPr>
       </w:pPr>
       <w:r>
@@ -9437,7 +11237,7 @@
         <w:pStyle w:val="Compact"/>
         <w:numPr>
           <w:ilvl w:val="0"/>
-          <w:numId w:val="1030"/>
+          <w:numId w:val="1033"/>
         </w:numPr>
       </w:pPr>
       <w:r>
@@ -9449,7 +11249,7 @@
         <w:pStyle w:val="Compact"/>
         <w:numPr>
           <w:ilvl w:val="0"/>
-          <w:numId w:val="1030"/>
+          <w:numId w:val="1033"/>
         </w:numPr>
       </w:pPr>
       <w:r>
@@ -9461,7 +11261,7 @@
         <w:pStyle w:val="Compact"/>
         <w:numPr>
           <w:ilvl w:val="0"/>
-          <w:numId w:val="1030"/>
+          <w:numId w:val="1033"/>
         </w:numPr>
       </w:pPr>
       <w:r>
@@ -9473,7 +11273,7 @@
         <w:pStyle w:val="Compact"/>
         <w:numPr>
           <w:ilvl w:val="0"/>
-          <w:numId w:val="1030"/>
+          <w:numId w:val="1033"/>
         </w:numPr>
       </w:pPr>
       <w:r>
@@ -9485,7 +11285,7 @@
         <w:pStyle w:val="Compact"/>
         <w:numPr>
           <w:ilvl w:val="0"/>
-          <w:numId w:val="1030"/>
+          <w:numId w:val="1033"/>
         </w:numPr>
       </w:pPr>
       <w:r>
@@ -9497,7 +11297,7 @@
         <w:pStyle w:val="Compact"/>
         <w:numPr>
           <w:ilvl w:val="0"/>
-          <w:numId w:val="1030"/>
+          <w:numId w:val="1033"/>
         </w:numPr>
       </w:pPr>
       <w:r>
@@ -9509,7 +11309,7 @@
         <w:pStyle w:val="Compact"/>
         <w:numPr>
           <w:ilvl w:val="0"/>
-          <w:numId w:val="1030"/>
+          <w:numId w:val="1033"/>
         </w:numPr>
       </w:pPr>
       <w:r>
@@ -9521,7 +11321,7 @@
         <w:pStyle w:val="Compact"/>
         <w:numPr>
           <w:ilvl w:val="0"/>
-          <w:numId w:val="1030"/>
+          <w:numId w:val="1033"/>
         </w:numPr>
       </w:pPr>
       <w:r>
@@ -9533,7 +11333,7 @@
         <w:pStyle w:val="Compact"/>
         <w:numPr>
           <w:ilvl w:val="0"/>
-          <w:numId w:val="1030"/>
+          <w:numId w:val="1033"/>
         </w:numPr>
       </w:pPr>
       <w:r>
@@ -9545,7 +11345,7 @@
         <w:pStyle w:val="Compact"/>
         <w:numPr>
           <w:ilvl w:val="0"/>
-          <w:numId w:val="1030"/>
+          <w:numId w:val="1033"/>
         </w:numPr>
       </w:pPr>
       <w:r>
@@ -9557,7 +11357,7 @@
         <w:pStyle w:val="Compact"/>
         <w:numPr>
           <w:ilvl w:val="0"/>
-          <w:numId w:val="1030"/>
+          <w:numId w:val="1033"/>
         </w:numPr>
       </w:pPr>
       <w:r>
@@ -9569,7 +11369,7 @@
         <w:pStyle w:val="Compact"/>
         <w:numPr>
           <w:ilvl w:val="0"/>
-          <w:numId w:val="1030"/>
+          <w:numId w:val="1033"/>
         </w:numPr>
       </w:pPr>
       <w:r>
@@ -9616,8 +11416,8 @@
         <w:t xml:space="preserve">Prepared for internal use. The replay plan is retired. This is the game.</w:t>
       </w:r>
     </w:p>
-    <w:bookmarkEnd w:id="62"/>
     <w:bookmarkEnd w:id="63"/>
+    <w:bookmarkEnd w:id="64"/>
     <w:sectPr>
       <w:footnotePr>
         <w:numRestart w:val="eachSect"/>
@@ -10013,18 +11813,6 @@
     <w:abstractNumId w:val="991"/>
   </w:num>
   <w:num w:numId="1023">
-    <w:abstractNumId w:val="991"/>
-  </w:num>
-  <w:num w:numId="1024">
-    <w:abstractNumId w:val="991"/>
-  </w:num>
-  <w:num w:numId="1025">
-    <w:abstractNumId w:val="991"/>
-  </w:num>
-  <w:num w:numId="1026">
-    <w:abstractNumId w:val="991"/>
-  </w:num>
-  <w:num w:numId="1027">
     <w:abstractNumId w:val="99411"/>
     <w:lvlOverride w:ilvl="0">
       <w:startOverride w:val="1"/>
@@ -10054,7 +11842,25 @@
       <w:startOverride w:val="1"/>
     </w:lvlOverride>
   </w:num>
+  <w:num w:numId="1024">
+    <w:abstractNumId w:val="991"/>
+  </w:num>
+  <w:num w:numId="1025">
+    <w:abstractNumId w:val="991"/>
+  </w:num>
+  <w:num w:numId="1026">
+    <w:abstractNumId w:val="991"/>
+  </w:num>
+  <w:num w:numId="1027">
+    <w:abstractNumId w:val="991"/>
+  </w:num>
   <w:num w:numId="1028">
+    <w:abstractNumId w:val="991"/>
+  </w:num>
+  <w:num w:numId="1029">
+    <w:abstractNumId w:val="991"/>
+  </w:num>
+  <w:num w:numId="1030">
     <w:abstractNumId w:val="99411"/>
     <w:lvlOverride w:ilvl="0">
       <w:startOverride w:val="1"/>
@@ -10084,7 +11890,7 @@
       <w:startOverride w:val="1"/>
     </w:lvlOverride>
   </w:num>
-  <w:num w:numId="1029">
+  <w:num w:numId="1031">
     <w:abstractNumId w:val="99411"/>
     <w:lvlOverride w:ilvl="0">
       <w:startOverride w:val="1"/>
@@ -10114,7 +11920,37 @@
       <w:startOverride w:val="1"/>
     </w:lvlOverride>
   </w:num>
-  <w:num w:numId="1030">
+  <w:num w:numId="1032">
+    <w:abstractNumId w:val="99411"/>
+    <w:lvlOverride w:ilvl="0">
+      <w:startOverride w:val="1"/>
+    </w:lvlOverride>
+    <w:lvlOverride w:ilvl="1">
+      <w:startOverride w:val="1"/>
+    </w:lvlOverride>
+    <w:lvlOverride w:ilvl="2">
+      <w:startOverride w:val="1"/>
+    </w:lvlOverride>
+    <w:lvlOverride w:ilvl="3">
+      <w:startOverride w:val="1"/>
+    </w:lvlOverride>
+    <w:lvlOverride w:ilvl="4">
+      <w:startOverride w:val="1"/>
+    </w:lvlOverride>
+    <w:lvlOverride w:ilvl="5">
+      <w:startOverride w:val="1"/>
+    </w:lvlOverride>
+    <w:lvlOverride w:ilvl="6">
+      <w:startOverride w:val="1"/>
+    </w:lvlOverride>
+    <w:lvlOverride w:ilvl="7">
+      <w:startOverride w:val="1"/>
+    </w:lvlOverride>
+    <w:lvlOverride w:ilvl="8">
+      <w:startOverride w:val="1"/>
+    </w:lvlOverride>
+  </w:num>
+  <w:num w:numId="1033">
     <w:abstractNumId w:val="991"/>
   </w:num>
 </w:numbering>

</xml_diff>